<commit_message>
Fechas,Filtros de Users en traces, Pdf
</commit_message>
<xml_diff>
--- a/DOC/Informe de Tesis Dariel Cabrera Lopez con formato J (1).docx
+++ b/DOC/Informe de Tesis Dariel Cabrera Lopez con formato J (1).docx
@@ -11375,6 +11375,7 @@
     <w:p>
       <w:pPr>
         <w:pStyle w:val="ds-markdown-paragraph"/>
+        <w:jc w:val="both"/>
         <w:rPr>
           <w:rFonts w:ascii="Arial" w:hAnsi="Arial" w:cs="Arial"/>
           <w:sz w:val="22"/>
@@ -11416,19 +11417,49 @@
           <w:sz w:val="22"/>
           <w:szCs w:val="22"/>
         </w:rPr>
-        <w:t>plicación web especializada</w:t>
-      </w:r>
-      <w:r>
-        <w:rPr>
+        <w:t>plicación web</w:t>
+      </w:r>
+      <w:r>
+        <w:rPr>
+          <w:rStyle w:val="Textoennegrita"/>
           <w:rFonts w:ascii="Arial" w:hAnsi="Arial" w:cs="Arial"/>
-          <w:sz w:val="22"/>
-          <w:szCs w:val="22"/>
-        </w:rPr>
-        <w:t xml:space="preserve"> para </w:t>
-      </w:r>
-      <w:r>
-        <w:rPr>
+          <w:b w:val="0"/>
+          <w:bCs w:val="0"/>
+          <w:sz w:val="22"/>
+          <w:szCs w:val="22"/>
+        </w:rPr>
+        <w:t>,</w:t>
+      </w:r>
+      <w:r>
+        <w:rPr>
+          <w:rStyle w:val="Textoennegrita"/>
           <w:rFonts w:ascii="Arial" w:hAnsi="Arial" w:cs="Arial"/>
+          <w:b w:val="0"/>
+          <w:bCs w:val="0"/>
+          <w:sz w:val="22"/>
+          <w:szCs w:val="22"/>
+        </w:rPr>
+        <w:t xml:space="preserve"> </w:t>
+      </w:r>
+      <w:r>
+        <w:rPr>
+          <w:rFonts w:ascii="Arial" w:hAnsi="Arial" w:cs="Arial"/>
+          <w:sz w:val="22"/>
+          <w:szCs w:val="22"/>
+        </w:rPr>
+        <w:t>accesible desde cualquier ubicación con conexión a internet, que permita</w:t>
+      </w:r>
+      <w:r>
+        <w:rPr>
+          <w:rFonts w:ascii="Arial" w:hAnsi="Arial" w:cs="Arial"/>
+          <w:sz w:val="22"/>
+          <w:szCs w:val="22"/>
+        </w:rPr>
+        <w:t xml:space="preserve"> </w:t>
+      </w:r>
+      <w:r>
+        <w:rPr>
+          <w:rFonts w:ascii="Arial" w:hAnsi="Arial" w:cs="Arial"/>
           <w:sz w:val="22"/>
           <w:szCs w:val="22"/>
         </w:rPr>
@@ -11440,7 +11471,7 @@
           <w:sz w:val="22"/>
           <w:szCs w:val="22"/>
         </w:rPr>
-        <w:t xml:space="preserve"> el cálculo teórico del transporte longitudinal de sedimentos en zonas costeras</w:t>
+        <w:t xml:space="preserve"> el cálculo teórico del transporte longitudinal de sedimentos en zonas costeras sur- orientales atendidas por la empresa </w:t>
       </w:r>
       <w:r>
         <w:rPr>
@@ -11448,21 +11479,16 @@
           <w:sz w:val="22"/>
           <w:szCs w:val="22"/>
         </w:rPr>
-        <w:t xml:space="preserve"> sur- orientales atendidas por la empresa en cuestión</w:t>
-      </w:r>
-      <w:r>
-        <w:rPr>
-          <w:rFonts w:ascii="Arial" w:hAnsi="Arial" w:cs="Arial"/>
-          <w:sz w:val="22"/>
-          <w:szCs w:val="22"/>
-        </w:rPr>
-        <w:t xml:space="preserve">, eliminando </w:t>
+        <w:lastRenderedPageBreak/>
+        <w:t xml:space="preserve">en cuestión, eliminando </w:t>
       </w:r>
       <w:commentRangeEnd w:id="87"/>
       <w:r>
         <w:rPr>
           <w:rStyle w:val="Refdecomentario"/>
           <w:rFonts w:ascii="Arial" w:eastAsiaTheme="minorHAnsi" w:hAnsi="Arial" w:cs="Arial"/>
+          <w:sz w:val="22"/>
+          <w:szCs w:val="22"/>
           <w:shd w:val="clear" w:color="auto" w:fill="FFFFFF"/>
           <w:lang w:val="es-ES" w:eastAsia="en-US"/>
         </w:rPr>
@@ -11484,6 +11510,7 @@
           <w:ilvl w:val="0"/>
           <w:numId w:val="34"/>
         </w:numPr>
+        <w:jc w:val="both"/>
         <w:rPr>
           <w:rFonts w:ascii="Arial" w:hAnsi="Arial" w:cs="Arial"/>
           <w:sz w:val="22"/>
@@ -11499,7 +11526,6 @@
           <w:sz w:val="22"/>
           <w:szCs w:val="22"/>
         </w:rPr>
-        <w:lastRenderedPageBreak/>
         <w:t>Registro digital</w:t>
       </w:r>
       <w:r>
@@ -11518,6 +11544,7 @@
           <w:ilvl w:val="0"/>
           <w:numId w:val="34"/>
         </w:numPr>
+        <w:jc w:val="both"/>
         <w:rPr>
           <w:rFonts w:ascii="Arial" w:hAnsi="Arial" w:cs="Arial"/>
           <w:sz w:val="22"/>
@@ -11567,6 +11594,7 @@
           <w:ilvl w:val="0"/>
           <w:numId w:val="34"/>
         </w:numPr>
+        <w:jc w:val="both"/>
         <w:rPr>
           <w:rFonts w:ascii="Arial" w:hAnsi="Arial" w:cs="Arial"/>
           <w:sz w:val="22"/>
@@ -11600,6 +11628,7 @@
           <w:ilvl w:val="0"/>
           <w:numId w:val="34"/>
         </w:numPr>
+        <w:jc w:val="both"/>
         <w:rPr>
           <w:rFonts w:ascii="Arial" w:hAnsi="Arial" w:cs="Arial"/>
           <w:sz w:val="22"/>
@@ -11630,6 +11659,8 @@
         <w:rPr>
           <w:rStyle w:val="Refdecomentario"/>
           <w:rFonts w:ascii="Arial" w:eastAsiaTheme="minorHAnsi" w:hAnsi="Arial" w:cs="Arial"/>
+          <w:sz w:val="22"/>
+          <w:szCs w:val="22"/>
           <w:shd w:val="clear" w:color="auto" w:fill="FFFFFF"/>
           <w:lang w:val="es-ES" w:eastAsia="en-US"/>
         </w:rPr>
@@ -11644,6 +11675,166 @@
         <w:t>.</w:t>
       </w:r>
       <w:bookmarkEnd w:id="78"/>
+    </w:p>
+    <w:p>
+      <w:pPr>
+        <w:spacing w:before="100" w:beforeAutospacing="1" w:after="100" w:afterAutospacing="1" w:line="240" w:lineRule="auto"/>
+        <w:rPr>
+          <w:rFonts w:eastAsia="Times New Roman"/>
+        </w:rPr>
+      </w:pPr>
+      <w:r>
+        <w:rPr>
+          <w:rFonts w:eastAsia="Times New Roman"/>
+        </w:rPr>
+        <w:t xml:space="preserve">El sistema estará construido bajo una arquitectura basada en microservicios, usando </w:t>
+      </w:r>
+      <w:proofErr w:type="spellStart"/>
+      <w:r>
+        <w:rPr>
+          <w:rFonts w:eastAsia="Times New Roman"/>
+        </w:rPr>
+        <w:t>NestJS</w:t>
+      </w:r>
+      <w:proofErr w:type="spellEnd"/>
+      <w:r>
+        <w:rPr>
+          <w:rFonts w:eastAsia="Times New Roman"/>
+        </w:rPr>
+        <w:t xml:space="preserve"> para el </w:t>
+      </w:r>
+      <w:proofErr w:type="spellStart"/>
+      <w:r>
+        <w:rPr>
+          <w:rFonts w:eastAsia="Times New Roman"/>
+        </w:rPr>
+        <w:t>backend</w:t>
+      </w:r>
+      <w:proofErr w:type="spellEnd"/>
+      <w:r>
+        <w:rPr>
+          <w:rFonts w:eastAsia="Times New Roman"/>
+        </w:rPr>
+        <w:t xml:space="preserve"> y </w:t>
+      </w:r>
+      <w:proofErr w:type="spellStart"/>
+      <w:r>
+        <w:rPr>
+          <w:rFonts w:eastAsia="Times New Roman"/>
+        </w:rPr>
+        <w:t>React</w:t>
+      </w:r>
+      <w:proofErr w:type="spellEnd"/>
+      <w:r>
+        <w:rPr>
+          <w:rFonts w:eastAsia="Times New Roman"/>
+        </w:rPr>
+        <w:t xml:space="preserve"> para el </w:t>
+      </w:r>
+      <w:proofErr w:type="spellStart"/>
+      <w:r>
+        <w:rPr>
+          <w:rFonts w:eastAsia="Times New Roman"/>
+        </w:rPr>
+        <w:t>frontend</w:t>
+      </w:r>
+      <w:proofErr w:type="spellEnd"/>
+      <w:r>
+        <w:rPr>
+          <w:rFonts w:eastAsia="Times New Roman"/>
+        </w:rPr>
+        <w:t>. Esta elección responde a la necesidad de un sistema modular, escalable y mantenible, donde cada servicio (</w:t>
+      </w:r>
+      <w:r>
+        <w:rPr>
+          <w:rFonts w:eastAsia="Times New Roman"/>
+        </w:rPr>
+        <w:t xml:space="preserve">gestión de </w:t>
+      </w:r>
+      <w:r>
+        <w:rPr>
+          <w:rFonts w:eastAsia="Times New Roman"/>
+        </w:rPr>
+        <w:t>cálculo</w:t>
+      </w:r>
+      <w:r>
+        <w:rPr>
+          <w:rFonts w:eastAsia="Times New Roman"/>
+        </w:rPr>
+        <w:t>s</w:t>
+      </w:r>
+      <w:r>
+        <w:rPr>
+          <w:rFonts w:eastAsia="Times New Roman"/>
+        </w:rPr>
+        <w:t xml:space="preserve">, gestión de usuarios, generación de </w:t>
+      </w:r>
+      <w:r>
+        <w:rPr>
+          <w:rFonts w:eastAsia="Times New Roman"/>
+        </w:rPr>
+        <w:t>ubicaciones</w:t>
+      </w:r>
+      <w:r>
+        <w:rPr>
+          <w:rFonts w:eastAsia="Times New Roman"/>
+        </w:rPr>
+        <w:t>, etc.) pueda desarrollarse y desplegarse de manera independiente.</w:t>
+      </w:r>
+    </w:p>
+    <w:p>
+      <w:pPr>
+        <w:spacing w:before="100" w:beforeAutospacing="1" w:after="100" w:afterAutospacing="1" w:line="240" w:lineRule="auto"/>
+        <w:ind w:left="0"/>
+        <w:rPr>
+          <w:rFonts w:eastAsia="Times New Roman"/>
+        </w:rPr>
+      </w:pPr>
+      <w:r>
+        <w:rPr>
+          <w:rFonts w:eastAsia="Times New Roman"/>
+        </w:rPr>
+        <w:t>Además, el uso de servicios web REST permitirá que distintos dispositivos (</w:t>
+      </w:r>
+      <w:proofErr w:type="spellStart"/>
+      <w:r>
+        <w:rPr>
+          <w:rFonts w:eastAsia="Times New Roman"/>
+        </w:rPr>
+        <w:t>PCs</w:t>
+      </w:r>
+      <w:proofErr w:type="spellEnd"/>
+      <w:r>
+        <w:rPr>
+          <w:rFonts w:eastAsia="Times New Roman"/>
+        </w:rPr>
+        <w:t xml:space="preserve">, </w:t>
+      </w:r>
+      <w:proofErr w:type="spellStart"/>
+      <w:r>
+        <w:rPr>
+          <w:rFonts w:eastAsia="Times New Roman"/>
+        </w:rPr>
+        <w:t>tablets</w:t>
+      </w:r>
+      <w:proofErr w:type="spellEnd"/>
+      <w:r>
+        <w:rPr>
+          <w:rFonts w:eastAsia="Times New Roman"/>
+        </w:rPr>
+        <w:t>, teléfonos en campo) puedan comunicarse con el sistema central a través de internet, asegurando accesibilidad, interoperabilidad y eficiencia en la gestión de los datos.</w:t>
+      </w:r>
+    </w:p>
+    <w:p>
+      <w:pPr>
+        <w:pStyle w:val="ds-markdown-paragraph"/>
+        <w:jc w:val="both"/>
+        <w:rPr>
+          <w:rFonts w:ascii="Arial" w:hAnsi="Arial" w:cs="Arial"/>
+          <w:sz w:val="22"/>
+          <w:szCs w:val="22"/>
+        </w:rPr>
+      </w:pPr>
     </w:p>
     <w:p>
       <w:pPr>
@@ -11873,7 +12064,11 @@
     </w:p>
     <w:p>
       <w:r>
-        <w:t>Las funcionalidades del sistema se refieren al conjunto de funciones que satisfagan las necesidades implícitas o explícitas de los usuarios, al ser utilizado bajo condiciones específicas. Se relaciona directamente con aquello que el software hace para satisfacer necesidades, mientras que las demás características se refieren al cómo y al cuándo. Evalúa el cumplimiento de requerimientos, la exactitud de los resultados, la seguridad del producto y la interacción con otros sistemas.</w:t>
+        <w:t xml:space="preserve">Las funcionalidades del sistema se refieren al conjunto de funciones que satisfagan las necesidades implícitas o explícitas de los usuarios, al ser utilizado bajo condiciones específicas. Se relaciona directamente con aquello que el software hace para satisfacer </w:t>
+      </w:r>
+      <w:r>
+        <w:lastRenderedPageBreak/>
+        <w:t>necesidades, mientras que las demás características se refieren al cómo y al cuándo. Evalúa el cumplimiento de requerimientos, la exactitud de los resultados, la seguridad del producto y la interacción con otros sistemas.</w:t>
       </w:r>
       <w:r>
         <w:fldChar w:fldCharType="begin"/>
@@ -12104,7 +12299,6 @@
           <w:sz w:val="22"/>
           <w:szCs w:val="22"/>
         </w:rPr>
-        <w:lastRenderedPageBreak/>
         <w:t>HU_</w:t>
       </w:r>
       <w:r>
@@ -12678,6 +12872,7 @@
           <w:rFonts w:cs="Arial"/>
           <w:szCs w:val="22"/>
         </w:rPr>
+        <w:lastRenderedPageBreak/>
         <w:t xml:space="preserve"> </w:t>
       </w:r>
       <w:r>
@@ -12825,7 +13020,6 @@
         <w:spacing w:before="100" w:beforeAutospacing="1" w:after="100" w:afterAutospacing="1" w:line="240" w:lineRule="auto"/>
       </w:pPr>
       <w:r>
-        <w:lastRenderedPageBreak/>
         <w:t>Capacitad para realizar cambios sin afectar la estabilidad</w:t>
       </w:r>
     </w:p>
@@ -13228,6 +13422,7 @@
       <w:bookmarkStart w:id="104" w:name="_Toc193705054"/>
       <w:bookmarkStart w:id="105" w:name="_Toc196374748"/>
       <w:r>
+        <w:lastRenderedPageBreak/>
         <w:t>Historias de Usuarios:</w:t>
       </w:r>
       <w:bookmarkEnd w:id="104"/>
@@ -13247,6 +13442,22 @@
         <w:t xml:space="preserve"> la creación de las pruebas de aceptación</w:t>
       </w:r>
     </w:p>
+    <w:p/>
+    <w:p/>
+    <w:p/>
+    <w:p/>
+    <w:p/>
+    <w:p/>
+    <w:p/>
+    <w:p/>
+    <w:p/>
+    <w:p/>
+    <w:p/>
+    <w:p/>
+    <w:p/>
+    <w:p/>
+    <w:p/>
+    <w:p/>
     <w:p/>
     <w:p/>
     <w:p/>
@@ -15188,9 +15399,9 @@
           <w:lang w:val="es-CU"/>
         </w:rPr>
         <w:drawing>
-          <wp:inline distT="0" distB="0" distL="0" distR="0" wp14:anchorId="66A358EE" wp14:editId="2990F9D8">
+          <wp:inline distT="0" distB="0" distL="0" distR="0" wp14:anchorId="66A358EE" wp14:editId="231F8D4A">
             <wp:extent cx="5974080" cy="2453640"/>
-            <wp:effectExtent l="0" t="0" r="7620" b="3810"/>
+            <wp:effectExtent l="76200" t="76200" r="140970" b="137160"/>
             <wp:docPr id="278948241" name="Imagen 22"/>
             <wp:cNvGraphicFramePr>
               <a:graphicFrameLocks xmlns:a="http://schemas.openxmlformats.org/drawingml/2006/main" noChangeAspect="1"/>
@@ -15225,10 +15436,20 @@
                     <a:prstGeom prst="rect">
                       <a:avLst/>
                     </a:prstGeom>
-                    <a:noFill/>
-                    <a:ln>
-                      <a:noFill/>
+                    <a:ln w="38100" cap="sq">
+                      <a:solidFill>
+                        <a:srgbClr val="000000"/>
+                      </a:solidFill>
+                      <a:prstDash val="solid"/>
+                      <a:miter lim="800000"/>
                     </a:ln>
+                    <a:effectLst>
+                      <a:outerShdw blurRad="50800" dist="38100" dir="2700000" algn="tl" rotWithShape="0">
+                        <a:srgbClr val="000000">
+                          <a:alpha val="43000"/>
+                        </a:srgbClr>
+                      </a:outerShdw>
+                    </a:effectLst>
                   </pic:spPr>
                 </pic:pic>
               </a:graphicData>
@@ -15308,9 +15529,9 @@
           <w:noProof/>
         </w:rPr>
         <w:drawing>
-          <wp:inline distT="0" distB="0" distL="0" distR="0" wp14:anchorId="5628BB87" wp14:editId="28C185F8">
+          <wp:inline distT="0" distB="0" distL="0" distR="0" wp14:anchorId="5628BB87" wp14:editId="52640F89">
             <wp:extent cx="5974080" cy="3025140"/>
-            <wp:effectExtent l="0" t="0" r="7620" b="3810"/>
+            <wp:effectExtent l="76200" t="76200" r="140970" b="137160"/>
             <wp:docPr id="674253039" name="Imagen 24"/>
             <wp:cNvGraphicFramePr>
               <a:graphicFrameLocks xmlns:a="http://schemas.openxmlformats.org/drawingml/2006/main" noChangeAspect="1"/>
@@ -15345,10 +15566,20 @@
                     <a:prstGeom prst="rect">
                       <a:avLst/>
                     </a:prstGeom>
-                    <a:noFill/>
-                    <a:ln>
-                      <a:noFill/>
+                    <a:ln w="38100" cap="sq">
+                      <a:solidFill>
+                        <a:srgbClr val="000000"/>
+                      </a:solidFill>
+                      <a:prstDash val="solid"/>
+                      <a:miter lim="800000"/>
                     </a:ln>
+                    <a:effectLst>
+                      <a:outerShdw blurRad="50800" dist="38100" dir="2700000" algn="tl" rotWithShape="0">
+                        <a:srgbClr val="000000">
+                          <a:alpha val="43000"/>
+                        </a:srgbClr>
+                      </a:outerShdw>
+                    </a:effectLst>
                   </pic:spPr>
                 </pic:pic>
               </a:graphicData>
@@ -15386,10 +15617,490 @@
     </w:p>
     <w:p>
       <w:pPr>
+        <w:rPr>
+          <w:lang w:val="es-ES"/>
+        </w:rPr>
+      </w:pPr>
+      <w:r>
+        <w:rPr>
+          <w:lang w:val="es-ES"/>
+        </w:rPr>
+        <w:lastRenderedPageBreak/>
+        <w:t>El presente diagrama entidad-relación representa un modelo relacional normalizado que refleja la lógica de los datos del sistema, con un enfoque claro en la separación de responsabilidades, simplicidad estructural y eficiencia en el acceso a la información. Este modelo fue diseñado bajo principios fundamentales de normalización, garantizando integridad referencial, eliminación de redundancias y facilidad para la escalabilidad lógica del sistema.</w:t>
+      </w:r>
+    </w:p>
+    <w:p>
+      <w:pPr>
+        <w:rPr>
+          <w:b/>
+          <w:bCs/>
+          <w:lang w:val="es-ES"/>
+        </w:rPr>
+      </w:pPr>
+      <w:r>
+        <w:rPr>
+          <w:b/>
+          <w:bCs/>
+          <w:lang w:val="es-ES"/>
+        </w:rPr>
+        <w:t>Normalización y Simplicidad</w:t>
+      </w:r>
+    </w:p>
+    <w:p>
+      <w:pPr>
+        <w:rPr>
+          <w:lang w:val="es-ES"/>
+        </w:rPr>
+      </w:pPr>
+      <w:r>
+        <w:rPr>
+          <w:lang w:val="es-ES"/>
+        </w:rPr>
+        <w:t xml:space="preserve">El modelo alcanza al menos la </w:t>
+      </w:r>
+      <w:r>
+        <w:rPr>
+          <w:b/>
+          <w:bCs/>
+          <w:lang w:val="es-ES"/>
+        </w:rPr>
+        <w:t>Tercera Forma Normal (3FN)</w:t>
+      </w:r>
+      <w:r>
+        <w:rPr>
+          <w:lang w:val="es-ES"/>
+        </w:rPr>
+        <w:t>, lo que implica:</w:t>
+      </w:r>
+    </w:p>
+    <w:p>
+      <w:pPr>
+        <w:numPr>
+          <w:ilvl w:val="0"/>
+          <w:numId w:val="54"/>
+        </w:numPr>
+        <w:rPr>
+          <w:lang w:val="es-ES"/>
+        </w:rPr>
+      </w:pPr>
+      <w:r>
+        <w:rPr>
+          <w:b/>
+          <w:bCs/>
+          <w:lang w:val="es-ES"/>
+        </w:rPr>
+        <w:t>1FN:</w:t>
+      </w:r>
+      <w:r>
+        <w:rPr>
+          <w:lang w:val="es-ES"/>
+        </w:rPr>
+        <w:t xml:space="preserve"> Todos los atributos son atómicos y no repetitivos.</w:t>
+      </w:r>
+    </w:p>
+    <w:p>
+      <w:pPr>
+        <w:numPr>
+          <w:ilvl w:val="0"/>
+          <w:numId w:val="54"/>
+        </w:numPr>
+        <w:rPr>
+          <w:lang w:val="es-ES"/>
+        </w:rPr>
+      </w:pPr>
+      <w:r>
+        <w:rPr>
+          <w:b/>
+          <w:bCs/>
+          <w:lang w:val="es-ES"/>
+        </w:rPr>
+        <w:t>2FN:</w:t>
+      </w:r>
+      <w:r>
+        <w:rPr>
+          <w:lang w:val="es-ES"/>
+        </w:rPr>
+        <w:t xml:space="preserve"> Todos los atributos no clave dependen completamente de la clave primaria.</w:t>
+      </w:r>
+    </w:p>
+    <w:p>
+      <w:pPr>
+        <w:numPr>
+          <w:ilvl w:val="0"/>
+          <w:numId w:val="54"/>
+        </w:numPr>
+        <w:rPr>
+          <w:lang w:val="es-ES"/>
+        </w:rPr>
+      </w:pPr>
+      <w:r>
+        <w:rPr>
+          <w:b/>
+          <w:bCs/>
+          <w:lang w:val="es-ES"/>
+        </w:rPr>
+        <w:t>3FN:</w:t>
+      </w:r>
+      <w:r>
+        <w:rPr>
+          <w:lang w:val="es-ES"/>
+        </w:rPr>
+        <w:t xml:space="preserve"> No existen dependencias transitivas entre atributos no clave.</w:t>
+      </w:r>
+    </w:p>
+    <w:p>
+      <w:pPr>
+        <w:rPr>
+          <w:lang w:val="es-ES"/>
+        </w:rPr>
+      </w:pPr>
+      <w:r>
+        <w:rPr>
+          <w:lang w:val="es-ES"/>
+        </w:rPr>
+        <w:t>Las tablas se han estructurado cuidadosamente:</w:t>
+      </w:r>
+    </w:p>
+    <w:p>
+      <w:pPr>
+        <w:numPr>
+          <w:ilvl w:val="0"/>
+          <w:numId w:val="55"/>
+        </w:numPr>
+        <w:rPr>
+          <w:lang w:val="es-ES"/>
+        </w:rPr>
+      </w:pPr>
+      <w:r>
+        <w:rPr>
+          <w:lang w:val="es-ES"/>
+        </w:rPr>
+        <w:t>Usuario almacena datos personales y credenciales, evitando duplicidad de información.</w:t>
+      </w:r>
+    </w:p>
+    <w:p>
+      <w:pPr>
+        <w:numPr>
+          <w:ilvl w:val="0"/>
+          <w:numId w:val="55"/>
+        </w:numPr>
+        <w:rPr>
+          <w:lang w:val="es-ES"/>
+        </w:rPr>
+      </w:pPr>
+      <w:r>
+        <w:rPr>
+          <w:lang w:val="es-ES"/>
+        </w:rPr>
+        <w:t>Trazas registra eventos asociados a un usuario, permitiendo trazabilidad sin inflar la entidad principal.</w:t>
+      </w:r>
+    </w:p>
+    <w:p>
+      <w:pPr>
+        <w:numPr>
+          <w:ilvl w:val="0"/>
+          <w:numId w:val="55"/>
+        </w:numPr>
+        <w:rPr>
+          <w:lang w:val="es-ES"/>
+        </w:rPr>
+      </w:pPr>
+      <w:r>
+        <w:rPr>
+          <w:lang w:val="es-ES"/>
+        </w:rPr>
+        <w:t>Cálculo gestiona datos técnicos vinculados a un usuario y una ubicación, separando la lógica de negocio.</w:t>
+      </w:r>
+    </w:p>
+    <w:p>
+      <w:pPr>
+        <w:numPr>
+          <w:ilvl w:val="0"/>
+          <w:numId w:val="55"/>
+        </w:numPr>
+        <w:rPr>
+          <w:lang w:val="es-ES"/>
+        </w:rPr>
+      </w:pPr>
+      <w:r>
+        <w:rPr>
+          <w:lang w:val="es-ES"/>
+        </w:rPr>
+        <w:t>Ubicación mantiene datos espaciales, reutilizables por múltiples cálculos, lo cual previene redundancias.</w:t>
+      </w:r>
+    </w:p>
+    <w:p>
+      <w:pPr>
+        <w:rPr>
+          <w:lang w:val="es-ES"/>
+        </w:rPr>
+      </w:pPr>
+      <w:r>
+        <w:rPr>
+          <w:lang w:val="es-ES"/>
+        </w:rPr>
+        <w:t xml:space="preserve">Esta separación de entidades ofrece </w:t>
+      </w:r>
+      <w:r>
+        <w:rPr>
+          <w:b/>
+          <w:bCs/>
+          <w:lang w:val="es-ES"/>
+        </w:rPr>
+        <w:t>sencillez conceptual</w:t>
+      </w:r>
+      <w:r>
+        <w:rPr>
+          <w:lang w:val="es-ES"/>
+        </w:rPr>
+        <w:t>, permitiendo mantener y expandir el modelo sin introducir inconsistencias. Cada relación está debidamente documentada mediante claves foráneas (FK), lo que favorece el control de integridad referencial.</w:t>
+      </w:r>
+    </w:p>
+    <w:p>
+      <w:pPr>
+        <w:rPr>
+          <w:b/>
+          <w:bCs/>
+          <w:lang w:val="es-ES"/>
+        </w:rPr>
+      </w:pPr>
+      <w:r>
+        <w:rPr>
+          <w:b/>
+          <w:bCs/>
+          <w:lang w:val="es-ES"/>
+        </w:rPr>
+        <w:t>Transición al Modelo NoSQL Documental (MongoDB)</w:t>
+      </w:r>
+    </w:p>
+    <w:p>
+      <w:pPr>
+        <w:rPr>
+          <w:lang w:val="es-ES"/>
+        </w:rPr>
+      </w:pPr>
+      <w:r>
+        <w:rPr>
+          <w:lang w:val="es-ES"/>
+        </w:rPr>
+        <w:t>Aunque este diseño parte de un esquema relacional tradicional, su estructura se adapta fácilmente a un modelo documental como MongoDB, donde las relaciones pueden representarse mediante incrustación o referencias.</w:t>
+      </w:r>
+    </w:p>
+    <w:p>
+      <w:pPr>
+        <w:numPr>
+          <w:ilvl w:val="0"/>
+          <w:numId w:val="56"/>
+        </w:numPr>
+        <w:rPr>
+          <w:lang w:val="es-ES"/>
+        </w:rPr>
+      </w:pPr>
+      <w:r>
+        <w:rPr>
+          <w:lang w:val="es-ES"/>
+        </w:rPr>
+        <w:t xml:space="preserve">En MongoDB, Usuario puede representarse como un </w:t>
+      </w:r>
+      <w:r>
+        <w:rPr>
+          <w:b/>
+          <w:bCs/>
+          <w:lang w:val="es-ES"/>
+        </w:rPr>
+        <w:t>documento principal</w:t>
+      </w:r>
+      <w:r>
+        <w:rPr>
+          <w:lang w:val="es-ES"/>
+        </w:rPr>
+        <w:t>, y sus Trazas como un arreglo de documentos embebidos, dado que estas trazas son fuertemente dependientes del usuario.</w:t>
+      </w:r>
+    </w:p>
+    <w:p>
+      <w:pPr>
+        <w:numPr>
+          <w:ilvl w:val="0"/>
+          <w:numId w:val="56"/>
+        </w:numPr>
+        <w:rPr>
+          <w:lang w:val="es-ES"/>
+        </w:rPr>
+      </w:pPr>
+      <w:r>
+        <w:rPr>
+          <w:lang w:val="es-ES"/>
+        </w:rPr>
+        <w:lastRenderedPageBreak/>
+        <w:t xml:space="preserve">Las entidades Cálculo y Ubicación pueden manejarse con </w:t>
+      </w:r>
+      <w:r>
+        <w:rPr>
+          <w:b/>
+          <w:bCs/>
+          <w:lang w:val="es-ES"/>
+        </w:rPr>
+        <w:t>referencias</w:t>
+      </w:r>
+      <w:r>
+        <w:rPr>
+          <w:lang w:val="es-ES"/>
+        </w:rPr>
+        <w:t>, especialmente si una ubicación es compartida entre múltiples cálculos.</w:t>
+      </w:r>
+    </w:p>
+    <w:p>
+      <w:pPr>
+        <w:numPr>
+          <w:ilvl w:val="0"/>
+          <w:numId w:val="56"/>
+        </w:numPr>
+        <w:rPr>
+          <w:lang w:val="es-ES"/>
+        </w:rPr>
+      </w:pPr>
+      <w:r>
+        <w:rPr>
+          <w:lang w:val="es-ES"/>
+        </w:rPr>
+        <w:t xml:space="preserve">Alternativamente, en un escenario donde la consulta y visualización rápida del cálculo es prioritaria, puede optarse por </w:t>
+      </w:r>
+      <w:r>
+        <w:rPr>
+          <w:b/>
+          <w:bCs/>
+          <w:lang w:val="es-ES"/>
+        </w:rPr>
+        <w:t>embebido parcial</w:t>
+      </w:r>
+      <w:r>
+        <w:rPr>
+          <w:lang w:val="es-ES"/>
+        </w:rPr>
+        <w:t xml:space="preserve"> (</w:t>
+      </w:r>
+      <w:proofErr w:type="spellStart"/>
+      <w:r>
+        <w:rPr>
+          <w:lang w:val="es-ES"/>
+        </w:rPr>
+        <w:t>denormalización</w:t>
+      </w:r>
+      <w:proofErr w:type="spellEnd"/>
+      <w:r>
+        <w:rPr>
+          <w:lang w:val="es-ES"/>
+        </w:rPr>
+        <w:t xml:space="preserve"> controlada), replicando ciertos datos de Ubicación dentro de Cálculo para optimizar rendimiento, aprovechando la naturaleza flexible de MongoDB.</w:t>
+      </w:r>
+    </w:p>
+    <w:p>
+      <w:pPr>
+        <w:rPr>
+          <w:lang w:val="es-ES"/>
+        </w:rPr>
+      </w:pPr>
+      <w:r>
+        <w:rPr>
+          <w:lang w:val="es-ES"/>
+        </w:rPr>
+        <w:t xml:space="preserve">Este enfoque híbrido permite que el modelo mantenga la lógica de normalización en el diseño conceptual, mientras que en la implementación documental se aplican patrones de diseño NoSQL como </w:t>
+      </w:r>
+      <w:proofErr w:type="spellStart"/>
+      <w:r>
+        <w:rPr>
+          <w:b/>
+          <w:bCs/>
+          <w:lang w:val="es-ES"/>
+        </w:rPr>
+        <w:t>Document</w:t>
+      </w:r>
+      <w:proofErr w:type="spellEnd"/>
+      <w:r>
+        <w:rPr>
+          <w:b/>
+          <w:bCs/>
+          <w:lang w:val="es-ES"/>
+        </w:rPr>
+        <w:t xml:space="preserve"> </w:t>
+      </w:r>
+      <w:proofErr w:type="spellStart"/>
+      <w:r>
+        <w:rPr>
+          <w:b/>
+          <w:bCs/>
+          <w:lang w:val="es-ES"/>
+        </w:rPr>
+        <w:t>Referencing</w:t>
+      </w:r>
+      <w:proofErr w:type="spellEnd"/>
+      <w:r>
+        <w:rPr>
+          <w:lang w:val="es-ES"/>
+        </w:rPr>
+        <w:t xml:space="preserve"> y </w:t>
+      </w:r>
+      <w:proofErr w:type="spellStart"/>
+      <w:r>
+        <w:rPr>
+          <w:b/>
+          <w:bCs/>
+          <w:lang w:val="es-ES"/>
+        </w:rPr>
+        <w:t>Embedded</w:t>
+      </w:r>
+      <w:proofErr w:type="spellEnd"/>
+      <w:r>
+        <w:rPr>
+          <w:b/>
+          <w:bCs/>
+          <w:lang w:val="es-ES"/>
+        </w:rPr>
+        <w:t xml:space="preserve"> </w:t>
+      </w:r>
+      <w:proofErr w:type="spellStart"/>
+      <w:r>
+        <w:rPr>
+          <w:b/>
+          <w:bCs/>
+          <w:lang w:val="es-ES"/>
+        </w:rPr>
+        <w:t>Documents</w:t>
+      </w:r>
+      <w:proofErr w:type="spellEnd"/>
+      <w:r>
+        <w:rPr>
+          <w:lang w:val="es-ES"/>
+        </w:rPr>
+        <w:t>, dependiendo de la frecuencia de acceso, volumen de datos y necesidad de transaccionalidad.</w:t>
+      </w:r>
+    </w:p>
+    <w:p>
+      <w:pPr>
+        <w:rPr>
+          <w:lang w:val="es-ES"/>
+        </w:rPr>
+      </w:pPr>
+      <w:r>
+        <w:rPr>
+          <w:lang w:val="es-ES"/>
+        </w:rPr>
+        <w:t>El modelo relacional propuesto no solo asegura integridad y claridad en su versión normalizada, sino que también sirve como una base robusta para su adaptación eficiente a un entorno NoSQL documental como MongoDB, combinando lo mejor de ambos paradigmas: la estructura lógica del modelo relacional y la flexibilidad y rendimiento del enfoque documental.</w:t>
+      </w:r>
+    </w:p>
+    <w:p>
+      <w:pPr>
+        <w:rPr>
+          <w:sz w:val="18"/>
+          <w:szCs w:val="18"/>
+        </w:rPr>
+      </w:pPr>
+    </w:p>
+    <w:p>
+      <w:pPr>
         <w:pStyle w:val="Ttulo2"/>
       </w:pPr>
       <w:r>
-        <w:lastRenderedPageBreak/>
         <w:t xml:space="preserve"> </w:t>
       </w:r>
       <w:r>
@@ -15484,6 +16195,7 @@
         <w:rPr>
           <w:lang w:val="en-US"/>
         </w:rPr>
+        <w:lastRenderedPageBreak/>
         <w:t>Seguridad</w:t>
       </w:r>
       <w:proofErr w:type="spellEnd"/>
@@ -15659,72 +16371,64 @@
           <w:lang w:val="es-ES"/>
         </w:rPr>
       </w:pPr>
-    </w:p>
-    <w:p>
-      <w:pPr>
+      <w:r>
         <w:rPr>
           <w:lang w:val="es-ES"/>
         </w:rPr>
-      </w:pPr>
+        <w:t xml:space="preserve">REST </w:t>
+      </w:r>
+      <w:r>
+        <w:t>(</w:t>
+      </w:r>
+      <w:proofErr w:type="spellStart"/>
+      <w:r>
+        <w:t>Representational</w:t>
+      </w:r>
+      <w:proofErr w:type="spellEnd"/>
+      <w:r>
+        <w:t xml:space="preserve"> </w:t>
+      </w:r>
+      <w:proofErr w:type="spellStart"/>
+      <w:r>
+        <w:t>State</w:t>
+      </w:r>
+      <w:proofErr w:type="spellEnd"/>
+      <w:r>
+        <w:t xml:space="preserve"> Transfer)</w:t>
+      </w:r>
+      <w:r>
+        <w:t xml:space="preserve"> </w:t>
+      </w:r>
       <w:r>
         <w:rPr>
           <w:lang w:val="es-ES"/>
         </w:rPr>
-        <w:t xml:space="preserve">REST </w:t>
-      </w:r>
-      <w:r>
-        <w:t>(</w:t>
-      </w:r>
-      <w:proofErr w:type="spellStart"/>
-      <w:r>
-        <w:t>Representational</w:t>
-      </w:r>
-      <w:proofErr w:type="spellEnd"/>
-      <w:r>
-        <w:t xml:space="preserve"> </w:t>
-      </w:r>
-      <w:proofErr w:type="spellStart"/>
-      <w:r>
-        <w:t>State</w:t>
-      </w:r>
-      <w:proofErr w:type="spellEnd"/>
-      <w:r>
-        <w:t xml:space="preserve"> Transfer)</w:t>
-      </w:r>
-      <w:r>
-        <w:t xml:space="preserve"> </w:t>
-      </w:r>
-      <w:r>
+        <w:t xml:space="preserve">no es un estándar, claramente define unos principios de arquitectura a seguir para implementar aplicaciones o servicios web. No obstante, REST se basa en estándares para su implementación: HTTP, XML. Los servicios REST tienen las siguientes características: </w:t>
+      </w:r>
+    </w:p>
+    <w:p>
+      <w:pPr>
         <w:rPr>
           <w:lang w:val="es-ES"/>
         </w:rPr>
-        <w:t xml:space="preserve">no es un estándar, claramente define unos principios de arquitectura a seguir para implementar aplicaciones o servicios web. No obstante, REST se basa en estándares para su implementación: HTTP, XML. Los servicios REST tienen las siguientes características: </w:t>
-      </w:r>
-    </w:p>
-    <w:p>
-      <w:pPr>
+      </w:pPr>
+      <w:r>
         <w:rPr>
           <w:lang w:val="es-ES"/>
         </w:rPr>
-      </w:pPr>
-      <w:r>
+        <w:t xml:space="preserve">● Las operaciones más importantes que permiten manipular los recursos son cuatro: GET para consultar y leer; POST para crear; PUT para editar; DELETE para eliminar. </w:t>
+      </w:r>
+    </w:p>
+    <w:p>
+      <w:pPr>
         <w:rPr>
           <w:lang w:val="es-ES"/>
         </w:rPr>
-        <w:t xml:space="preserve">● Las operaciones más importantes que permiten manipular los recursos son cuatro: GET para consultar y leer; POST para crear; PUT para editar; DELETE para eliminar. </w:t>
-      </w:r>
-    </w:p>
-    <w:p>
-      <w:pPr>
+      </w:pPr>
+      <w:r>
         <w:rPr>
           <w:lang w:val="es-ES"/>
         </w:rPr>
-      </w:pPr>
-      <w:r>
-        <w:rPr>
-          <w:lang w:val="es-ES"/>
-        </w:rPr>
-        <w:lastRenderedPageBreak/>
         <w:t xml:space="preserve">● El uso de hipermedias para permitir al cliente navegar por los distintos recursos de una API REST a través de enlaces HTML. </w:t>
       </w:r>
     </w:p>
@@ -15930,6 +16634,7 @@
           <w:bCs/>
           <w:lang w:val="es-ES"/>
         </w:rPr>
+        <w:lastRenderedPageBreak/>
         <w:t>Limitaciones en Solicitudes Complejas:</w:t>
       </w:r>
       <w:r>
@@ -16348,11 +17053,7 @@
         <w:t xml:space="preserve">Se </w:t>
       </w:r>
       <w:r>
-        <w:t xml:space="preserve">conciben como un estilo arquitectónico enfocado en desarrollar una </w:t>
-      </w:r>
-      <w:r>
-        <w:lastRenderedPageBreak/>
-        <w:t xml:space="preserve">aplicación mediante un conjunto de servicios, independientes, escalables, colaborativos, evolutivos, capaces de </w:t>
+        <w:t xml:space="preserve">conciben como un estilo arquitectónico enfocado en desarrollar una aplicación mediante un conjunto de servicios, independientes, escalables, colaborativos, evolutivos, capaces de </w:t>
       </w:r>
       <w:proofErr w:type="spellStart"/>
       <w:r>
@@ -16559,6 +17260,7 @@
           <w:bCs/>
           <w:lang w:val="es-ES"/>
         </w:rPr>
+        <w:lastRenderedPageBreak/>
         <w:t>Complejidad en la comunicación y gestión</w:t>
       </w:r>
       <w:r>
@@ -16677,7 +17379,6 @@
       </w:pPr>
       <w:commentRangeStart w:id="117"/>
       <w:r>
-        <w:lastRenderedPageBreak/>
         <w:t>Patrones de Microservicios</w:t>
       </w:r>
       <w:commentRangeEnd w:id="117"/>
@@ -16816,7 +17517,14 @@
         <w:rPr>
           <w:lang w:val="es-ES"/>
         </w:rPr>
-        <w:t xml:space="preserve"> (responsable de autenticación, configuración y control de acceso) y el microservicio de cálculo. Dado que las operaciones del sistema pueden implicar múltiples pasos secuenciales —por ejemplo, autenticación del usuario, validación de datos, obtención de parámetros de configuración y ejecución de algoritmos de cálculo—, se requiere garantizar que, ante fallos, el sistema mantenga la coherencia del flujo.</w:t>
+        <w:t xml:space="preserve"> (responsable de autenticación, configuración y control de acceso) y el microservicio de cálculo. Dado que las operaciones del sistema pueden implicar múltiples pasos </w:t>
+      </w:r>
+      <w:r>
+        <w:rPr>
+          <w:lang w:val="es-ES"/>
+        </w:rPr>
+        <w:lastRenderedPageBreak/>
+        <w:t>secuenciales —por ejemplo, autenticación del usuario, validación de datos, obtención de parámetros de configuración y ejecución de algoritmos de cálculo—, se requiere garantizar que, ante fallos, el sistema mantenga la coherencia del flujo.</w:t>
       </w:r>
     </w:p>
     <w:p>
@@ -16932,7 +17640,6 @@
         <w:rPr>
           <w:lang w:val="es-ES"/>
         </w:rPr>
-        <w:lastRenderedPageBreak/>
         <w:t>Reduce el acoplamiento entre servicios, mejorando la mantenibilidad.</w:t>
       </w:r>
     </w:p>
@@ -17141,6 +17848,7 @@
           <w:bCs/>
           <w:lang w:val="en-US"/>
         </w:rPr>
+        <w:lastRenderedPageBreak/>
         <w:t>Componentes</w:t>
       </w:r>
       <w:proofErr w:type="spellEnd"/>
@@ -17410,7 +18118,6 @@
         <w:rPr>
           <w:lang w:val="es-ES"/>
         </w:rPr>
-        <w:lastRenderedPageBreak/>
         <w:t>Permite aplicar estrategias de respuesta alternativas (</w:t>
       </w:r>
       <w:proofErr w:type="spellStart"/>
@@ -17613,6 +18320,7 @@
         <w:rPr>
           <w:lang w:val="es-ES"/>
         </w:rPr>
+        <w:lastRenderedPageBreak/>
         <w:t>Para proteger los recursos expuestos a través de los servicios web implementados, se adoptará un mecanismo de autenticación basado en la tecnología JSON Web Token (JWT).</w:t>
       </w:r>
     </w:p>
@@ -17713,7 +18421,6 @@
         <w:rPr>
           <w:lang w:val="es-ES"/>
         </w:rPr>
-        <w:lastRenderedPageBreak/>
         <w:t>En caso de olvido de la contraseña de acceso, el usuario podrá solicitar al Administrador la asignación de una nueva clave.</w:t>
       </w:r>
     </w:p>
@@ -18321,11 +19028,1065 @@
     </w:p>
     <w:p>
       <w:pPr>
+        <w:pStyle w:val="Ttulo4"/>
+        <w:jc w:val="both"/>
+        <w:rPr>
+          <w:rFonts w:ascii="Arial" w:hAnsi="Arial" w:cs="Arial"/>
+          <w:b w:val="0"/>
+          <w:bCs/>
+          <w:color w:val="auto"/>
+          <w:sz w:val="22"/>
+        </w:rPr>
+      </w:pPr>
+      <w:proofErr w:type="spellStart"/>
+      <w:r>
+        <w:rPr>
+          <w:rFonts w:ascii="Arial" w:hAnsi="Arial" w:cs="Arial"/>
+          <w:b w:val="0"/>
+          <w:bCs/>
+          <w:color w:val="auto"/>
+          <w:sz w:val="22"/>
+        </w:rPr>
+        <w:t>Backend</w:t>
+      </w:r>
+      <w:proofErr w:type="spellEnd"/>
+      <w:r>
+        <w:rPr>
+          <w:rFonts w:ascii="Arial" w:hAnsi="Arial" w:cs="Arial"/>
+          <w:b w:val="0"/>
+          <w:bCs/>
+          <w:color w:val="auto"/>
+          <w:sz w:val="22"/>
+        </w:rPr>
+        <w:t xml:space="preserve"> (</w:t>
+      </w:r>
+      <w:proofErr w:type="spellStart"/>
+      <w:r>
+        <w:rPr>
+          <w:rFonts w:ascii="Arial" w:hAnsi="Arial" w:cs="Arial"/>
+          <w:b w:val="0"/>
+          <w:bCs/>
+          <w:color w:val="auto"/>
+          <w:sz w:val="22"/>
+        </w:rPr>
+        <w:t>NestJS</w:t>
+      </w:r>
+      <w:proofErr w:type="spellEnd"/>
+      <w:r>
+        <w:rPr>
+          <w:rFonts w:ascii="Arial" w:hAnsi="Arial" w:cs="Arial"/>
+          <w:b w:val="0"/>
+          <w:bCs/>
+          <w:color w:val="auto"/>
+          <w:sz w:val="22"/>
+        </w:rPr>
+        <w:t>)</w:t>
+      </w:r>
+    </w:p>
+    <w:p>
+      <w:pPr>
+        <w:pStyle w:val="ds-markdown-paragraph"/>
+        <w:jc w:val="both"/>
+        <w:rPr>
+          <w:rFonts w:ascii="Arial" w:hAnsi="Arial" w:cs="Arial"/>
+          <w:bCs/>
+          <w:sz w:val="22"/>
+          <w:szCs w:val="22"/>
+        </w:rPr>
+      </w:pPr>
+      <w:r>
+        <w:rPr>
+          <w:rFonts w:ascii="Arial" w:hAnsi="Arial" w:cs="Arial"/>
+          <w:bCs/>
+          <w:sz w:val="22"/>
+          <w:szCs w:val="22"/>
+        </w:rPr>
+        <w:t xml:space="preserve">El </w:t>
+      </w:r>
+      <w:proofErr w:type="spellStart"/>
+      <w:r>
+        <w:rPr>
+          <w:rFonts w:ascii="Arial" w:hAnsi="Arial" w:cs="Arial"/>
+          <w:bCs/>
+          <w:sz w:val="22"/>
+          <w:szCs w:val="22"/>
+        </w:rPr>
+        <w:t>backend</w:t>
+      </w:r>
+      <w:proofErr w:type="spellEnd"/>
+      <w:r>
+        <w:rPr>
+          <w:rFonts w:ascii="Arial" w:hAnsi="Arial" w:cs="Arial"/>
+          <w:bCs/>
+          <w:sz w:val="22"/>
+          <w:szCs w:val="22"/>
+        </w:rPr>
+        <w:t xml:space="preserve"> sigue una arquitectura por capas con:</w:t>
+      </w:r>
+    </w:p>
+    <w:p>
+      <w:pPr>
+        <w:pStyle w:val="ds-markdown-paragraph"/>
+        <w:numPr>
+          <w:ilvl w:val="0"/>
+          <w:numId w:val="37"/>
+        </w:numPr>
+        <w:jc w:val="both"/>
+        <w:rPr>
+          <w:rFonts w:ascii="Arial" w:hAnsi="Arial" w:cs="Arial"/>
+          <w:bCs/>
+          <w:sz w:val="22"/>
+          <w:szCs w:val="22"/>
+        </w:rPr>
+      </w:pPr>
+      <w:r>
+        <w:rPr>
+          <w:rStyle w:val="Textoennegrita"/>
+          <w:rFonts w:ascii="Arial" w:eastAsia="Arial" w:hAnsi="Arial" w:cs="Arial"/>
+          <w:b w:val="0"/>
+          <w:sz w:val="22"/>
+          <w:szCs w:val="22"/>
+        </w:rPr>
+        <w:t>Módulos</w:t>
+      </w:r>
+      <w:r>
+        <w:rPr>
+          <w:rFonts w:ascii="Arial" w:hAnsi="Arial" w:cs="Arial"/>
+          <w:bCs/>
+          <w:sz w:val="22"/>
+          <w:szCs w:val="22"/>
+        </w:rPr>
+        <w:t>: Agrupación lógica de funcionalidades</w:t>
+      </w:r>
+    </w:p>
+    <w:p>
+      <w:pPr>
+        <w:pStyle w:val="ds-markdown-paragraph"/>
+        <w:numPr>
+          <w:ilvl w:val="0"/>
+          <w:numId w:val="37"/>
+        </w:numPr>
+        <w:jc w:val="both"/>
+        <w:rPr>
+          <w:rFonts w:ascii="Arial" w:hAnsi="Arial" w:cs="Arial"/>
+          <w:bCs/>
+          <w:sz w:val="22"/>
+          <w:szCs w:val="22"/>
+        </w:rPr>
+      </w:pPr>
+      <w:r>
+        <w:rPr>
+          <w:rStyle w:val="Textoennegrita"/>
+          <w:rFonts w:ascii="Arial" w:eastAsia="Arial" w:hAnsi="Arial" w:cs="Arial"/>
+          <w:b w:val="0"/>
+          <w:sz w:val="22"/>
+          <w:szCs w:val="22"/>
+        </w:rPr>
+        <w:t>Controladores</w:t>
+      </w:r>
+      <w:r>
+        <w:rPr>
+          <w:rFonts w:ascii="Arial" w:hAnsi="Arial" w:cs="Arial"/>
+          <w:bCs/>
+          <w:sz w:val="22"/>
+          <w:szCs w:val="22"/>
+        </w:rPr>
+        <w:t>: Manejo de peticiones HTTP</w:t>
+      </w:r>
+    </w:p>
+    <w:p>
+      <w:pPr>
+        <w:pStyle w:val="ds-markdown-paragraph"/>
+        <w:numPr>
+          <w:ilvl w:val="0"/>
+          <w:numId w:val="37"/>
+        </w:numPr>
+        <w:jc w:val="both"/>
+        <w:rPr>
+          <w:rFonts w:ascii="Arial" w:hAnsi="Arial" w:cs="Arial"/>
+          <w:bCs/>
+          <w:sz w:val="22"/>
+          <w:szCs w:val="22"/>
+        </w:rPr>
+      </w:pPr>
+      <w:r>
+        <w:rPr>
+          <w:rStyle w:val="Textoennegrita"/>
+          <w:rFonts w:ascii="Arial" w:eastAsia="Arial" w:hAnsi="Arial" w:cs="Arial"/>
+          <w:b w:val="0"/>
+          <w:sz w:val="22"/>
+          <w:szCs w:val="22"/>
+        </w:rPr>
+        <w:t>Servicios</w:t>
+      </w:r>
+      <w:r>
+        <w:rPr>
+          <w:rFonts w:ascii="Arial" w:hAnsi="Arial" w:cs="Arial"/>
+          <w:bCs/>
+          <w:sz w:val="22"/>
+          <w:szCs w:val="22"/>
+        </w:rPr>
+        <w:t>: Lógica de negocio</w:t>
+      </w:r>
+    </w:p>
+    <w:p>
+      <w:pPr>
+        <w:pStyle w:val="ds-markdown-paragraph"/>
+        <w:numPr>
+          <w:ilvl w:val="0"/>
+          <w:numId w:val="37"/>
+        </w:numPr>
+        <w:jc w:val="both"/>
+        <w:rPr>
+          <w:rFonts w:ascii="Arial" w:hAnsi="Arial" w:cs="Arial"/>
+          <w:bCs/>
+          <w:sz w:val="22"/>
+          <w:szCs w:val="22"/>
+        </w:rPr>
+      </w:pPr>
+      <w:r>
+        <w:rPr>
+          <w:rStyle w:val="Textoennegrita"/>
+          <w:rFonts w:ascii="Arial" w:eastAsia="Arial" w:hAnsi="Arial" w:cs="Arial"/>
+          <w:b w:val="0"/>
+          <w:sz w:val="22"/>
+          <w:szCs w:val="22"/>
+        </w:rPr>
+        <w:t>Repositorios</w:t>
+      </w:r>
+      <w:r>
+        <w:rPr>
+          <w:rFonts w:ascii="Arial" w:hAnsi="Arial" w:cs="Arial"/>
+          <w:bCs/>
+          <w:sz w:val="22"/>
+          <w:szCs w:val="22"/>
+        </w:rPr>
+        <w:t>: Acceso a datos</w:t>
+      </w:r>
+    </w:p>
+    <w:p>
+      <w:r>
+        <w:t xml:space="preserve">La aplicación </w:t>
+      </w:r>
+      <w:proofErr w:type="spellStart"/>
+      <w:r>
+        <w:t>MoreCoast</w:t>
+      </w:r>
+      <w:proofErr w:type="spellEnd"/>
+      <w:r>
+        <w:t xml:space="preserve"> (Más Costas) se desarrolla para la gestión de la información del cálculo del transporte de los sedimentos de la empresa GEOCUBA en la provincia Santiago de Cuba. La misma está compuesta por un conjunto de directorios</w:t>
+      </w:r>
+      <w:r>
+        <w:t xml:space="preserve"> (Figura 3.1) </w:t>
+      </w:r>
+      <w:r>
+        <w:t>de los cuales se destacan:</w:t>
+      </w:r>
+    </w:p>
+    <w:p>
+      <w:pPr>
+        <w:pStyle w:val="Prrafodelista"/>
+        <w:numPr>
+          <w:ilvl w:val="0"/>
+          <w:numId w:val="38"/>
+        </w:numPr>
+        <w:rPr>
+          <w:sz w:val="22"/>
+          <w:szCs w:val="22"/>
+        </w:rPr>
+      </w:pPr>
+      <w:r>
+        <w:rPr>
+          <w:bCs/>
+          <w:sz w:val="22"/>
+          <w:szCs w:val="22"/>
+        </w:rPr>
+        <w:t xml:space="preserve">El directorio </w:t>
+      </w:r>
+      <w:r>
+        <w:rPr>
+          <w:b/>
+          <w:sz w:val="22"/>
+          <w:szCs w:val="22"/>
+        </w:rPr>
+        <w:t>“</w:t>
+      </w:r>
+      <w:proofErr w:type="spellStart"/>
+      <w:r>
+        <w:rPr>
+          <w:b/>
+          <w:sz w:val="22"/>
+          <w:szCs w:val="22"/>
+        </w:rPr>
+        <w:t>src</w:t>
+      </w:r>
+      <w:proofErr w:type="spellEnd"/>
+      <w:r>
+        <w:rPr>
+          <w:b/>
+          <w:sz w:val="22"/>
+          <w:szCs w:val="22"/>
+        </w:rPr>
+        <w:t>/”</w:t>
+      </w:r>
+      <w:r>
+        <w:rPr>
+          <w:bCs/>
+          <w:sz w:val="22"/>
+          <w:szCs w:val="22"/>
+        </w:rPr>
+        <w:t xml:space="preserve">: </w:t>
+      </w:r>
+      <w:r>
+        <w:rPr>
+          <w:bCs/>
+          <w:sz w:val="22"/>
+          <w:szCs w:val="22"/>
+        </w:rPr>
+        <w:t xml:space="preserve">en él está </w:t>
+      </w:r>
+      <w:r>
+        <w:rPr>
+          <w:sz w:val="22"/>
+          <w:szCs w:val="22"/>
+        </w:rPr>
+        <w:t xml:space="preserve">código fuente de </w:t>
+      </w:r>
+      <w:proofErr w:type="spellStart"/>
+      <w:r>
+        <w:rPr>
+          <w:sz w:val="22"/>
+          <w:szCs w:val="22"/>
+        </w:rPr>
+        <w:t>React</w:t>
+      </w:r>
+      <w:proofErr w:type="spellEnd"/>
+    </w:p>
+    <w:p>
+      <w:pPr>
+        <w:pStyle w:val="Prrafodelista"/>
+        <w:numPr>
+          <w:ilvl w:val="0"/>
+          <w:numId w:val="38"/>
+        </w:numPr>
+        <w:rPr>
+          <w:sz w:val="22"/>
+          <w:szCs w:val="22"/>
+        </w:rPr>
+      </w:pPr>
+      <w:r>
+        <w:rPr>
+          <w:sz w:val="22"/>
+          <w:szCs w:val="22"/>
+        </w:rPr>
+        <w:t xml:space="preserve">El directorio </w:t>
+      </w:r>
+      <w:r>
+        <w:rPr>
+          <w:b/>
+          <w:bCs/>
+          <w:sz w:val="22"/>
+          <w:szCs w:val="22"/>
+        </w:rPr>
+        <w:t>“</w:t>
+      </w:r>
+      <w:proofErr w:type="spellStart"/>
+      <w:r>
+        <w:rPr>
+          <w:b/>
+          <w:bCs/>
+          <w:sz w:val="22"/>
+          <w:szCs w:val="22"/>
+        </w:rPr>
+        <w:t>public</w:t>
+      </w:r>
+      <w:proofErr w:type="spellEnd"/>
+      <w:r>
+        <w:rPr>
+          <w:b/>
+          <w:bCs/>
+          <w:sz w:val="22"/>
+          <w:szCs w:val="22"/>
+        </w:rPr>
+        <w:t>/”</w:t>
+      </w:r>
+      <w:r>
+        <w:rPr>
+          <w:sz w:val="22"/>
+          <w:szCs w:val="22"/>
+        </w:rPr>
+        <w:t>: donde se encuentran los archivos estáticos accesibles públicamente.</w:t>
+      </w:r>
+    </w:p>
+    <w:p>
+      <w:pPr>
+        <w:pStyle w:val="Prrafodelista"/>
+        <w:numPr>
+          <w:ilvl w:val="0"/>
+          <w:numId w:val="38"/>
+        </w:numPr>
+        <w:rPr>
+          <w:sz w:val="22"/>
+          <w:szCs w:val="22"/>
+        </w:rPr>
+      </w:pPr>
+      <w:r>
+        <w:rPr>
+          <w:sz w:val="22"/>
+          <w:szCs w:val="22"/>
+        </w:rPr>
+        <w:t xml:space="preserve">El directoria </w:t>
+      </w:r>
+      <w:r>
+        <w:rPr>
+          <w:b/>
+          <w:bCs/>
+          <w:sz w:val="22"/>
+          <w:szCs w:val="22"/>
+        </w:rPr>
+        <w:t>“</w:t>
+      </w:r>
+      <w:proofErr w:type="spellStart"/>
+      <w:r>
+        <w:rPr>
+          <w:b/>
+          <w:bCs/>
+          <w:sz w:val="22"/>
+          <w:szCs w:val="22"/>
+        </w:rPr>
+        <w:t>node_modules</w:t>
+      </w:r>
+      <w:proofErr w:type="spellEnd"/>
+      <w:r>
+        <w:rPr>
+          <w:b/>
+          <w:bCs/>
+          <w:sz w:val="22"/>
+          <w:szCs w:val="22"/>
+        </w:rPr>
+        <w:t>/”</w:t>
+      </w:r>
+      <w:r>
+        <w:rPr>
+          <w:sz w:val="22"/>
+          <w:szCs w:val="22"/>
+        </w:rPr>
+        <w:t>: almacena todas las dependencias instaladas.</w:t>
+      </w:r>
+    </w:p>
+    <w:p>
+      <w:pPr>
+        <w:pStyle w:val="Prrafodelista"/>
+        <w:ind w:left="504" w:hanging="504"/>
+        <w:rPr>
+          <w:bCs/>
+          <w:sz w:val="22"/>
+          <w:szCs w:val="22"/>
+        </w:rPr>
+      </w:pPr>
+      <w:r>
+        <w:rPr>
+          <w:bCs/>
+          <w:sz w:val="22"/>
+          <w:szCs w:val="22"/>
+        </w:rPr>
+        <w:t>Otros de los componentes más relevantes son</w:t>
+      </w:r>
+      <w:r>
+        <w:rPr>
+          <w:bCs/>
+          <w:sz w:val="22"/>
+          <w:szCs w:val="22"/>
+        </w:rPr>
+        <w:t xml:space="preserve">: </w:t>
+      </w:r>
+    </w:p>
+    <w:p>
+      <w:pPr>
+        <w:pStyle w:val="Prrafodelista"/>
+        <w:numPr>
+          <w:ilvl w:val="0"/>
+          <w:numId w:val="39"/>
+        </w:numPr>
+        <w:rPr>
+          <w:b/>
+          <w:sz w:val="22"/>
+          <w:szCs w:val="22"/>
+        </w:rPr>
+      </w:pPr>
+      <w:r>
+        <w:rPr>
+          <w:bCs/>
+          <w:sz w:val="22"/>
+          <w:szCs w:val="22"/>
+        </w:rPr>
+        <w:t xml:space="preserve">El </w:t>
+      </w:r>
+      <w:r>
+        <w:rPr>
+          <w:b/>
+          <w:sz w:val="22"/>
+          <w:szCs w:val="22"/>
+        </w:rPr>
+        <w:t xml:space="preserve">fichero App.js </w:t>
+      </w:r>
+      <w:r>
+        <w:rPr>
+          <w:bCs/>
+          <w:sz w:val="22"/>
+          <w:szCs w:val="22"/>
+        </w:rPr>
+        <w:t>que es el</w:t>
+      </w:r>
+      <w:r>
+        <w:rPr>
+          <w:b/>
+          <w:sz w:val="22"/>
+          <w:szCs w:val="22"/>
+        </w:rPr>
+        <w:t xml:space="preserve"> </w:t>
+      </w:r>
+      <w:r>
+        <w:rPr>
+          <w:sz w:val="22"/>
+          <w:szCs w:val="22"/>
+        </w:rPr>
+        <w:t>Componente raíz donde se definen rutas y proveen contextos.</w:t>
+      </w:r>
+    </w:p>
+    <w:p>
+      <w:pPr>
+        <w:pStyle w:val="Prrafodelista"/>
+        <w:numPr>
+          <w:ilvl w:val="0"/>
+          <w:numId w:val="39"/>
+        </w:numPr>
+        <w:rPr>
+          <w:b/>
+          <w:sz w:val="22"/>
+          <w:szCs w:val="22"/>
+        </w:rPr>
+      </w:pPr>
+      <w:r>
+        <w:rPr>
+          <w:sz w:val="22"/>
+          <w:szCs w:val="22"/>
+        </w:rPr>
+        <w:t xml:space="preserve">El </w:t>
+      </w:r>
+      <w:r>
+        <w:rPr>
+          <w:b/>
+          <w:bCs/>
+          <w:sz w:val="22"/>
+          <w:szCs w:val="22"/>
+        </w:rPr>
+        <w:t>fichero index.js</w:t>
+      </w:r>
+      <w:r>
+        <w:rPr>
+          <w:sz w:val="22"/>
+          <w:szCs w:val="22"/>
+        </w:rPr>
+        <w:t xml:space="preserve"> </w:t>
+      </w:r>
+      <w:r>
+        <w:rPr>
+          <w:sz w:val="22"/>
+          <w:szCs w:val="22"/>
+        </w:rPr>
+        <w:t xml:space="preserve"> </w:t>
+      </w:r>
+      <w:r>
+        <w:rPr>
+          <w:sz w:val="22"/>
+          <w:szCs w:val="22"/>
+        </w:rPr>
+        <w:t xml:space="preserve"> es el punto de entrad</w:t>
+      </w:r>
+      <w:r>
+        <w:rPr>
+          <w:sz w:val="22"/>
+          <w:szCs w:val="22"/>
+        </w:rPr>
+        <w:t>a,</w:t>
+      </w:r>
+      <w:r>
+        <w:rPr>
+          <w:sz w:val="22"/>
+          <w:szCs w:val="22"/>
+        </w:rPr>
+        <w:t xml:space="preserve"> renderiza </w:t>
+      </w:r>
+      <w:r>
+        <w:rPr>
+          <w:rStyle w:val="CdigoHTML"/>
+          <w:rFonts w:ascii="Arial" w:eastAsiaTheme="minorHAnsi" w:hAnsi="Arial" w:cs="Arial"/>
+          <w:sz w:val="22"/>
+          <w:szCs w:val="22"/>
+        </w:rPr>
+        <w:t>App.js</w:t>
+      </w:r>
+      <w:r>
+        <w:rPr>
+          <w:sz w:val="22"/>
+          <w:szCs w:val="22"/>
+        </w:rPr>
+        <w:t xml:space="preserve"> en el DOM.</w:t>
+      </w:r>
+    </w:p>
+    <w:p>
+      <w:pPr>
+        <w:pStyle w:val="Prrafodelista"/>
+        <w:numPr>
+          <w:ilvl w:val="0"/>
+          <w:numId w:val="39"/>
+        </w:numPr>
+        <w:rPr>
+          <w:rStyle w:val="CdigoHTML"/>
+          <w:rFonts w:ascii="Arial" w:eastAsiaTheme="minorHAnsi" w:hAnsi="Arial" w:cs="Arial"/>
+          <w:b/>
+          <w:sz w:val="22"/>
+          <w:szCs w:val="22"/>
+        </w:rPr>
+      </w:pPr>
+      <w:r>
+        <w:rPr>
+          <w:sz w:val="22"/>
+          <w:szCs w:val="22"/>
+        </w:rPr>
+        <w:t xml:space="preserve">El </w:t>
+      </w:r>
+      <w:r>
+        <w:rPr>
+          <w:b/>
+          <w:bCs/>
+          <w:sz w:val="22"/>
+          <w:szCs w:val="22"/>
+        </w:rPr>
+        <w:t>fichero routes.js</w:t>
+      </w:r>
+      <w:r>
+        <w:rPr>
+          <w:sz w:val="22"/>
+          <w:szCs w:val="22"/>
+        </w:rPr>
+        <w:t xml:space="preserve"> es el que centraliza la configuración de rutas usando </w:t>
+      </w:r>
+      <w:proofErr w:type="spellStart"/>
+      <w:r>
+        <w:rPr>
+          <w:rStyle w:val="CdigoHTML"/>
+          <w:rFonts w:ascii="Arial" w:eastAsiaTheme="minorHAnsi" w:hAnsi="Arial" w:cs="Arial"/>
+          <w:sz w:val="22"/>
+          <w:szCs w:val="22"/>
+        </w:rPr>
+        <w:t>react</w:t>
+      </w:r>
+      <w:proofErr w:type="spellEnd"/>
+      <w:r>
+        <w:rPr>
+          <w:rStyle w:val="CdigoHTML"/>
+          <w:rFonts w:ascii="Arial" w:eastAsiaTheme="minorHAnsi" w:hAnsi="Arial" w:cs="Arial"/>
+          <w:sz w:val="22"/>
+          <w:szCs w:val="22"/>
+        </w:rPr>
+        <w:t>-</w:t>
+      </w:r>
+      <w:proofErr w:type="spellStart"/>
+      <w:r>
+        <w:rPr>
+          <w:rStyle w:val="CdigoHTML"/>
+          <w:rFonts w:ascii="Arial" w:eastAsiaTheme="minorHAnsi" w:hAnsi="Arial" w:cs="Arial"/>
+          <w:sz w:val="22"/>
+          <w:szCs w:val="22"/>
+        </w:rPr>
+        <w:t>router</w:t>
+      </w:r>
+      <w:proofErr w:type="spellEnd"/>
+      <w:r>
+        <w:rPr>
+          <w:rStyle w:val="CdigoHTML"/>
+          <w:rFonts w:ascii="Arial" w:eastAsiaTheme="minorHAnsi" w:hAnsi="Arial" w:cs="Arial"/>
+          <w:sz w:val="22"/>
+          <w:szCs w:val="22"/>
+        </w:rPr>
+        <w:t>-dom</w:t>
+      </w:r>
+    </w:p>
+    <w:p>
+      <w:pPr>
+        <w:pStyle w:val="Prrafodelista"/>
+        <w:numPr>
+          <w:ilvl w:val="0"/>
+          <w:numId w:val="39"/>
+        </w:numPr>
+        <w:rPr>
+          <w:bCs/>
+          <w:sz w:val="22"/>
+          <w:szCs w:val="22"/>
+        </w:rPr>
+      </w:pPr>
+      <w:r>
+        <w:rPr>
+          <w:bCs/>
+          <w:sz w:val="22"/>
+          <w:szCs w:val="22"/>
+        </w:rPr>
+        <w:lastRenderedPageBreak/>
+        <w:t>E</w:t>
+      </w:r>
+      <w:r>
+        <w:rPr>
+          <w:b/>
+          <w:sz w:val="22"/>
+          <w:szCs w:val="22"/>
+        </w:rPr>
+        <w:t xml:space="preserve">l </w:t>
+      </w:r>
+      <w:proofErr w:type="gramStart"/>
+      <w:r>
+        <w:rPr>
+          <w:b/>
+          <w:sz w:val="22"/>
+          <w:szCs w:val="22"/>
+        </w:rPr>
+        <w:t>fichero  .</w:t>
+      </w:r>
+      <w:proofErr w:type="spellStart"/>
+      <w:proofErr w:type="gramEnd"/>
+      <w:r>
+        <w:rPr>
+          <w:b/>
+          <w:sz w:val="22"/>
+          <w:szCs w:val="22"/>
+        </w:rPr>
+        <w:t>env.example</w:t>
+      </w:r>
+      <w:proofErr w:type="spellEnd"/>
+      <w:r>
+        <w:rPr>
+          <w:b/>
+          <w:sz w:val="22"/>
+          <w:szCs w:val="22"/>
+        </w:rPr>
+        <w:t xml:space="preserve"> </w:t>
+      </w:r>
+      <w:r>
+        <w:rPr>
+          <w:bCs/>
+          <w:sz w:val="22"/>
+          <w:szCs w:val="22"/>
+        </w:rPr>
+        <w:t xml:space="preserve">en él está contenida la configuración para conectarnos a nuestro </w:t>
+      </w:r>
+      <w:proofErr w:type="spellStart"/>
+      <w:r>
+        <w:rPr>
+          <w:bCs/>
+          <w:sz w:val="22"/>
+          <w:szCs w:val="22"/>
+        </w:rPr>
+        <w:t>Backend</w:t>
+      </w:r>
+      <w:proofErr w:type="spellEnd"/>
+      <w:r>
+        <w:rPr>
+          <w:bCs/>
+          <w:sz w:val="22"/>
+          <w:szCs w:val="22"/>
+        </w:rPr>
+        <w:t xml:space="preserve"> (Figura 3.2)</w:t>
+      </w:r>
+    </w:p>
+    <w:p>
+      <w:pPr>
+        <w:pStyle w:val="Prrafodelista"/>
+        <w:ind w:left="504" w:hanging="504"/>
+        <w:rPr>
+          <w:bCs/>
+          <w:sz w:val="22"/>
+          <w:szCs w:val="22"/>
+        </w:rPr>
+      </w:pPr>
+      <w:r>
+        <w:rPr>
+          <w:bCs/>
+          <w:sz w:val="22"/>
+          <w:szCs w:val="22"/>
+        </w:rPr>
+        <w:t xml:space="preserve"> </w:t>
+      </w:r>
+      <w:r>
+        <w:rPr>
+          <w:bCs/>
+          <w:noProof/>
+          <w:sz w:val="22"/>
+          <w:szCs w:val="22"/>
+        </w:rPr>
+        <w:drawing>
+          <wp:inline distT="0" distB="0" distL="0" distR="0" wp14:anchorId="64C9C63C" wp14:editId="527A8033">
+            <wp:extent cx="4015740" cy="2066290"/>
+            <wp:effectExtent l="0" t="0" r="3810" b="0"/>
+            <wp:docPr id="13" name="Imagen 13"/>
+            <wp:cNvGraphicFramePr>
+              <a:graphicFrameLocks xmlns:a="http://schemas.openxmlformats.org/drawingml/2006/main" noChangeAspect="1"/>
+            </wp:cNvGraphicFramePr>
+            <a:graphic xmlns:a="http://schemas.openxmlformats.org/drawingml/2006/main">
+              <a:graphicData uri="http://schemas.openxmlformats.org/drawingml/2006/picture">
+                <pic:pic xmlns:pic="http://schemas.openxmlformats.org/drawingml/2006/picture">
+                  <pic:nvPicPr>
+                    <pic:cNvPr id="0" name="Picture 6"/>
+                    <pic:cNvPicPr>
+                      <a:picLocks noChangeAspect="1" noChangeArrowheads="1"/>
+                    </pic:cNvPicPr>
+                  </pic:nvPicPr>
+                  <pic:blipFill>
+                    <a:blip r:embed="rId75">
+                      <a:extLst>
+                        <a:ext uri="{28A0092B-C50C-407E-A947-70E740481C1C}">
+                          <a14:useLocalDpi xmlns:a14="http://schemas.microsoft.com/office/drawing/2010/main" val="0"/>
+                        </a:ext>
+                      </a:extLst>
+                    </a:blip>
+                    <a:srcRect/>
+                    <a:stretch>
+                      <a:fillRect/>
+                    </a:stretch>
+                  </pic:blipFill>
+                  <pic:spPr bwMode="auto">
+                    <a:xfrm>
+                      <a:off x="0" y="0"/>
+                      <a:ext cx="4015740" cy="2066290"/>
+                    </a:xfrm>
+                    <a:prstGeom prst="rect">
+                      <a:avLst/>
+                    </a:prstGeom>
+                    <a:noFill/>
+                    <a:ln>
+                      <a:noFill/>
+                    </a:ln>
+                  </pic:spPr>
+                </pic:pic>
+              </a:graphicData>
+            </a:graphic>
+          </wp:inline>
+        </w:drawing>
+      </w:r>
+      <w:r>
+        <w:rPr>
+          <w:bCs/>
+          <w:sz w:val="22"/>
+          <w:szCs w:val="22"/>
+        </w:rPr>
+        <w:t xml:space="preserve">          </w:t>
+      </w:r>
+    </w:p>
+    <w:p>
+      <w:pPr>
+        <w:pStyle w:val="Prrafodelista"/>
+        <w:ind w:left="504" w:hanging="504"/>
+        <w:rPr>
+          <w:bCs/>
+          <w:sz w:val="18"/>
+          <w:szCs w:val="18"/>
+        </w:rPr>
+      </w:pPr>
+      <w:r>
+        <w:rPr>
+          <w:bCs/>
+          <w:sz w:val="18"/>
+          <w:szCs w:val="18"/>
+        </w:rPr>
+        <w:t xml:space="preserve">Figura 3.1 Estructura de los </w:t>
+      </w:r>
+      <w:r>
+        <w:rPr>
+          <w:bCs/>
+          <w:sz w:val="18"/>
+          <w:szCs w:val="18"/>
+        </w:rPr>
+        <w:t>d</w:t>
+      </w:r>
+      <w:r>
+        <w:rPr>
+          <w:bCs/>
+          <w:sz w:val="18"/>
+          <w:szCs w:val="18"/>
+        </w:rPr>
+        <w:t>irectorio</w:t>
+      </w:r>
+      <w:r>
+        <w:rPr>
+          <w:bCs/>
+          <w:sz w:val="18"/>
+          <w:szCs w:val="18"/>
+        </w:rPr>
+        <w:t>s</w:t>
+      </w:r>
+      <w:r>
+        <w:rPr>
+          <w:bCs/>
+          <w:sz w:val="18"/>
+          <w:szCs w:val="18"/>
+        </w:rPr>
+        <w:t xml:space="preserve"> del </w:t>
+      </w:r>
+      <w:proofErr w:type="spellStart"/>
+      <w:r>
+        <w:rPr>
+          <w:bCs/>
+          <w:sz w:val="18"/>
+          <w:szCs w:val="18"/>
+        </w:rPr>
+        <w:t>Frontend</w:t>
+      </w:r>
+      <w:proofErr w:type="spellEnd"/>
+    </w:p>
+    <w:p>
+      <w:pPr>
+        <w:pStyle w:val="Prrafodelista"/>
+        <w:ind w:left="504" w:hanging="504"/>
+        <w:rPr>
+          <w:bCs/>
+          <w:sz w:val="22"/>
+          <w:szCs w:val="22"/>
+        </w:rPr>
+      </w:pPr>
+    </w:p>
+    <w:p>
+      <w:pPr>
+        <w:pStyle w:val="Prrafodelista"/>
+        <w:ind w:left="504" w:hanging="504"/>
+        <w:rPr>
+          <w:bCs/>
+          <w:sz w:val="22"/>
+          <w:szCs w:val="22"/>
+        </w:rPr>
+      </w:pPr>
+      <w:r>
+        <w:rPr>
+          <w:bCs/>
+          <w:noProof/>
+          <w:sz w:val="22"/>
+          <w:szCs w:val="22"/>
+        </w:rPr>
+        <w:drawing>
+          <wp:inline distT="0" distB="0" distL="0" distR="0" wp14:anchorId="55B4CA6C" wp14:editId="7988938A">
+            <wp:extent cx="5747385" cy="1531620"/>
+            <wp:effectExtent l="0" t="0" r="5715" b="0"/>
+            <wp:docPr id="14" name="Imagen 14"/>
+            <wp:cNvGraphicFramePr>
+              <a:graphicFrameLocks xmlns:a="http://schemas.openxmlformats.org/drawingml/2006/main" noChangeAspect="1"/>
+            </wp:cNvGraphicFramePr>
+            <a:graphic xmlns:a="http://schemas.openxmlformats.org/drawingml/2006/main">
+              <a:graphicData uri="http://schemas.openxmlformats.org/drawingml/2006/picture">
+                <pic:pic xmlns:pic="http://schemas.openxmlformats.org/drawingml/2006/picture">
+                  <pic:nvPicPr>
+                    <pic:cNvPr id="0" name="Picture 7"/>
+                    <pic:cNvPicPr>
+                      <a:picLocks noChangeAspect="1" noChangeArrowheads="1"/>
+                    </pic:cNvPicPr>
+                  </pic:nvPicPr>
+                  <pic:blipFill>
+                    <a:blip r:embed="rId76">
+                      <a:extLst>
+                        <a:ext uri="{28A0092B-C50C-407E-A947-70E740481C1C}">
+                          <a14:useLocalDpi xmlns:a14="http://schemas.microsoft.com/office/drawing/2010/main" val="0"/>
+                        </a:ext>
+                      </a:extLst>
+                    </a:blip>
+                    <a:srcRect/>
+                    <a:stretch>
+                      <a:fillRect/>
+                    </a:stretch>
+                  </pic:blipFill>
+                  <pic:spPr bwMode="auto">
+                    <a:xfrm>
+                      <a:off x="0" y="0"/>
+                      <a:ext cx="5747385" cy="1531620"/>
+                    </a:xfrm>
+                    <a:prstGeom prst="rect">
+                      <a:avLst/>
+                    </a:prstGeom>
+                    <a:noFill/>
+                    <a:ln>
+                      <a:noFill/>
+                    </a:ln>
+                  </pic:spPr>
+                </pic:pic>
+              </a:graphicData>
+            </a:graphic>
+          </wp:inline>
+        </w:drawing>
+      </w:r>
+    </w:p>
+    <w:p>
+      <w:pPr>
+        <w:pStyle w:val="Prrafodelista"/>
+        <w:ind w:left="504" w:hanging="504"/>
+        <w:rPr>
+          <w:bCs/>
+          <w:sz w:val="18"/>
+          <w:szCs w:val="18"/>
+        </w:rPr>
+      </w:pPr>
+      <w:r>
+        <w:rPr>
+          <w:bCs/>
+          <w:sz w:val="18"/>
+          <w:szCs w:val="18"/>
+        </w:rPr>
+        <w:t xml:space="preserve">Figura 3.2 </w:t>
+      </w:r>
+      <w:proofErr w:type="gramStart"/>
+      <w:r>
+        <w:rPr>
+          <w:bCs/>
+          <w:sz w:val="18"/>
+          <w:szCs w:val="18"/>
+        </w:rPr>
+        <w:t>Fichero .</w:t>
+      </w:r>
+      <w:proofErr w:type="spellStart"/>
+      <w:r>
+        <w:rPr>
+          <w:bCs/>
+          <w:sz w:val="18"/>
+          <w:szCs w:val="18"/>
+        </w:rPr>
+        <w:t>env</w:t>
+      </w:r>
+      <w:proofErr w:type="gramEnd"/>
+      <w:r>
+        <w:rPr>
+          <w:bCs/>
+          <w:sz w:val="18"/>
+          <w:szCs w:val="18"/>
+        </w:rPr>
+        <w:t>.example</w:t>
+      </w:r>
+      <w:proofErr w:type="spellEnd"/>
+    </w:p>
+    <w:p>
+      <w:pPr>
+        <w:pStyle w:val="Prrafodelista"/>
+        <w:ind w:left="504" w:hanging="504"/>
+        <w:rPr>
+          <w:bCs/>
+          <w:sz w:val="22"/>
+          <w:szCs w:val="22"/>
+        </w:rPr>
+      </w:pPr>
+    </w:p>
+    <w:p>
+      <w:pPr>
         <w:pStyle w:val="Ttulo3"/>
         <w:numPr>
           <w:ilvl w:val="2"/>
           <w:numId w:val="40"/>
         </w:numPr>
+        <w:ind w:left="2160" w:hanging="360"/>
       </w:pPr>
       <w:r>
         <w:t xml:space="preserve">Directorio </w:t>
@@ -18500,19 +20261,24 @@
     </w:p>
     <w:p>
       <w:pPr>
-        <w:jc w:val="left"/>
-        <w:rPr>
-          <w:b/>
-          <w:bCs/>
+        <w:rPr>
           <w:color w:val="auto"/>
         </w:rPr>
       </w:pPr>
+    </w:p>
+    <w:p>
+      <w:pPr>
+        <w:rPr>
+          <w:color w:val="auto"/>
+        </w:rPr>
+      </w:pPr>
       <w:r>
         <w:rPr>
           <w:noProof/>
         </w:rPr>
+        <w:lastRenderedPageBreak/>
         <w:drawing>
-          <wp:inline distT="0" distB="0" distL="0" distR="0" wp14:anchorId="1AF98A33" wp14:editId="723775CE">
+          <wp:inline distT="0" distB="0" distL="0" distR="0" wp14:anchorId="10F4F90C" wp14:editId="210307DE">
             <wp:extent cx="2743200" cy="2657335"/>
             <wp:effectExtent l="0" t="0" r="0" b="0"/>
             <wp:docPr id="10" name="Imagen 10"/>
@@ -18529,7 +20295,7 @@
                     </pic:cNvPicPr>
                   </pic:nvPicPr>
                   <pic:blipFill>
-                    <a:blip r:embed="rId75">
+                    <a:blip r:embed="rId77">
                       <a:extLst>
                         <a:ext uri="{28A0092B-C50C-407E-A947-70E740481C1C}">
                           <a14:useLocalDpi xmlns:a14="http://schemas.microsoft.com/office/drawing/2010/main" val="0"/>
@@ -18609,1155 +20375,15 @@
     </w:p>
     <w:p>
       <w:pPr>
-        <w:pStyle w:val="Ttulo4"/>
-        <w:jc w:val="both"/>
-        <w:rPr>
-          <w:rFonts w:ascii="Arial" w:hAnsi="Arial" w:cs="Arial"/>
-          <w:b w:val="0"/>
-          <w:bCs/>
-          <w:color w:val="auto"/>
-          <w:sz w:val="22"/>
-        </w:rPr>
-      </w:pPr>
-      <w:proofErr w:type="spellStart"/>
-      <w:r>
-        <w:rPr>
-          <w:rFonts w:ascii="Arial" w:hAnsi="Arial" w:cs="Arial"/>
-          <w:b w:val="0"/>
-          <w:bCs/>
-          <w:color w:val="auto"/>
-          <w:sz w:val="22"/>
-        </w:rPr>
-        <w:lastRenderedPageBreak/>
-        <w:t>Backend</w:t>
-      </w:r>
-      <w:proofErr w:type="spellEnd"/>
-      <w:r>
-        <w:rPr>
-          <w:rFonts w:ascii="Arial" w:hAnsi="Arial" w:cs="Arial"/>
-          <w:b w:val="0"/>
-          <w:bCs/>
-          <w:color w:val="auto"/>
-          <w:sz w:val="22"/>
-        </w:rPr>
-        <w:t xml:space="preserve"> (</w:t>
-      </w:r>
-      <w:proofErr w:type="spellStart"/>
-      <w:r>
-        <w:rPr>
-          <w:rFonts w:ascii="Arial" w:hAnsi="Arial" w:cs="Arial"/>
-          <w:b w:val="0"/>
-          <w:bCs/>
-          <w:color w:val="auto"/>
-          <w:sz w:val="22"/>
-        </w:rPr>
-        <w:t>NestJS</w:t>
-      </w:r>
-      <w:proofErr w:type="spellEnd"/>
-      <w:r>
-        <w:rPr>
-          <w:rFonts w:ascii="Arial" w:hAnsi="Arial" w:cs="Arial"/>
-          <w:b w:val="0"/>
-          <w:bCs/>
-          <w:color w:val="auto"/>
-          <w:sz w:val="22"/>
-        </w:rPr>
-        <w:t>)</w:t>
-      </w:r>
-    </w:p>
-    <w:p>
-      <w:pPr>
-        <w:pStyle w:val="ds-markdown-paragraph"/>
-        <w:jc w:val="both"/>
-        <w:rPr>
-          <w:rFonts w:ascii="Arial" w:hAnsi="Arial" w:cs="Arial"/>
-          <w:bCs/>
-          <w:sz w:val="22"/>
-          <w:szCs w:val="22"/>
-        </w:rPr>
-      </w:pPr>
-      <w:r>
-        <w:rPr>
-          <w:rFonts w:ascii="Arial" w:hAnsi="Arial" w:cs="Arial"/>
-          <w:bCs/>
-          <w:sz w:val="22"/>
-          <w:szCs w:val="22"/>
-        </w:rPr>
-        <w:t xml:space="preserve">El </w:t>
-      </w:r>
-      <w:proofErr w:type="spellStart"/>
-      <w:r>
-        <w:rPr>
-          <w:rFonts w:ascii="Arial" w:hAnsi="Arial" w:cs="Arial"/>
-          <w:bCs/>
-          <w:sz w:val="22"/>
-          <w:szCs w:val="22"/>
-        </w:rPr>
-        <w:t>backend</w:t>
-      </w:r>
-      <w:proofErr w:type="spellEnd"/>
-      <w:r>
-        <w:rPr>
-          <w:rFonts w:ascii="Arial" w:hAnsi="Arial" w:cs="Arial"/>
-          <w:bCs/>
-          <w:sz w:val="22"/>
-          <w:szCs w:val="22"/>
-        </w:rPr>
-        <w:t xml:space="preserve"> sigue una arquitectura por capas con:</w:t>
-      </w:r>
-    </w:p>
-    <w:p>
-      <w:pPr>
-        <w:pStyle w:val="ds-markdown-paragraph"/>
-        <w:numPr>
-          <w:ilvl w:val="0"/>
-          <w:numId w:val="37"/>
-        </w:numPr>
-        <w:jc w:val="both"/>
-        <w:rPr>
-          <w:rFonts w:ascii="Arial" w:hAnsi="Arial" w:cs="Arial"/>
-          <w:bCs/>
-          <w:sz w:val="22"/>
-          <w:szCs w:val="22"/>
-        </w:rPr>
-      </w:pPr>
-      <w:r>
-        <w:rPr>
-          <w:rStyle w:val="Textoennegrita"/>
-          <w:rFonts w:ascii="Arial" w:eastAsia="Arial" w:hAnsi="Arial" w:cs="Arial"/>
-          <w:b w:val="0"/>
-          <w:sz w:val="22"/>
-          <w:szCs w:val="22"/>
-        </w:rPr>
-        <w:t>Módulos</w:t>
-      </w:r>
-      <w:r>
-        <w:rPr>
-          <w:rFonts w:ascii="Arial" w:hAnsi="Arial" w:cs="Arial"/>
-          <w:bCs/>
-          <w:sz w:val="22"/>
-          <w:szCs w:val="22"/>
-        </w:rPr>
-        <w:t>: Agrupación lógica de funcionalidades</w:t>
-      </w:r>
-    </w:p>
-    <w:p>
-      <w:pPr>
-        <w:pStyle w:val="ds-markdown-paragraph"/>
-        <w:numPr>
-          <w:ilvl w:val="0"/>
-          <w:numId w:val="37"/>
-        </w:numPr>
-        <w:jc w:val="both"/>
-        <w:rPr>
-          <w:rFonts w:ascii="Arial" w:hAnsi="Arial" w:cs="Arial"/>
-          <w:bCs/>
-          <w:sz w:val="22"/>
-          <w:szCs w:val="22"/>
-        </w:rPr>
-      </w:pPr>
-      <w:r>
-        <w:rPr>
-          <w:rStyle w:val="Textoennegrita"/>
-          <w:rFonts w:ascii="Arial" w:eastAsia="Arial" w:hAnsi="Arial" w:cs="Arial"/>
-          <w:b w:val="0"/>
-          <w:sz w:val="22"/>
-          <w:szCs w:val="22"/>
-        </w:rPr>
-        <w:t>Controladores</w:t>
-      </w:r>
-      <w:r>
-        <w:rPr>
-          <w:rFonts w:ascii="Arial" w:hAnsi="Arial" w:cs="Arial"/>
-          <w:bCs/>
-          <w:sz w:val="22"/>
-          <w:szCs w:val="22"/>
-        </w:rPr>
-        <w:t>: Manejo de peticiones HTTP</w:t>
-      </w:r>
-    </w:p>
-    <w:p>
-      <w:pPr>
-        <w:pStyle w:val="ds-markdown-paragraph"/>
-        <w:numPr>
-          <w:ilvl w:val="0"/>
-          <w:numId w:val="37"/>
-        </w:numPr>
-        <w:jc w:val="both"/>
-        <w:rPr>
-          <w:rFonts w:ascii="Arial" w:hAnsi="Arial" w:cs="Arial"/>
-          <w:bCs/>
-          <w:sz w:val="22"/>
-          <w:szCs w:val="22"/>
-        </w:rPr>
-      </w:pPr>
-      <w:r>
-        <w:rPr>
-          <w:rStyle w:val="Textoennegrita"/>
-          <w:rFonts w:ascii="Arial" w:eastAsia="Arial" w:hAnsi="Arial" w:cs="Arial"/>
-          <w:b w:val="0"/>
-          <w:sz w:val="22"/>
-          <w:szCs w:val="22"/>
-        </w:rPr>
-        <w:t>Servicios</w:t>
-      </w:r>
-      <w:r>
-        <w:rPr>
-          <w:rFonts w:ascii="Arial" w:hAnsi="Arial" w:cs="Arial"/>
-          <w:bCs/>
-          <w:sz w:val="22"/>
-          <w:szCs w:val="22"/>
-        </w:rPr>
-        <w:t>: Lógica de negocio</w:t>
-      </w:r>
-    </w:p>
-    <w:p>
-      <w:pPr>
-        <w:pStyle w:val="ds-markdown-paragraph"/>
-        <w:numPr>
-          <w:ilvl w:val="0"/>
-          <w:numId w:val="37"/>
-        </w:numPr>
-        <w:jc w:val="both"/>
-        <w:rPr>
-          <w:rFonts w:ascii="Arial" w:hAnsi="Arial" w:cs="Arial"/>
-          <w:bCs/>
-          <w:sz w:val="22"/>
-          <w:szCs w:val="22"/>
-        </w:rPr>
-      </w:pPr>
-      <w:r>
-        <w:rPr>
-          <w:rStyle w:val="Textoennegrita"/>
-          <w:rFonts w:ascii="Arial" w:eastAsia="Arial" w:hAnsi="Arial" w:cs="Arial"/>
-          <w:b w:val="0"/>
-          <w:sz w:val="22"/>
-          <w:szCs w:val="22"/>
-        </w:rPr>
-        <w:t>Repositorios</w:t>
-      </w:r>
-      <w:r>
-        <w:rPr>
-          <w:rFonts w:ascii="Arial" w:hAnsi="Arial" w:cs="Arial"/>
-          <w:bCs/>
-          <w:sz w:val="22"/>
-          <w:szCs w:val="22"/>
-        </w:rPr>
-        <w:t>: Acceso a datos</w:t>
-      </w:r>
-    </w:p>
-    <w:p>
-      <w:pPr>
-        <w:pStyle w:val="ds-markdown-paragraph"/>
-        <w:jc w:val="both"/>
-        <w:rPr>
-          <w:rFonts w:ascii="Arial" w:hAnsi="Arial" w:cs="Arial"/>
-          <w:bCs/>
-          <w:sz w:val="22"/>
-          <w:szCs w:val="22"/>
-        </w:rPr>
-      </w:pPr>
-      <w:r>
-        <w:rPr>
-          <w:rFonts w:ascii="Arial" w:hAnsi="Arial" w:cs="Arial"/>
-          <w:bCs/>
-          <w:sz w:val="22"/>
-          <w:szCs w:val="22"/>
-        </w:rPr>
-        <w:t xml:space="preserve">La aplicación </w:t>
-      </w:r>
-      <w:proofErr w:type="spellStart"/>
-      <w:r>
-        <w:rPr>
-          <w:rFonts w:ascii="Arial" w:hAnsi="Arial" w:cs="Arial"/>
-          <w:b/>
-          <w:sz w:val="22"/>
-          <w:szCs w:val="22"/>
-        </w:rPr>
-        <w:t>MoreCoast</w:t>
-      </w:r>
-      <w:proofErr w:type="spellEnd"/>
-      <w:r>
-        <w:rPr>
-          <w:rFonts w:ascii="Arial" w:hAnsi="Arial" w:cs="Arial"/>
-          <w:b/>
-          <w:sz w:val="22"/>
-          <w:szCs w:val="22"/>
-        </w:rPr>
-        <w:t xml:space="preserve"> </w:t>
-      </w:r>
-      <w:r>
-        <w:rPr>
-          <w:rFonts w:ascii="Arial" w:hAnsi="Arial" w:cs="Arial"/>
-          <w:bCs/>
-          <w:sz w:val="22"/>
-          <w:szCs w:val="22"/>
-        </w:rPr>
-        <w:t>(Más Costas)</w:t>
-      </w:r>
-      <w:r>
-        <w:rPr>
-          <w:rFonts w:ascii="Arial" w:hAnsi="Arial" w:cs="Arial"/>
-          <w:bCs/>
-          <w:sz w:val="22"/>
-          <w:szCs w:val="22"/>
-        </w:rPr>
-        <w:t xml:space="preserve"> se desarrolla para la gestión de la información del cálculo del transporte de los sedimentos de la empresa GEOCUBA en la provincia Santiago de Cuba. La misma está compuesta por un conjunto de directorios</w:t>
-      </w:r>
-      <w:r>
-        <w:rPr>
-          <w:rFonts w:ascii="Arial" w:hAnsi="Arial" w:cs="Arial"/>
-          <w:bCs/>
-          <w:sz w:val="22"/>
-          <w:szCs w:val="22"/>
-        </w:rPr>
-        <w:t xml:space="preserve"> (Figura 3.1) </w:t>
-      </w:r>
-      <w:r>
-        <w:rPr>
-          <w:rFonts w:ascii="Arial" w:hAnsi="Arial" w:cs="Arial"/>
-          <w:bCs/>
-          <w:sz w:val="22"/>
-          <w:szCs w:val="22"/>
-        </w:rPr>
-        <w:t>de los cuales se destacan:</w:t>
-      </w:r>
-    </w:p>
-    <w:p>
-      <w:pPr>
-        <w:pStyle w:val="Prrafodelista"/>
-        <w:numPr>
-          <w:ilvl w:val="0"/>
-          <w:numId w:val="38"/>
-        </w:numPr>
-        <w:rPr>
-          <w:sz w:val="22"/>
-          <w:szCs w:val="22"/>
-        </w:rPr>
-      </w:pPr>
-      <w:r>
-        <w:rPr>
-          <w:bCs/>
-          <w:sz w:val="22"/>
-          <w:szCs w:val="22"/>
-        </w:rPr>
-        <w:t xml:space="preserve">El directorio </w:t>
-      </w:r>
-      <w:r>
-        <w:rPr>
-          <w:b/>
-          <w:sz w:val="22"/>
-          <w:szCs w:val="22"/>
-        </w:rPr>
-        <w:t>“</w:t>
-      </w:r>
-      <w:proofErr w:type="spellStart"/>
-      <w:r>
-        <w:rPr>
-          <w:b/>
-          <w:sz w:val="22"/>
-          <w:szCs w:val="22"/>
-        </w:rPr>
-        <w:t>src</w:t>
-      </w:r>
-      <w:proofErr w:type="spellEnd"/>
-      <w:r>
-        <w:rPr>
-          <w:b/>
-          <w:sz w:val="22"/>
-          <w:szCs w:val="22"/>
-        </w:rPr>
-        <w:t>/”</w:t>
-      </w:r>
-      <w:r>
-        <w:rPr>
-          <w:bCs/>
-          <w:sz w:val="22"/>
-          <w:szCs w:val="22"/>
-        </w:rPr>
-        <w:t xml:space="preserve">: </w:t>
-      </w:r>
-      <w:r>
-        <w:rPr>
-          <w:bCs/>
-          <w:sz w:val="22"/>
-          <w:szCs w:val="22"/>
-        </w:rPr>
-        <w:t xml:space="preserve">en él está </w:t>
-      </w:r>
-      <w:r>
-        <w:rPr>
-          <w:sz w:val="22"/>
-          <w:szCs w:val="22"/>
-        </w:rPr>
-        <w:t xml:space="preserve">código fuente de </w:t>
-      </w:r>
-      <w:proofErr w:type="spellStart"/>
-      <w:r>
-        <w:rPr>
-          <w:sz w:val="22"/>
-          <w:szCs w:val="22"/>
-        </w:rPr>
-        <w:t>React</w:t>
-      </w:r>
-      <w:proofErr w:type="spellEnd"/>
-    </w:p>
-    <w:p>
-      <w:pPr>
-        <w:pStyle w:val="Prrafodelista"/>
-        <w:numPr>
-          <w:ilvl w:val="0"/>
-          <w:numId w:val="38"/>
-        </w:numPr>
-        <w:rPr>
-          <w:sz w:val="22"/>
-          <w:szCs w:val="22"/>
-        </w:rPr>
-      </w:pPr>
-      <w:r>
-        <w:rPr>
-          <w:sz w:val="22"/>
-          <w:szCs w:val="22"/>
-        </w:rPr>
-        <w:t xml:space="preserve">El directorio </w:t>
-      </w:r>
-      <w:r>
-        <w:rPr>
-          <w:b/>
-          <w:bCs/>
-          <w:sz w:val="22"/>
-          <w:szCs w:val="22"/>
-        </w:rPr>
-        <w:t>“</w:t>
-      </w:r>
-      <w:proofErr w:type="spellStart"/>
-      <w:r>
-        <w:rPr>
-          <w:b/>
-          <w:bCs/>
-          <w:sz w:val="22"/>
-          <w:szCs w:val="22"/>
-        </w:rPr>
-        <w:t>public</w:t>
-      </w:r>
-      <w:proofErr w:type="spellEnd"/>
-      <w:r>
-        <w:rPr>
-          <w:b/>
-          <w:bCs/>
-          <w:sz w:val="22"/>
-          <w:szCs w:val="22"/>
-        </w:rPr>
-        <w:t>/”</w:t>
-      </w:r>
-      <w:r>
-        <w:rPr>
-          <w:sz w:val="22"/>
-          <w:szCs w:val="22"/>
-        </w:rPr>
-        <w:t>: donde se encuentran los archivos estáticos accesibles públicamente.</w:t>
-      </w:r>
-    </w:p>
-    <w:p>
-      <w:pPr>
-        <w:pStyle w:val="Prrafodelista"/>
-        <w:numPr>
-          <w:ilvl w:val="0"/>
-          <w:numId w:val="38"/>
-        </w:numPr>
-        <w:rPr>
-          <w:sz w:val="22"/>
-          <w:szCs w:val="22"/>
-        </w:rPr>
-      </w:pPr>
-      <w:r>
-        <w:rPr>
-          <w:sz w:val="22"/>
-          <w:szCs w:val="22"/>
-        </w:rPr>
-        <w:t xml:space="preserve">El directoria </w:t>
-      </w:r>
-      <w:r>
-        <w:rPr>
-          <w:b/>
-          <w:bCs/>
-          <w:sz w:val="22"/>
-          <w:szCs w:val="22"/>
-        </w:rPr>
-        <w:t>“</w:t>
-      </w:r>
-      <w:proofErr w:type="spellStart"/>
-      <w:r>
-        <w:rPr>
-          <w:b/>
-          <w:bCs/>
-          <w:sz w:val="22"/>
-          <w:szCs w:val="22"/>
-        </w:rPr>
-        <w:t>node_modules</w:t>
-      </w:r>
-      <w:proofErr w:type="spellEnd"/>
-      <w:r>
-        <w:rPr>
-          <w:b/>
-          <w:bCs/>
-          <w:sz w:val="22"/>
-          <w:szCs w:val="22"/>
-        </w:rPr>
-        <w:t>/”</w:t>
-      </w:r>
-      <w:r>
-        <w:rPr>
-          <w:sz w:val="22"/>
-          <w:szCs w:val="22"/>
-        </w:rPr>
-        <w:t>: almacena todas las dependencias instaladas.</w:t>
-      </w:r>
-    </w:p>
-    <w:p>
-      <w:pPr>
         <w:pStyle w:val="Prrafodelista"/>
         <w:ind w:left="504" w:hanging="504"/>
         <w:rPr>
           <w:bCs/>
           <w:sz w:val="22"/>
           <w:szCs w:val="22"/>
-        </w:rPr>
-      </w:pPr>
-      <w:r>
-        <w:rPr>
-          <w:bCs/>
-          <w:sz w:val="22"/>
-          <w:szCs w:val="22"/>
-        </w:rPr>
-        <w:t>Otros de los componentes más relevantes son</w:t>
-      </w:r>
-      <w:r>
-        <w:rPr>
-          <w:bCs/>
-          <w:sz w:val="22"/>
-          <w:szCs w:val="22"/>
-        </w:rPr>
-        <w:t xml:space="preserve">: </w:t>
-      </w:r>
-    </w:p>
-    <w:p>
-      <w:pPr>
-        <w:pStyle w:val="Prrafodelista"/>
-        <w:numPr>
-          <w:ilvl w:val="0"/>
-          <w:numId w:val="39"/>
-        </w:numPr>
-        <w:rPr>
-          <w:b/>
-          <w:sz w:val="22"/>
-          <w:szCs w:val="22"/>
-        </w:rPr>
-      </w:pPr>
-      <w:r>
-        <w:rPr>
-          <w:bCs/>
-          <w:sz w:val="22"/>
-          <w:szCs w:val="22"/>
-        </w:rPr>
-        <w:t xml:space="preserve">El </w:t>
-      </w:r>
-      <w:r>
-        <w:rPr>
-          <w:b/>
-          <w:sz w:val="22"/>
-          <w:szCs w:val="22"/>
-        </w:rPr>
-        <w:t xml:space="preserve">fichero App.js </w:t>
-      </w:r>
-      <w:r>
-        <w:rPr>
-          <w:bCs/>
-          <w:sz w:val="22"/>
-          <w:szCs w:val="22"/>
-        </w:rPr>
-        <w:t>que es el</w:t>
-      </w:r>
-      <w:r>
-        <w:rPr>
-          <w:b/>
-          <w:sz w:val="22"/>
-          <w:szCs w:val="22"/>
-        </w:rPr>
-        <w:t xml:space="preserve"> </w:t>
-      </w:r>
-      <w:r>
-        <w:rPr>
-          <w:sz w:val="22"/>
-          <w:szCs w:val="22"/>
-        </w:rPr>
-        <w:t>Componente raíz donde se definen rutas y proveen contextos.</w:t>
-      </w:r>
-    </w:p>
-    <w:p>
-      <w:pPr>
-        <w:pStyle w:val="Prrafodelista"/>
-        <w:numPr>
-          <w:ilvl w:val="0"/>
-          <w:numId w:val="39"/>
-        </w:numPr>
-        <w:rPr>
-          <w:b/>
-          <w:sz w:val="22"/>
-          <w:szCs w:val="22"/>
-        </w:rPr>
-      </w:pPr>
-      <w:r>
-        <w:rPr>
-          <w:sz w:val="22"/>
-          <w:szCs w:val="22"/>
-        </w:rPr>
-        <w:t xml:space="preserve">El </w:t>
-      </w:r>
-      <w:r>
-        <w:rPr>
-          <w:b/>
-          <w:bCs/>
-          <w:sz w:val="22"/>
-          <w:szCs w:val="22"/>
-        </w:rPr>
-        <w:t>fichero index.js</w:t>
-      </w:r>
-      <w:r>
-        <w:rPr>
-          <w:sz w:val="22"/>
-          <w:szCs w:val="22"/>
-        </w:rPr>
-        <w:t xml:space="preserve"> </w:t>
-      </w:r>
-      <w:r>
-        <w:rPr>
-          <w:sz w:val="22"/>
-          <w:szCs w:val="22"/>
-        </w:rPr>
-        <w:t xml:space="preserve"> </w:t>
-      </w:r>
-      <w:r>
-        <w:rPr>
-          <w:sz w:val="22"/>
-          <w:szCs w:val="22"/>
-        </w:rPr>
-        <w:t xml:space="preserve"> es el punto de entrad</w:t>
-      </w:r>
-      <w:r>
-        <w:rPr>
-          <w:sz w:val="22"/>
-          <w:szCs w:val="22"/>
-        </w:rPr>
-        <w:t>a,</w:t>
-      </w:r>
-      <w:r>
-        <w:rPr>
-          <w:sz w:val="22"/>
-          <w:szCs w:val="22"/>
-        </w:rPr>
-        <w:t xml:space="preserve"> renderiza </w:t>
-      </w:r>
-      <w:r>
-        <w:rPr>
-          <w:rStyle w:val="CdigoHTML"/>
-          <w:rFonts w:ascii="Arial" w:eastAsiaTheme="minorHAnsi" w:hAnsi="Arial" w:cs="Arial"/>
-          <w:sz w:val="22"/>
-          <w:szCs w:val="22"/>
-        </w:rPr>
-        <w:t>App.js</w:t>
-      </w:r>
-      <w:r>
-        <w:rPr>
-          <w:sz w:val="22"/>
-          <w:szCs w:val="22"/>
-        </w:rPr>
-        <w:t xml:space="preserve"> en el DOM.</w:t>
-      </w:r>
-    </w:p>
-    <w:p>
-      <w:pPr>
-        <w:pStyle w:val="Prrafodelista"/>
-        <w:numPr>
-          <w:ilvl w:val="0"/>
-          <w:numId w:val="39"/>
-        </w:numPr>
-        <w:rPr>
-          <w:rStyle w:val="CdigoHTML"/>
-          <w:rFonts w:ascii="Arial" w:eastAsiaTheme="minorHAnsi" w:hAnsi="Arial" w:cs="Arial"/>
-          <w:b/>
-          <w:sz w:val="22"/>
-          <w:szCs w:val="22"/>
-        </w:rPr>
-      </w:pPr>
-      <w:r>
-        <w:rPr>
-          <w:sz w:val="22"/>
-          <w:szCs w:val="22"/>
-        </w:rPr>
-        <w:t xml:space="preserve">El </w:t>
-      </w:r>
-      <w:r>
-        <w:rPr>
-          <w:b/>
-          <w:bCs/>
-          <w:sz w:val="22"/>
-          <w:szCs w:val="22"/>
-        </w:rPr>
-        <w:t>fichero routes.js</w:t>
-      </w:r>
-      <w:r>
-        <w:rPr>
-          <w:sz w:val="22"/>
-          <w:szCs w:val="22"/>
-        </w:rPr>
-        <w:t xml:space="preserve"> es el que centraliza la configuración de rutas usando </w:t>
-      </w:r>
-      <w:proofErr w:type="spellStart"/>
-      <w:r>
-        <w:rPr>
-          <w:rStyle w:val="CdigoHTML"/>
-          <w:rFonts w:ascii="Arial" w:eastAsiaTheme="minorHAnsi" w:hAnsi="Arial" w:cs="Arial"/>
-          <w:sz w:val="22"/>
-          <w:szCs w:val="22"/>
-        </w:rPr>
-        <w:t>react</w:t>
-      </w:r>
-      <w:proofErr w:type="spellEnd"/>
-      <w:r>
-        <w:rPr>
-          <w:rStyle w:val="CdigoHTML"/>
-          <w:rFonts w:ascii="Arial" w:eastAsiaTheme="minorHAnsi" w:hAnsi="Arial" w:cs="Arial"/>
-          <w:sz w:val="22"/>
-          <w:szCs w:val="22"/>
-        </w:rPr>
-        <w:t>-</w:t>
-      </w:r>
-      <w:proofErr w:type="spellStart"/>
-      <w:r>
-        <w:rPr>
-          <w:rStyle w:val="CdigoHTML"/>
-          <w:rFonts w:ascii="Arial" w:eastAsiaTheme="minorHAnsi" w:hAnsi="Arial" w:cs="Arial"/>
-          <w:sz w:val="22"/>
-          <w:szCs w:val="22"/>
-        </w:rPr>
-        <w:t>router</w:t>
-      </w:r>
-      <w:proofErr w:type="spellEnd"/>
-      <w:r>
-        <w:rPr>
-          <w:rStyle w:val="CdigoHTML"/>
-          <w:rFonts w:ascii="Arial" w:eastAsiaTheme="minorHAnsi" w:hAnsi="Arial" w:cs="Arial"/>
-          <w:sz w:val="22"/>
-          <w:szCs w:val="22"/>
-        </w:rPr>
-        <w:t>-dom</w:t>
-      </w:r>
-    </w:p>
-    <w:p>
-      <w:pPr>
-        <w:pStyle w:val="Prrafodelista"/>
-        <w:numPr>
-          <w:ilvl w:val="0"/>
-          <w:numId w:val="39"/>
-        </w:numPr>
-        <w:rPr>
-          <w:bCs/>
-          <w:sz w:val="22"/>
-          <w:szCs w:val="22"/>
-        </w:rPr>
-      </w:pPr>
-      <w:r>
-        <w:rPr>
-          <w:bCs/>
-          <w:sz w:val="22"/>
-          <w:szCs w:val="22"/>
-        </w:rPr>
-        <w:t>E</w:t>
-      </w:r>
-      <w:r>
-        <w:rPr>
-          <w:b/>
-          <w:sz w:val="22"/>
-          <w:szCs w:val="22"/>
-        </w:rPr>
-        <w:t xml:space="preserve">l </w:t>
-      </w:r>
-      <w:proofErr w:type="gramStart"/>
-      <w:r>
-        <w:rPr>
-          <w:b/>
-          <w:sz w:val="22"/>
-          <w:szCs w:val="22"/>
-        </w:rPr>
-        <w:t>fichero  .</w:t>
-      </w:r>
-      <w:proofErr w:type="spellStart"/>
-      <w:proofErr w:type="gramEnd"/>
-      <w:r>
-        <w:rPr>
-          <w:b/>
-          <w:sz w:val="22"/>
-          <w:szCs w:val="22"/>
-        </w:rPr>
-        <w:t>env.example</w:t>
-      </w:r>
-      <w:proofErr w:type="spellEnd"/>
-      <w:r>
-        <w:rPr>
-          <w:b/>
-          <w:sz w:val="22"/>
-          <w:szCs w:val="22"/>
-        </w:rPr>
-        <w:t xml:space="preserve"> </w:t>
-      </w:r>
-      <w:r>
-        <w:rPr>
-          <w:bCs/>
-          <w:sz w:val="22"/>
-          <w:szCs w:val="22"/>
-        </w:rPr>
-        <w:t xml:space="preserve">en él está contenida la configuración para conectarnos a nuestro </w:t>
-      </w:r>
-      <w:proofErr w:type="spellStart"/>
-      <w:r>
-        <w:rPr>
-          <w:bCs/>
-          <w:sz w:val="22"/>
-          <w:szCs w:val="22"/>
-        </w:rPr>
-        <w:t>Backend</w:t>
-      </w:r>
-      <w:proofErr w:type="spellEnd"/>
-      <w:r>
-        <w:rPr>
-          <w:bCs/>
-          <w:sz w:val="22"/>
-          <w:szCs w:val="22"/>
-        </w:rPr>
-        <w:t xml:space="preserve"> (Figura 3.2)</w:t>
-      </w:r>
-    </w:p>
-    <w:p>
-      <w:pPr>
-        <w:pStyle w:val="Prrafodelista"/>
-        <w:ind w:left="504" w:hanging="504"/>
-        <w:rPr>
-          <w:bCs/>
-          <w:sz w:val="22"/>
-          <w:szCs w:val="22"/>
-        </w:rPr>
-      </w:pPr>
-      <w:r>
-        <w:rPr>
-          <w:bCs/>
-          <w:sz w:val="22"/>
-          <w:szCs w:val="22"/>
-        </w:rPr>
-        <w:t xml:space="preserve"> </w:t>
-      </w:r>
-      <w:r>
-        <w:rPr>
-          <w:bCs/>
-          <w:noProof/>
-          <w:sz w:val="22"/>
-          <w:szCs w:val="22"/>
-        </w:rPr>
-        <w:drawing>
-          <wp:inline distT="0" distB="0" distL="0" distR="0" wp14:anchorId="64C9C63C" wp14:editId="36E85ABC">
-            <wp:extent cx="3776345" cy="2066290"/>
-            <wp:effectExtent l="0" t="0" r="0" b="0"/>
-            <wp:docPr id="13" name="Imagen 13"/>
-            <wp:cNvGraphicFramePr>
-              <a:graphicFrameLocks xmlns:a="http://schemas.openxmlformats.org/drawingml/2006/main" noChangeAspect="1"/>
-            </wp:cNvGraphicFramePr>
-            <a:graphic xmlns:a="http://schemas.openxmlformats.org/drawingml/2006/main">
-              <a:graphicData uri="http://schemas.openxmlformats.org/drawingml/2006/picture">
-                <pic:pic xmlns:pic="http://schemas.openxmlformats.org/drawingml/2006/picture">
-                  <pic:nvPicPr>
-                    <pic:cNvPr id="0" name="Picture 6"/>
-                    <pic:cNvPicPr>
-                      <a:picLocks noChangeAspect="1" noChangeArrowheads="1"/>
-                    </pic:cNvPicPr>
-                  </pic:nvPicPr>
-                  <pic:blipFill>
-                    <a:blip r:embed="rId76">
-                      <a:extLst>
-                        <a:ext uri="{28A0092B-C50C-407E-A947-70E740481C1C}">
-                          <a14:useLocalDpi xmlns:a14="http://schemas.microsoft.com/office/drawing/2010/main" val="0"/>
-                        </a:ext>
-                      </a:extLst>
-                    </a:blip>
-                    <a:srcRect/>
-                    <a:stretch>
-                      <a:fillRect/>
-                    </a:stretch>
-                  </pic:blipFill>
-                  <pic:spPr bwMode="auto">
-                    <a:xfrm>
-                      <a:off x="0" y="0"/>
-                      <a:ext cx="3776345" cy="2066290"/>
-                    </a:xfrm>
-                    <a:prstGeom prst="rect">
-                      <a:avLst/>
-                    </a:prstGeom>
-                    <a:noFill/>
-                    <a:ln>
-                      <a:noFill/>
-                    </a:ln>
-                  </pic:spPr>
-                </pic:pic>
-              </a:graphicData>
-            </a:graphic>
-          </wp:inline>
-        </w:drawing>
-      </w:r>
-      <w:r>
-        <w:rPr>
-          <w:bCs/>
-          <w:sz w:val="22"/>
-          <w:szCs w:val="22"/>
-        </w:rPr>
-        <w:t xml:space="preserve">          </w:t>
-      </w:r>
-    </w:p>
-    <w:p>
-      <w:pPr>
-        <w:pStyle w:val="Prrafodelista"/>
-        <w:ind w:left="504" w:hanging="504"/>
-        <w:rPr>
-          <w:bCs/>
-          <w:sz w:val="18"/>
-          <w:szCs w:val="18"/>
-        </w:rPr>
-      </w:pPr>
-      <w:r>
-        <w:rPr>
-          <w:bCs/>
-          <w:sz w:val="18"/>
-          <w:szCs w:val="18"/>
-        </w:rPr>
-        <w:t xml:space="preserve">Figura 3.1 Estructura de los </w:t>
-      </w:r>
-      <w:r>
-        <w:rPr>
-          <w:bCs/>
-          <w:sz w:val="18"/>
-          <w:szCs w:val="18"/>
-        </w:rPr>
-        <w:t>d</w:t>
-      </w:r>
-      <w:r>
-        <w:rPr>
-          <w:bCs/>
-          <w:sz w:val="18"/>
-          <w:szCs w:val="18"/>
-        </w:rPr>
-        <w:t>irectorio</w:t>
-      </w:r>
-      <w:r>
-        <w:rPr>
-          <w:bCs/>
-          <w:sz w:val="18"/>
-          <w:szCs w:val="18"/>
-        </w:rPr>
-        <w:t>s</w:t>
-      </w:r>
-      <w:r>
-        <w:rPr>
-          <w:bCs/>
-          <w:sz w:val="18"/>
-          <w:szCs w:val="18"/>
-        </w:rPr>
-        <w:t xml:space="preserve"> del </w:t>
-      </w:r>
-      <w:proofErr w:type="spellStart"/>
-      <w:r>
-        <w:rPr>
-          <w:bCs/>
-          <w:sz w:val="18"/>
-          <w:szCs w:val="18"/>
-        </w:rPr>
-        <w:t>Frontend</w:t>
-      </w:r>
-      <w:proofErr w:type="spellEnd"/>
-    </w:p>
-    <w:p>
-      <w:pPr>
-        <w:pStyle w:val="Prrafodelista"/>
-        <w:ind w:left="504" w:hanging="504"/>
-        <w:rPr>
-          <w:bCs/>
-          <w:sz w:val="22"/>
-          <w:szCs w:val="22"/>
-        </w:rPr>
-      </w:pPr>
-    </w:p>
-    <w:p>
-      <w:pPr>
-        <w:pStyle w:val="Prrafodelista"/>
-        <w:ind w:left="504" w:hanging="504"/>
-        <w:rPr>
-          <w:bCs/>
-          <w:sz w:val="22"/>
-          <w:szCs w:val="22"/>
-        </w:rPr>
-      </w:pPr>
-      <w:r>
-        <w:rPr>
-          <w:bCs/>
-          <w:noProof/>
-          <w:sz w:val="22"/>
-          <w:szCs w:val="22"/>
-        </w:rPr>
-        <w:lastRenderedPageBreak/>
-        <w:drawing>
-          <wp:inline distT="0" distB="0" distL="0" distR="0" wp14:anchorId="55B4CA6C" wp14:editId="7988938A">
-            <wp:extent cx="5747385" cy="1531620"/>
-            <wp:effectExtent l="0" t="0" r="5715" b="0"/>
-            <wp:docPr id="14" name="Imagen 14"/>
-            <wp:cNvGraphicFramePr>
-              <a:graphicFrameLocks xmlns:a="http://schemas.openxmlformats.org/drawingml/2006/main" noChangeAspect="1"/>
-            </wp:cNvGraphicFramePr>
-            <a:graphic xmlns:a="http://schemas.openxmlformats.org/drawingml/2006/main">
-              <a:graphicData uri="http://schemas.openxmlformats.org/drawingml/2006/picture">
-                <pic:pic xmlns:pic="http://schemas.openxmlformats.org/drawingml/2006/picture">
-                  <pic:nvPicPr>
-                    <pic:cNvPr id="0" name="Picture 7"/>
-                    <pic:cNvPicPr>
-                      <a:picLocks noChangeAspect="1" noChangeArrowheads="1"/>
-                    </pic:cNvPicPr>
-                  </pic:nvPicPr>
-                  <pic:blipFill>
-                    <a:blip r:embed="rId77">
-                      <a:extLst>
-                        <a:ext uri="{28A0092B-C50C-407E-A947-70E740481C1C}">
-                          <a14:useLocalDpi xmlns:a14="http://schemas.microsoft.com/office/drawing/2010/main" val="0"/>
-                        </a:ext>
-                      </a:extLst>
-                    </a:blip>
-                    <a:srcRect/>
-                    <a:stretch>
-                      <a:fillRect/>
-                    </a:stretch>
-                  </pic:blipFill>
-                  <pic:spPr bwMode="auto">
-                    <a:xfrm>
-                      <a:off x="0" y="0"/>
-                      <a:ext cx="5747385" cy="1531620"/>
-                    </a:xfrm>
-                    <a:prstGeom prst="rect">
-                      <a:avLst/>
-                    </a:prstGeom>
-                    <a:noFill/>
-                    <a:ln>
-                      <a:noFill/>
-                    </a:ln>
-                  </pic:spPr>
-                </pic:pic>
-              </a:graphicData>
-            </a:graphic>
-          </wp:inline>
-        </w:drawing>
-      </w:r>
-    </w:p>
-    <w:p>
-      <w:pPr>
-        <w:pStyle w:val="Prrafodelista"/>
-        <w:ind w:left="504" w:hanging="504"/>
-        <w:rPr>
-          <w:bCs/>
-          <w:sz w:val="18"/>
-          <w:szCs w:val="18"/>
-        </w:rPr>
-      </w:pPr>
-      <w:r>
-        <w:rPr>
-          <w:bCs/>
-          <w:sz w:val="18"/>
-          <w:szCs w:val="18"/>
-        </w:rPr>
-        <w:t xml:space="preserve">Figura 3.2 </w:t>
-      </w:r>
-      <w:proofErr w:type="gramStart"/>
-      <w:r>
-        <w:rPr>
-          <w:bCs/>
-          <w:sz w:val="18"/>
-          <w:szCs w:val="18"/>
-        </w:rPr>
-        <w:t>Fichero .</w:t>
-      </w:r>
-      <w:proofErr w:type="spellStart"/>
-      <w:r>
-        <w:rPr>
-          <w:bCs/>
-          <w:sz w:val="18"/>
-          <w:szCs w:val="18"/>
-        </w:rPr>
-        <w:t>env</w:t>
-      </w:r>
-      <w:proofErr w:type="gramEnd"/>
-      <w:r>
-        <w:rPr>
-          <w:bCs/>
-          <w:sz w:val="18"/>
-          <w:szCs w:val="18"/>
-        </w:rPr>
-        <w:t>.example</w:t>
-      </w:r>
-      <w:proofErr w:type="spellEnd"/>
-    </w:p>
-    <w:p>
-      <w:pPr>
-        <w:pStyle w:val="Prrafodelista"/>
-        <w:ind w:left="504" w:hanging="504"/>
-        <w:rPr>
-          <w:bCs/>
-          <w:sz w:val="22"/>
-          <w:szCs w:val="22"/>
-        </w:rPr>
-      </w:pPr>
-    </w:p>
-    <w:p>
-      <w:pPr>
-        <w:pStyle w:val="Prrafodelista"/>
-        <w:ind w:left="504" w:hanging="504"/>
-        <w:rPr>
-          <w:bCs/>
-          <w:sz w:val="22"/>
-          <w:szCs w:val="22"/>
-        </w:rPr>
-      </w:pPr>
-      <w:r>
-        <w:rPr>
-          <w:bCs/>
-          <w:sz w:val="22"/>
-          <w:szCs w:val="22"/>
-        </w:rPr>
-        <w:t>3.1 Estructura de Directorios</w:t>
-      </w:r>
-    </w:p>
-    <w:p>
-      <w:pPr>
-        <w:pStyle w:val="ds-markdown-paragraph"/>
-        <w:jc w:val="both"/>
-        <w:rPr>
-          <w:rFonts w:ascii="Arial" w:hAnsi="Arial" w:cs="Arial"/>
-          <w:bCs/>
-          <w:sz w:val="22"/>
-          <w:szCs w:val="22"/>
-        </w:rPr>
-      </w:pPr>
-      <w:r>
-        <w:rPr>
-          <w:rFonts w:ascii="Arial" w:hAnsi="Arial" w:cs="Arial"/>
-          <w:bCs/>
-          <w:sz w:val="22"/>
-          <w:szCs w:val="22"/>
-        </w:rPr>
-        <w:t>La aplicación (Figura 3.1) está compuesta por los siguientes directorios principales:</w:t>
-      </w:r>
+          <w:lang w:val="es-CU"/>
+        </w:rPr>
+      </w:pPr>
     </w:p>
     <w:p/>
     <w:p>
@@ -20292,6 +20918,7 @@
         <w:rPr>
           <w:color w:val="auto"/>
         </w:rPr>
+        <w:lastRenderedPageBreak/>
         <w:t xml:space="preserve">El token JWT se almacena en </w:t>
       </w:r>
       <w:proofErr w:type="spellStart"/>
@@ -20347,7 +20974,6 @@
           <w:bCs/>
           <w:color w:val="auto"/>
         </w:rPr>
-        <w:lastRenderedPageBreak/>
         <w:t>Validación de roles permitidos</w:t>
       </w:r>
     </w:p>
@@ -21004,7 +21630,11 @@
     </w:p>
     <w:p>
       <w:r>
-        <w:t xml:space="preserve">En la Tabla 3.2. Caso de Prueba “Cálculo”, se describe las diversas formas y resultados esperados. En el primero, al entrar datos válidos el sistema permite su entrada y procede al caso dos que se calcula a partir de que el usuario presiona el botón calcular y se guardan los datos entrados en la base de datos, posterior a esto los datos serán mostrados en una tabla. En el caso tres si el usuario entra un dato erróneo, ya sea letras en vez de números o cualquier dato que no es el correspondiente a esa entrada, el sistema debe notificarle la mismo que el dato es incorrecto. </w:t>
+        <w:t xml:space="preserve">En la Tabla 3.2. Caso de Prueba “Cálculo”, se describe las diversas formas y resultados esperados. En el primero, al entrar datos válidos el sistema permite su entrada y procede al caso dos que se calcula a partir de que el usuario presiona el botón calcular y se guardan los datos </w:t>
+      </w:r>
+      <w:r>
+        <w:lastRenderedPageBreak/>
+        <w:t xml:space="preserve">entrados en la base de datos, posterior a esto los datos serán mostrados en una tabla. En el caso tres si el usuario entra un dato erróneo, ya sea letras en vez de números o cualquier dato que no es el correspondiente a esa entrada, el sistema debe notificarle la mismo que el dato es incorrecto. </w:t>
       </w:r>
     </w:p>
     <w:p>
@@ -21027,7 +21657,6 @@
         <w:rPr>
           <w:rStyle w:val="Ttulo2Car"/>
         </w:rPr>
-        <w:lastRenderedPageBreak/>
         <w:t>Tabla 3.2</w:t>
       </w:r>
       <w:bookmarkEnd w:id="129"/>
@@ -39225,6 +39854,155 @@
     </w:lvl>
   </w:abstractNum>
   <w:abstractNum w:abstractNumId="25" w15:restartNumberingAfterBreak="0">
+    <w:nsid w:val="37B558C7"/>
+    <w:multiLevelType w:val="multilevel"/>
+    <w:tmpl w:val="23FE0854"/>
+    <w:lvl w:ilvl="0">
+      <w:start w:val="1"/>
+      <w:numFmt w:val="bullet"/>
+      <w:lvlText w:val=""/>
+      <w:lvlJc w:val="left"/>
+      <w:pPr>
+        <w:tabs>
+          <w:tab w:val="num" w:pos="720"/>
+        </w:tabs>
+        <w:ind w:left="720" w:hanging="360"/>
+      </w:pPr>
+      <w:rPr>
+        <w:rFonts w:ascii="Symbol" w:hAnsi="Symbol" w:hint="default"/>
+        <w:sz w:val="20"/>
+      </w:rPr>
+    </w:lvl>
+    <w:lvl w:ilvl="1" w:tentative="1">
+      <w:start w:val="1"/>
+      <w:numFmt w:val="bullet"/>
+      <w:lvlText w:val="o"/>
+      <w:lvlJc w:val="left"/>
+      <w:pPr>
+        <w:tabs>
+          <w:tab w:val="num" w:pos="1440"/>
+        </w:tabs>
+        <w:ind w:left="1440" w:hanging="360"/>
+      </w:pPr>
+      <w:rPr>
+        <w:rFonts w:ascii="Courier New" w:hAnsi="Courier New" w:hint="default"/>
+        <w:sz w:val="20"/>
+      </w:rPr>
+    </w:lvl>
+    <w:lvl w:ilvl="2" w:tentative="1">
+      <w:start w:val="1"/>
+      <w:numFmt w:val="bullet"/>
+      <w:lvlText w:val=""/>
+      <w:lvlJc w:val="left"/>
+      <w:pPr>
+        <w:tabs>
+          <w:tab w:val="num" w:pos="2160"/>
+        </w:tabs>
+        <w:ind w:left="2160" w:hanging="360"/>
+      </w:pPr>
+      <w:rPr>
+        <w:rFonts w:ascii="Wingdings" w:hAnsi="Wingdings" w:hint="default"/>
+        <w:sz w:val="20"/>
+      </w:rPr>
+    </w:lvl>
+    <w:lvl w:ilvl="3" w:tentative="1">
+      <w:start w:val="1"/>
+      <w:numFmt w:val="bullet"/>
+      <w:lvlText w:val=""/>
+      <w:lvlJc w:val="left"/>
+      <w:pPr>
+        <w:tabs>
+          <w:tab w:val="num" w:pos="2880"/>
+        </w:tabs>
+        <w:ind w:left="2880" w:hanging="360"/>
+      </w:pPr>
+      <w:rPr>
+        <w:rFonts w:ascii="Wingdings" w:hAnsi="Wingdings" w:hint="default"/>
+        <w:sz w:val="20"/>
+      </w:rPr>
+    </w:lvl>
+    <w:lvl w:ilvl="4" w:tentative="1">
+      <w:start w:val="1"/>
+      <w:numFmt w:val="bullet"/>
+      <w:lvlText w:val=""/>
+      <w:lvlJc w:val="left"/>
+      <w:pPr>
+        <w:tabs>
+          <w:tab w:val="num" w:pos="3600"/>
+        </w:tabs>
+        <w:ind w:left="3600" w:hanging="360"/>
+      </w:pPr>
+      <w:rPr>
+        <w:rFonts w:ascii="Wingdings" w:hAnsi="Wingdings" w:hint="default"/>
+        <w:sz w:val="20"/>
+      </w:rPr>
+    </w:lvl>
+    <w:lvl w:ilvl="5" w:tentative="1">
+      <w:start w:val="1"/>
+      <w:numFmt w:val="bullet"/>
+      <w:lvlText w:val=""/>
+      <w:lvlJc w:val="left"/>
+      <w:pPr>
+        <w:tabs>
+          <w:tab w:val="num" w:pos="4320"/>
+        </w:tabs>
+        <w:ind w:left="4320" w:hanging="360"/>
+      </w:pPr>
+      <w:rPr>
+        <w:rFonts w:ascii="Wingdings" w:hAnsi="Wingdings" w:hint="default"/>
+        <w:sz w:val="20"/>
+      </w:rPr>
+    </w:lvl>
+    <w:lvl w:ilvl="6" w:tentative="1">
+      <w:start w:val="1"/>
+      <w:numFmt w:val="bullet"/>
+      <w:lvlText w:val=""/>
+      <w:lvlJc w:val="left"/>
+      <w:pPr>
+        <w:tabs>
+          <w:tab w:val="num" w:pos="5040"/>
+        </w:tabs>
+        <w:ind w:left="5040" w:hanging="360"/>
+      </w:pPr>
+      <w:rPr>
+        <w:rFonts w:ascii="Wingdings" w:hAnsi="Wingdings" w:hint="default"/>
+        <w:sz w:val="20"/>
+      </w:rPr>
+    </w:lvl>
+    <w:lvl w:ilvl="7" w:tentative="1">
+      <w:start w:val="1"/>
+      <w:numFmt w:val="bullet"/>
+      <w:lvlText w:val=""/>
+      <w:lvlJc w:val="left"/>
+      <w:pPr>
+        <w:tabs>
+          <w:tab w:val="num" w:pos="5760"/>
+        </w:tabs>
+        <w:ind w:left="5760" w:hanging="360"/>
+      </w:pPr>
+      <w:rPr>
+        <w:rFonts w:ascii="Wingdings" w:hAnsi="Wingdings" w:hint="default"/>
+        <w:sz w:val="20"/>
+      </w:rPr>
+    </w:lvl>
+    <w:lvl w:ilvl="8" w:tentative="1">
+      <w:start w:val="1"/>
+      <w:numFmt w:val="bullet"/>
+      <w:lvlText w:val=""/>
+      <w:lvlJc w:val="left"/>
+      <w:pPr>
+        <w:tabs>
+          <w:tab w:val="num" w:pos="6480"/>
+        </w:tabs>
+        <w:ind w:left="6480" w:hanging="360"/>
+      </w:pPr>
+      <w:rPr>
+        <w:rFonts w:ascii="Wingdings" w:hAnsi="Wingdings" w:hint="default"/>
+        <w:sz w:val="20"/>
+      </w:rPr>
+    </w:lvl>
+  </w:abstractNum>
+  <w:abstractNum w:abstractNumId="26" w15:restartNumberingAfterBreak="0">
     <w:nsid w:val="3B3643C0"/>
     <w:multiLevelType w:val="hybridMultilevel"/>
     <w:tmpl w:val="B0204FDE"/>
@@ -39337,7 +40115,7 @@
       </w:rPr>
     </w:lvl>
   </w:abstractNum>
-  <w:abstractNum w:abstractNumId="26" w15:restartNumberingAfterBreak="0">
+  <w:abstractNum w:abstractNumId="27" w15:restartNumberingAfterBreak="0">
     <w:nsid w:val="3CF241D0"/>
     <w:multiLevelType w:val="hybridMultilevel"/>
     <w:tmpl w:val="26C24F84"/>
@@ -39451,7 +40229,7 @@
       </w:rPr>
     </w:lvl>
   </w:abstractNum>
-  <w:abstractNum w:abstractNumId="27" w15:restartNumberingAfterBreak="0">
+  <w:abstractNum w:abstractNumId="28" w15:restartNumberingAfterBreak="0">
     <w:nsid w:val="3CF70D2D"/>
     <w:multiLevelType w:val="multilevel"/>
     <w:tmpl w:val="397CD71C"/>
@@ -39600,7 +40378,7 @@
       </w:rPr>
     </w:lvl>
   </w:abstractNum>
-  <w:abstractNum w:abstractNumId="28" w15:restartNumberingAfterBreak="0">
+  <w:abstractNum w:abstractNumId="29" w15:restartNumberingAfterBreak="0">
     <w:nsid w:val="43596F09"/>
     <w:multiLevelType w:val="hybridMultilevel"/>
     <w:tmpl w:val="DC40FDE0"/>
@@ -39713,7 +40491,7 @@
       </w:rPr>
     </w:lvl>
   </w:abstractNum>
-  <w:abstractNum w:abstractNumId="29" w15:restartNumberingAfterBreak="0">
+  <w:abstractNum w:abstractNumId="30" w15:restartNumberingAfterBreak="0">
     <w:nsid w:val="44384A50"/>
     <w:multiLevelType w:val="multilevel"/>
     <w:tmpl w:val="2BB8BA68"/>
@@ -39862,7 +40640,7 @@
       </w:rPr>
     </w:lvl>
   </w:abstractNum>
-  <w:abstractNum w:abstractNumId="30" w15:restartNumberingAfterBreak="0">
+  <w:abstractNum w:abstractNumId="31" w15:restartNumberingAfterBreak="0">
     <w:nsid w:val="4A4E6987"/>
     <w:multiLevelType w:val="hybridMultilevel"/>
     <w:tmpl w:val="319CBDFA"/>
@@ -39975,7 +40753,7 @@
       </w:rPr>
     </w:lvl>
   </w:abstractNum>
-  <w:abstractNum w:abstractNumId="31" w15:restartNumberingAfterBreak="0">
+  <w:abstractNum w:abstractNumId="32" w15:restartNumberingAfterBreak="0">
     <w:nsid w:val="4B61053E"/>
     <w:multiLevelType w:val="hybridMultilevel"/>
     <w:tmpl w:val="A07C533A"/>
@@ -40088,7 +40866,7 @@
       </w:rPr>
     </w:lvl>
   </w:abstractNum>
-  <w:abstractNum w:abstractNumId="32" w15:restartNumberingAfterBreak="0">
+  <w:abstractNum w:abstractNumId="33" w15:restartNumberingAfterBreak="0">
     <w:nsid w:val="50AD4D7E"/>
     <w:multiLevelType w:val="hybridMultilevel"/>
     <w:tmpl w:val="29B0C2E0"/>
@@ -40202,7 +40980,7 @@
       </w:rPr>
     </w:lvl>
   </w:abstractNum>
-  <w:abstractNum w:abstractNumId="33" w15:restartNumberingAfterBreak="0">
+  <w:abstractNum w:abstractNumId="34" w15:restartNumberingAfterBreak="0">
     <w:nsid w:val="516A0573"/>
     <w:multiLevelType w:val="hybridMultilevel"/>
     <w:tmpl w:val="6B6CACC6"/>
@@ -40315,7 +41093,7 @@
       </w:rPr>
     </w:lvl>
   </w:abstractNum>
-  <w:abstractNum w:abstractNumId="34" w15:restartNumberingAfterBreak="0">
+  <w:abstractNum w:abstractNumId="35" w15:restartNumberingAfterBreak="0">
     <w:nsid w:val="52B8359A"/>
     <w:multiLevelType w:val="multilevel"/>
     <w:tmpl w:val="14C06CD2"/>
@@ -40401,7 +41179,7 @@
       </w:pPr>
     </w:lvl>
   </w:abstractNum>
-  <w:abstractNum w:abstractNumId="35" w15:restartNumberingAfterBreak="0">
+  <w:abstractNum w:abstractNumId="36" w15:restartNumberingAfterBreak="0">
     <w:nsid w:val="54D35F71"/>
     <w:multiLevelType w:val="multilevel"/>
     <w:tmpl w:val="81B0B628"/>
@@ -40515,7 +41293,7 @@
       </w:rPr>
     </w:lvl>
   </w:abstractNum>
-  <w:abstractNum w:abstractNumId="36" w15:restartNumberingAfterBreak="0">
+  <w:abstractNum w:abstractNumId="37" w15:restartNumberingAfterBreak="0">
     <w:nsid w:val="58184D6F"/>
     <w:multiLevelType w:val="hybridMultilevel"/>
     <w:tmpl w:val="B6D244C0"/>
@@ -40628,7 +41406,7 @@
       </w:rPr>
     </w:lvl>
   </w:abstractNum>
-  <w:abstractNum w:abstractNumId="37" w15:restartNumberingAfterBreak="0">
+  <w:abstractNum w:abstractNumId="38" w15:restartNumberingAfterBreak="0">
     <w:nsid w:val="59357C29"/>
     <w:multiLevelType w:val="hybridMultilevel"/>
     <w:tmpl w:val="3064CE70"/>
@@ -40741,7 +41519,7 @@
       </w:rPr>
     </w:lvl>
   </w:abstractNum>
-  <w:abstractNum w:abstractNumId="38" w15:restartNumberingAfterBreak="0">
+  <w:abstractNum w:abstractNumId="39" w15:restartNumberingAfterBreak="0">
     <w:nsid w:val="645D0617"/>
     <w:multiLevelType w:val="multilevel"/>
     <w:tmpl w:val="B9D0D63C"/>
@@ -40890,7 +41668,7 @@
       </w:rPr>
     </w:lvl>
   </w:abstractNum>
-  <w:abstractNum w:abstractNumId="39" w15:restartNumberingAfterBreak="0">
+  <w:abstractNum w:abstractNumId="40" w15:restartNumberingAfterBreak="0">
     <w:nsid w:val="67405DA2"/>
     <w:multiLevelType w:val="multilevel"/>
     <w:tmpl w:val="98766F2A"/>
@@ -41003,7 +41781,7 @@
       </w:pPr>
     </w:lvl>
   </w:abstractNum>
-  <w:abstractNum w:abstractNumId="40" w15:restartNumberingAfterBreak="0">
+  <w:abstractNum w:abstractNumId="41" w15:restartNumberingAfterBreak="0">
     <w:nsid w:val="67AD18D2"/>
     <w:multiLevelType w:val="multilevel"/>
     <w:tmpl w:val="5A305338"/>
@@ -41116,7 +41894,7 @@
       </w:rPr>
     </w:lvl>
   </w:abstractNum>
-  <w:abstractNum w:abstractNumId="41" w15:restartNumberingAfterBreak="0">
+  <w:abstractNum w:abstractNumId="42" w15:restartNumberingAfterBreak="0">
     <w:nsid w:val="68CE6173"/>
     <w:multiLevelType w:val="multilevel"/>
     <w:tmpl w:val="5C0A001F"/>
@@ -41202,7 +41980,7 @@
       </w:pPr>
     </w:lvl>
   </w:abstractNum>
-  <w:abstractNum w:abstractNumId="42" w15:restartNumberingAfterBreak="0">
+  <w:abstractNum w:abstractNumId="43" w15:restartNumberingAfterBreak="0">
     <w:nsid w:val="6B753581"/>
     <w:multiLevelType w:val="multilevel"/>
     <w:tmpl w:val="941C599A"/>
@@ -41351,7 +42129,7 @@
       </w:rPr>
     </w:lvl>
   </w:abstractNum>
-  <w:abstractNum w:abstractNumId="43" w15:restartNumberingAfterBreak="0">
+  <w:abstractNum w:abstractNumId="44" w15:restartNumberingAfterBreak="0">
     <w:nsid w:val="6F155348"/>
     <w:multiLevelType w:val="multilevel"/>
     <w:tmpl w:val="EBCA3440"/>
@@ -41380,7 +42158,7 @@
       <w:lvlText w:val="%1.%2.%3."/>
       <w:lvlJc w:val="left"/>
       <w:pPr>
-        <w:ind w:left="1638" w:hanging="504"/>
+        <w:ind w:left="3481" w:hanging="504"/>
       </w:pPr>
     </w:lvl>
     <w:lvl w:ilvl="3">
@@ -41438,7 +42216,7 @@
       </w:pPr>
     </w:lvl>
   </w:abstractNum>
-  <w:abstractNum w:abstractNumId="44" w15:restartNumberingAfterBreak="0">
+  <w:abstractNum w:abstractNumId="45" w15:restartNumberingAfterBreak="0">
     <w:nsid w:val="70442DED"/>
     <w:multiLevelType w:val="multilevel"/>
     <w:tmpl w:val="4DBA6AE6"/>
@@ -41587,7 +42365,7 @@
       </w:rPr>
     </w:lvl>
   </w:abstractNum>
-  <w:abstractNum w:abstractNumId="45" w15:restartNumberingAfterBreak="0">
+  <w:abstractNum w:abstractNumId="46" w15:restartNumberingAfterBreak="0">
     <w:nsid w:val="711914F5"/>
     <w:multiLevelType w:val="multilevel"/>
     <w:tmpl w:val="6D68B112"/>
@@ -41736,7 +42514,156 @@
       </w:rPr>
     </w:lvl>
   </w:abstractNum>
-  <w:abstractNum w:abstractNumId="46" w15:restartNumberingAfterBreak="0">
+  <w:abstractNum w:abstractNumId="47" w15:restartNumberingAfterBreak="0">
+    <w:nsid w:val="73A553BF"/>
+    <w:multiLevelType w:val="multilevel"/>
+    <w:tmpl w:val="295C2B9A"/>
+    <w:lvl w:ilvl="0">
+      <w:start w:val="1"/>
+      <w:numFmt w:val="bullet"/>
+      <w:lvlText w:val=""/>
+      <w:lvlJc w:val="left"/>
+      <w:pPr>
+        <w:tabs>
+          <w:tab w:val="num" w:pos="720"/>
+        </w:tabs>
+        <w:ind w:left="720" w:hanging="360"/>
+      </w:pPr>
+      <w:rPr>
+        <w:rFonts w:ascii="Symbol" w:hAnsi="Symbol" w:hint="default"/>
+        <w:sz w:val="20"/>
+      </w:rPr>
+    </w:lvl>
+    <w:lvl w:ilvl="1" w:tentative="1">
+      <w:start w:val="1"/>
+      <w:numFmt w:val="bullet"/>
+      <w:lvlText w:val="o"/>
+      <w:lvlJc w:val="left"/>
+      <w:pPr>
+        <w:tabs>
+          <w:tab w:val="num" w:pos="1440"/>
+        </w:tabs>
+        <w:ind w:left="1440" w:hanging="360"/>
+      </w:pPr>
+      <w:rPr>
+        <w:rFonts w:ascii="Courier New" w:hAnsi="Courier New" w:hint="default"/>
+        <w:sz w:val="20"/>
+      </w:rPr>
+    </w:lvl>
+    <w:lvl w:ilvl="2" w:tentative="1">
+      <w:start w:val="1"/>
+      <w:numFmt w:val="bullet"/>
+      <w:lvlText w:val=""/>
+      <w:lvlJc w:val="left"/>
+      <w:pPr>
+        <w:tabs>
+          <w:tab w:val="num" w:pos="2160"/>
+        </w:tabs>
+        <w:ind w:left="2160" w:hanging="360"/>
+      </w:pPr>
+      <w:rPr>
+        <w:rFonts w:ascii="Wingdings" w:hAnsi="Wingdings" w:hint="default"/>
+        <w:sz w:val="20"/>
+      </w:rPr>
+    </w:lvl>
+    <w:lvl w:ilvl="3" w:tentative="1">
+      <w:start w:val="1"/>
+      <w:numFmt w:val="bullet"/>
+      <w:lvlText w:val=""/>
+      <w:lvlJc w:val="left"/>
+      <w:pPr>
+        <w:tabs>
+          <w:tab w:val="num" w:pos="2880"/>
+        </w:tabs>
+        <w:ind w:left="2880" w:hanging="360"/>
+      </w:pPr>
+      <w:rPr>
+        <w:rFonts w:ascii="Wingdings" w:hAnsi="Wingdings" w:hint="default"/>
+        <w:sz w:val="20"/>
+      </w:rPr>
+    </w:lvl>
+    <w:lvl w:ilvl="4" w:tentative="1">
+      <w:start w:val="1"/>
+      <w:numFmt w:val="bullet"/>
+      <w:lvlText w:val=""/>
+      <w:lvlJc w:val="left"/>
+      <w:pPr>
+        <w:tabs>
+          <w:tab w:val="num" w:pos="3600"/>
+        </w:tabs>
+        <w:ind w:left="3600" w:hanging="360"/>
+      </w:pPr>
+      <w:rPr>
+        <w:rFonts w:ascii="Wingdings" w:hAnsi="Wingdings" w:hint="default"/>
+        <w:sz w:val="20"/>
+      </w:rPr>
+    </w:lvl>
+    <w:lvl w:ilvl="5" w:tentative="1">
+      <w:start w:val="1"/>
+      <w:numFmt w:val="bullet"/>
+      <w:lvlText w:val=""/>
+      <w:lvlJc w:val="left"/>
+      <w:pPr>
+        <w:tabs>
+          <w:tab w:val="num" w:pos="4320"/>
+        </w:tabs>
+        <w:ind w:left="4320" w:hanging="360"/>
+      </w:pPr>
+      <w:rPr>
+        <w:rFonts w:ascii="Wingdings" w:hAnsi="Wingdings" w:hint="default"/>
+        <w:sz w:val="20"/>
+      </w:rPr>
+    </w:lvl>
+    <w:lvl w:ilvl="6" w:tentative="1">
+      <w:start w:val="1"/>
+      <w:numFmt w:val="bullet"/>
+      <w:lvlText w:val=""/>
+      <w:lvlJc w:val="left"/>
+      <w:pPr>
+        <w:tabs>
+          <w:tab w:val="num" w:pos="5040"/>
+        </w:tabs>
+        <w:ind w:left="5040" w:hanging="360"/>
+      </w:pPr>
+      <w:rPr>
+        <w:rFonts w:ascii="Wingdings" w:hAnsi="Wingdings" w:hint="default"/>
+        <w:sz w:val="20"/>
+      </w:rPr>
+    </w:lvl>
+    <w:lvl w:ilvl="7" w:tentative="1">
+      <w:start w:val="1"/>
+      <w:numFmt w:val="bullet"/>
+      <w:lvlText w:val=""/>
+      <w:lvlJc w:val="left"/>
+      <w:pPr>
+        <w:tabs>
+          <w:tab w:val="num" w:pos="5760"/>
+        </w:tabs>
+        <w:ind w:left="5760" w:hanging="360"/>
+      </w:pPr>
+      <w:rPr>
+        <w:rFonts w:ascii="Wingdings" w:hAnsi="Wingdings" w:hint="default"/>
+        <w:sz w:val="20"/>
+      </w:rPr>
+    </w:lvl>
+    <w:lvl w:ilvl="8" w:tentative="1">
+      <w:start w:val="1"/>
+      <w:numFmt w:val="bullet"/>
+      <w:lvlText w:val=""/>
+      <w:lvlJc w:val="left"/>
+      <w:pPr>
+        <w:tabs>
+          <w:tab w:val="num" w:pos="6480"/>
+        </w:tabs>
+        <w:ind w:left="6480" w:hanging="360"/>
+      </w:pPr>
+      <w:rPr>
+        <w:rFonts w:ascii="Wingdings" w:hAnsi="Wingdings" w:hint="default"/>
+        <w:sz w:val="20"/>
+      </w:rPr>
+    </w:lvl>
+  </w:abstractNum>
+  <w:abstractNum w:abstractNumId="48" w15:restartNumberingAfterBreak="0">
     <w:nsid w:val="765860BC"/>
     <w:multiLevelType w:val="hybridMultilevel"/>
     <w:tmpl w:val="9A72A908"/>
@@ -41849,7 +42776,7 @@
       </w:rPr>
     </w:lvl>
   </w:abstractNum>
-  <w:abstractNum w:abstractNumId="47" w15:restartNumberingAfterBreak="0">
+  <w:abstractNum w:abstractNumId="49" w15:restartNumberingAfterBreak="0">
     <w:nsid w:val="78216ECD"/>
     <w:multiLevelType w:val="hybridMultilevel"/>
     <w:tmpl w:val="4AB21884"/>
@@ -41940,7 +42867,7 @@
       </w:pPr>
     </w:lvl>
   </w:abstractNum>
-  <w:abstractNum w:abstractNumId="48" w15:restartNumberingAfterBreak="0">
+  <w:abstractNum w:abstractNumId="50" w15:restartNumberingAfterBreak="0">
     <w:nsid w:val="7A5D0759"/>
     <w:multiLevelType w:val="hybridMultilevel"/>
     <w:tmpl w:val="0C08EEFE"/>
@@ -42053,7 +42980,156 @@
       </w:rPr>
     </w:lvl>
   </w:abstractNum>
-  <w:abstractNum w:abstractNumId="49" w15:restartNumberingAfterBreak="0">
+  <w:abstractNum w:abstractNumId="51" w15:restartNumberingAfterBreak="0">
+    <w:nsid w:val="7AA558D2"/>
+    <w:multiLevelType w:val="multilevel"/>
+    <w:tmpl w:val="72C21220"/>
+    <w:lvl w:ilvl="0">
+      <w:start w:val="1"/>
+      <w:numFmt w:val="bullet"/>
+      <w:lvlText w:val=""/>
+      <w:lvlJc w:val="left"/>
+      <w:pPr>
+        <w:tabs>
+          <w:tab w:val="num" w:pos="720"/>
+        </w:tabs>
+        <w:ind w:left="720" w:hanging="360"/>
+      </w:pPr>
+      <w:rPr>
+        <w:rFonts w:ascii="Symbol" w:hAnsi="Symbol" w:hint="default"/>
+        <w:sz w:val="20"/>
+      </w:rPr>
+    </w:lvl>
+    <w:lvl w:ilvl="1" w:tentative="1">
+      <w:start w:val="1"/>
+      <w:numFmt w:val="bullet"/>
+      <w:lvlText w:val="o"/>
+      <w:lvlJc w:val="left"/>
+      <w:pPr>
+        <w:tabs>
+          <w:tab w:val="num" w:pos="1440"/>
+        </w:tabs>
+        <w:ind w:left="1440" w:hanging="360"/>
+      </w:pPr>
+      <w:rPr>
+        <w:rFonts w:ascii="Courier New" w:hAnsi="Courier New" w:hint="default"/>
+        <w:sz w:val="20"/>
+      </w:rPr>
+    </w:lvl>
+    <w:lvl w:ilvl="2" w:tentative="1">
+      <w:start w:val="1"/>
+      <w:numFmt w:val="bullet"/>
+      <w:lvlText w:val=""/>
+      <w:lvlJc w:val="left"/>
+      <w:pPr>
+        <w:tabs>
+          <w:tab w:val="num" w:pos="2160"/>
+        </w:tabs>
+        <w:ind w:left="2160" w:hanging="360"/>
+      </w:pPr>
+      <w:rPr>
+        <w:rFonts w:ascii="Wingdings" w:hAnsi="Wingdings" w:hint="default"/>
+        <w:sz w:val="20"/>
+      </w:rPr>
+    </w:lvl>
+    <w:lvl w:ilvl="3" w:tentative="1">
+      <w:start w:val="1"/>
+      <w:numFmt w:val="bullet"/>
+      <w:lvlText w:val=""/>
+      <w:lvlJc w:val="left"/>
+      <w:pPr>
+        <w:tabs>
+          <w:tab w:val="num" w:pos="2880"/>
+        </w:tabs>
+        <w:ind w:left="2880" w:hanging="360"/>
+      </w:pPr>
+      <w:rPr>
+        <w:rFonts w:ascii="Wingdings" w:hAnsi="Wingdings" w:hint="default"/>
+        <w:sz w:val="20"/>
+      </w:rPr>
+    </w:lvl>
+    <w:lvl w:ilvl="4" w:tentative="1">
+      <w:start w:val="1"/>
+      <w:numFmt w:val="bullet"/>
+      <w:lvlText w:val=""/>
+      <w:lvlJc w:val="left"/>
+      <w:pPr>
+        <w:tabs>
+          <w:tab w:val="num" w:pos="3600"/>
+        </w:tabs>
+        <w:ind w:left="3600" w:hanging="360"/>
+      </w:pPr>
+      <w:rPr>
+        <w:rFonts w:ascii="Wingdings" w:hAnsi="Wingdings" w:hint="default"/>
+        <w:sz w:val="20"/>
+      </w:rPr>
+    </w:lvl>
+    <w:lvl w:ilvl="5" w:tentative="1">
+      <w:start w:val="1"/>
+      <w:numFmt w:val="bullet"/>
+      <w:lvlText w:val=""/>
+      <w:lvlJc w:val="left"/>
+      <w:pPr>
+        <w:tabs>
+          <w:tab w:val="num" w:pos="4320"/>
+        </w:tabs>
+        <w:ind w:left="4320" w:hanging="360"/>
+      </w:pPr>
+      <w:rPr>
+        <w:rFonts w:ascii="Wingdings" w:hAnsi="Wingdings" w:hint="default"/>
+        <w:sz w:val="20"/>
+      </w:rPr>
+    </w:lvl>
+    <w:lvl w:ilvl="6" w:tentative="1">
+      <w:start w:val="1"/>
+      <w:numFmt w:val="bullet"/>
+      <w:lvlText w:val=""/>
+      <w:lvlJc w:val="left"/>
+      <w:pPr>
+        <w:tabs>
+          <w:tab w:val="num" w:pos="5040"/>
+        </w:tabs>
+        <w:ind w:left="5040" w:hanging="360"/>
+      </w:pPr>
+      <w:rPr>
+        <w:rFonts w:ascii="Wingdings" w:hAnsi="Wingdings" w:hint="default"/>
+        <w:sz w:val="20"/>
+      </w:rPr>
+    </w:lvl>
+    <w:lvl w:ilvl="7" w:tentative="1">
+      <w:start w:val="1"/>
+      <w:numFmt w:val="bullet"/>
+      <w:lvlText w:val=""/>
+      <w:lvlJc w:val="left"/>
+      <w:pPr>
+        <w:tabs>
+          <w:tab w:val="num" w:pos="5760"/>
+        </w:tabs>
+        <w:ind w:left="5760" w:hanging="360"/>
+      </w:pPr>
+      <w:rPr>
+        <w:rFonts w:ascii="Wingdings" w:hAnsi="Wingdings" w:hint="default"/>
+        <w:sz w:val="20"/>
+      </w:rPr>
+    </w:lvl>
+    <w:lvl w:ilvl="8" w:tentative="1">
+      <w:start w:val="1"/>
+      <w:numFmt w:val="bullet"/>
+      <w:lvlText w:val=""/>
+      <w:lvlJc w:val="left"/>
+      <w:pPr>
+        <w:tabs>
+          <w:tab w:val="num" w:pos="6480"/>
+        </w:tabs>
+        <w:ind w:left="6480" w:hanging="360"/>
+      </w:pPr>
+      <w:rPr>
+        <w:rFonts w:ascii="Wingdings" w:hAnsi="Wingdings" w:hint="default"/>
+        <w:sz w:val="20"/>
+      </w:rPr>
+    </w:lvl>
+  </w:abstractNum>
+  <w:abstractNum w:abstractNumId="52" w15:restartNumberingAfterBreak="0">
     <w:nsid w:val="7AC77673"/>
     <w:multiLevelType w:val="multilevel"/>
     <w:tmpl w:val="D8EC9284"/>
@@ -42143,25 +43219,25 @@
     <w:abstractNumId w:val="22"/>
   </w:num>
   <w:num w:numId="2" w16cid:durableId="1840542852">
-    <w:abstractNumId w:val="28"/>
+    <w:abstractNumId w:val="29"/>
   </w:num>
   <w:num w:numId="3" w16cid:durableId="1275095667">
     <w:abstractNumId w:val="9"/>
   </w:num>
   <w:num w:numId="4" w16cid:durableId="41558580">
-    <w:abstractNumId w:val="33"/>
+    <w:abstractNumId w:val="34"/>
   </w:num>
   <w:num w:numId="5" w16cid:durableId="207304020">
     <w:abstractNumId w:val="19"/>
   </w:num>
   <w:num w:numId="6" w16cid:durableId="1857386155">
-    <w:abstractNumId w:val="46"/>
+    <w:abstractNumId w:val="48"/>
   </w:num>
   <w:num w:numId="7" w16cid:durableId="1872261165">
-    <w:abstractNumId w:val="37"/>
+    <w:abstractNumId w:val="38"/>
   </w:num>
   <w:num w:numId="8" w16cid:durableId="158471307">
-    <w:abstractNumId w:val="32"/>
+    <w:abstractNumId w:val="33"/>
   </w:num>
   <w:num w:numId="9" w16cid:durableId="1764952692">
     <w:abstractNumId w:val="11"/>
@@ -42170,55 +43246,55 @@
     <w:abstractNumId w:val="20"/>
   </w:num>
   <w:num w:numId="11" w16cid:durableId="1248534509">
-    <w:abstractNumId w:val="25"/>
+    <w:abstractNumId w:val="26"/>
   </w:num>
   <w:num w:numId="12" w16cid:durableId="210503888">
     <w:abstractNumId w:val="17"/>
   </w:num>
   <w:num w:numId="13" w16cid:durableId="1555702285">
-    <w:abstractNumId w:val="38"/>
+    <w:abstractNumId w:val="39"/>
   </w:num>
   <w:num w:numId="14" w16cid:durableId="248271054">
     <w:abstractNumId w:val="13"/>
   </w:num>
   <w:num w:numId="15" w16cid:durableId="1646204645">
-    <w:abstractNumId w:val="41"/>
+    <w:abstractNumId w:val="42"/>
   </w:num>
   <w:num w:numId="16" w16cid:durableId="1903249540">
-    <w:abstractNumId w:val="43"/>
+    <w:abstractNumId w:val="44"/>
   </w:num>
   <w:num w:numId="17" w16cid:durableId="1396002656">
     <w:abstractNumId w:val="10"/>
   </w:num>
   <w:num w:numId="18" w16cid:durableId="106200278">
-    <w:abstractNumId w:val="26"/>
+    <w:abstractNumId w:val="27"/>
   </w:num>
   <w:num w:numId="19" w16cid:durableId="463885504">
-    <w:abstractNumId w:val="34"/>
+    <w:abstractNumId w:val="35"/>
   </w:num>
   <w:num w:numId="20" w16cid:durableId="2133787372">
     <w:abstractNumId w:val="7"/>
   </w:num>
   <w:num w:numId="21" w16cid:durableId="1609922111">
-    <w:abstractNumId w:val="44"/>
+    <w:abstractNumId w:val="45"/>
   </w:num>
   <w:num w:numId="22" w16cid:durableId="1668896990">
     <w:abstractNumId w:val="14"/>
   </w:num>
   <w:num w:numId="23" w16cid:durableId="1796021903">
-    <w:abstractNumId w:val="45"/>
+    <w:abstractNumId w:val="46"/>
   </w:num>
   <w:num w:numId="24" w16cid:durableId="1391226069">
     <w:abstractNumId w:val="0"/>
   </w:num>
   <w:num w:numId="25" w16cid:durableId="857423298">
-    <w:abstractNumId w:val="30"/>
+    <w:abstractNumId w:val="31"/>
   </w:num>
   <w:num w:numId="26" w16cid:durableId="1619019686">
-    <w:abstractNumId w:val="40"/>
+    <w:abstractNumId w:val="41"/>
   </w:num>
   <w:num w:numId="27" w16cid:durableId="1878353781">
-    <w:abstractNumId w:val="40"/>
+    <w:abstractNumId w:val="41"/>
     <w:lvlOverride w:ilvl="0">
       <w:startOverride w:val="1"/>
     </w:lvlOverride>
@@ -42248,7 +43324,7 @@
     </w:lvlOverride>
   </w:num>
   <w:num w:numId="28" w16cid:durableId="353383719">
-    <w:abstractNumId w:val="49"/>
+    <w:abstractNumId w:val="52"/>
     <w:lvlOverride w:ilvl="0">
       <w:startOverride w:val="3"/>
     </w:lvlOverride>
@@ -42281,7 +43357,7 @@
     <w:abstractNumId w:val="5"/>
   </w:num>
   <w:num w:numId="30" w16cid:durableId="1994019352">
-    <w:abstractNumId w:val="47"/>
+    <w:abstractNumId w:val="49"/>
     <w:lvlOverride w:ilvl="0">
       <w:startOverride w:val="1"/>
     </w:lvlOverride>
@@ -42311,10 +43387,10 @@
     </w:lvlOverride>
   </w:num>
   <w:num w:numId="31" w16cid:durableId="1696078723">
-    <w:abstractNumId w:val="48"/>
+    <w:abstractNumId w:val="50"/>
   </w:num>
   <w:num w:numId="32" w16cid:durableId="1111170998">
-    <w:abstractNumId w:val="31"/>
+    <w:abstractNumId w:val="32"/>
   </w:num>
   <w:num w:numId="33" w16cid:durableId="1792938269">
     <w:abstractNumId w:val="2"/>
@@ -42323,16 +43399,16 @@
     <w:abstractNumId w:val="8"/>
   </w:num>
   <w:num w:numId="35" w16cid:durableId="1016495433">
-    <w:abstractNumId w:val="35"/>
+    <w:abstractNumId w:val="36"/>
   </w:num>
   <w:num w:numId="36" w16cid:durableId="1875848394">
-    <w:abstractNumId w:val="39"/>
+    <w:abstractNumId w:val="40"/>
   </w:num>
   <w:num w:numId="37" w16cid:durableId="1604075479">
     <w:abstractNumId w:val="6"/>
   </w:num>
   <w:num w:numId="38" w16cid:durableId="1323120294">
-    <w:abstractNumId w:val="36"/>
+    <w:abstractNumId w:val="37"/>
   </w:num>
   <w:num w:numId="39" w16cid:durableId="1398894379">
     <w:abstractNumId w:val="16"/>
@@ -42344,10 +43420,10 @@
     <w:abstractNumId w:val="23"/>
   </w:num>
   <w:num w:numId="42" w16cid:durableId="1600334535">
-    <w:abstractNumId w:val="29"/>
+    <w:abstractNumId w:val="30"/>
   </w:num>
   <w:num w:numId="43" w16cid:durableId="61222334">
-    <w:abstractNumId w:val="27"/>
+    <w:abstractNumId w:val="28"/>
   </w:num>
   <w:num w:numId="44" w16cid:durableId="2025980791">
     <w:abstractNumId w:val="24"/>
@@ -42359,7 +43435,7 @@
     <w:abstractNumId w:val="15"/>
   </w:num>
   <w:num w:numId="47" w16cid:durableId="2033872056">
-    <w:abstractNumId w:val="42"/>
+    <w:abstractNumId w:val="43"/>
   </w:num>
   <w:num w:numId="48" w16cid:durableId="2102489703">
     <w:abstractNumId w:val="18"/>
@@ -42374,7 +43450,25 @@
     <w:abstractNumId w:val="12"/>
   </w:num>
   <w:num w:numId="52" w16cid:durableId="213783911">
+    <w:abstractNumId w:val="49"/>
+  </w:num>
+  <w:num w:numId="53" w16cid:durableId="1462963260">
+    <w:abstractNumId w:val="36"/>
+    <w:lvlOverride w:ilvl="0">
+      <w:startOverride w:val="3"/>
+    </w:lvlOverride>
+    <w:lvlOverride w:ilvl="1">
+      <w:startOverride w:val="1"/>
+    </w:lvlOverride>
+  </w:num>
+  <w:num w:numId="54" w16cid:durableId="230502457">
     <w:abstractNumId w:val="47"/>
+  </w:num>
+  <w:num w:numId="55" w16cid:durableId="20203624">
+    <w:abstractNumId w:val="25"/>
+  </w:num>
+  <w:num w:numId="56" w16cid:durableId="1740060485">
+    <w:abstractNumId w:val="51"/>
   </w:num>
   <w:numIdMacAtCleanup w:val="51"/>
 </w:numbering>
@@ -42905,7 +43999,6 @@
   <w:style w:type="character" w:default="1" w:styleId="Fuentedeprrafopredeter">
     <w:name w:val="Default Paragraph Font"/>
     <w:uiPriority w:val="1"/>
-    <w:semiHidden/>
     <w:unhideWhenUsed/>
   </w:style>
   <w:style w:type="table" w:default="1" w:styleId="Tablanormal">

</xml_diff>

<commit_message>
Perfile,Patrones de MS y Seguridad del Informe
</commit_message>
<xml_diff>
--- a/DOC/Informe de Tesis Dariel Cabrera Lopez con formato J (1).docx
+++ b/DOC/Informe de Tesis Dariel Cabrera Lopez con formato J (1).docx
@@ -7474,9 +7474,7 @@
           <w:ilvl w:val="0"/>
           <w:numId w:val="0"/>
         </w:numPr>
-        <w:spacing w:line="360" w:lineRule="auto"/>
-        <w:ind w:left="504" w:hanging="504"/>
-        <w:jc w:val="both"/>
+        <w:ind w:left="504"/>
       </w:pPr>
       <w:bookmarkStart w:id="11" w:name="_Toc188911543"/>
       <w:bookmarkStart w:id="12" w:name="_Toc196374700"/>
@@ -7504,8 +7502,6 @@
           <w:ilvl w:val="2"/>
           <w:numId w:val="15"/>
         </w:numPr>
-        <w:spacing w:line="360" w:lineRule="auto"/>
-        <w:jc w:val="both"/>
       </w:pPr>
       <w:bookmarkStart w:id="13" w:name="_Toc188911544"/>
       <w:bookmarkStart w:id="14" w:name="_Toc196374701"/>
@@ -8762,8 +8758,6 @@
     <w:p>
       <w:pPr>
         <w:pStyle w:val="Ttulo3"/>
-        <w:spacing w:line="360" w:lineRule="auto"/>
-        <w:jc w:val="both"/>
       </w:pPr>
       <w:bookmarkStart w:id="23" w:name="_Toc196374704"/>
       <w:r>
@@ -8965,8 +8959,6 @@
     <w:p>
       <w:pPr>
         <w:pStyle w:val="Ttulo3"/>
-        <w:spacing w:line="360" w:lineRule="auto"/>
-        <w:jc w:val="both"/>
       </w:pPr>
       <w:bookmarkStart w:id="25" w:name="_Toc188911546"/>
       <w:bookmarkStart w:id="26" w:name="_Toc196374705"/>
@@ -9123,6 +9115,7 @@
       <w:bookmarkStart w:id="31" w:name="_Toc188911548"/>
       <w:bookmarkStart w:id="32" w:name="_Toc196374709"/>
       <w:r>
+        <w:lastRenderedPageBreak/>
         <w:t>Sistema de Gestión</w:t>
       </w:r>
       <w:bookmarkEnd w:id="31"/>
@@ -9430,7 +9423,6 @@
           <w:rFonts w:eastAsia="Times New Roman"/>
           <w:color w:val="026DA7"/>
         </w:rPr>
-        <w:lastRenderedPageBreak/>
         <w:t>“</w:t>
       </w:r>
       <w:r>
@@ -9487,6 +9479,7 @@
         <w:rPr>
           <w:color w:val="auto"/>
         </w:rPr>
+        <w:lastRenderedPageBreak/>
         <w:t>Las Pruebas se trata básicamente del conjunto de actividades dentro del desarrollo de un software permitiendo así tener procesos, métodos de trabajo y herramientas para identificar oportunamente los defectos en el software, logrando la estabilidad del mismo. Siendo el único instrumento capaz de </w:t>
       </w:r>
       <w:hyperlink r:id="rId43" w:history="1">
@@ -9813,7 +9806,6 @@
           <w:rStyle w:val="Refdecomentario"/>
           <w:rFonts w:eastAsiaTheme="minorHAnsi"/>
           <w:b w:val="0"/>
-          <w:color w:val="auto"/>
           <w:shd w:val="clear" w:color="auto" w:fill="FFFFFF"/>
           <w:lang w:val="es-ES" w:eastAsia="en-US"/>
         </w:rPr>
@@ -9881,8 +9873,6 @@
     <w:p>
       <w:pPr>
         <w:pStyle w:val="Ttulo3"/>
-        <w:spacing w:line="360" w:lineRule="auto"/>
-        <w:jc w:val="both"/>
       </w:pPr>
       <w:bookmarkStart w:id="50" w:name="_Toc188911554"/>
       <w:bookmarkStart w:id="51" w:name="_Toc196374723"/>
@@ -9954,13 +9944,10 @@
     <w:p>
       <w:pPr>
         <w:pStyle w:val="Ttulo3"/>
-        <w:spacing w:line="360" w:lineRule="auto"/>
-        <w:jc w:val="both"/>
       </w:pPr>
       <w:bookmarkStart w:id="52" w:name="_Toc188911555"/>
       <w:bookmarkStart w:id="53" w:name="_Toc196374724"/>
       <w:r>
-        <w:lastRenderedPageBreak/>
         <w:t>Git</w:t>
       </w:r>
       <w:bookmarkEnd w:id="52"/>
@@ -9977,7 +9964,11 @@
         <w:spacing w:line="360" w:lineRule="auto"/>
       </w:pPr>
       <w:r>
-        <w:t>Git es un sistema avanzado de control de versiones, permite rastrear el progreso de un proyecto a lo largo del tiempo ya que hace capturas del mismo a medida que evoluciona y los cambios se van registrando. Esto permite ver qué cambios se hicieron, quién los hizo y por qué, e incluso volver a versiones anteriores. Facilita el trabajo en paralelo de varios participantes e ir haciendo capturas del trabajo de cada uno para luego unirlos.</w:t>
+        <w:t xml:space="preserve">Git es un sistema avanzado de control de versiones, permite rastrear el progreso de un proyecto a lo largo del tiempo ya que hace capturas del mismo a medida que evoluciona y </w:t>
+      </w:r>
+      <w:r>
+        <w:lastRenderedPageBreak/>
+        <w:t>los cambios se van registrando. Esto permite ver qué cambios se hicieron, quién los hizo y por qué, e incluso volver a versiones anteriores. Facilita el trabajo en paralelo de varios participantes e ir haciendo capturas del trabajo de cada uno para luego unirlos.</w:t>
       </w:r>
       <w:r>
         <w:fldChar w:fldCharType="begin"/>
@@ -9998,8 +9989,6 @@
     <w:p>
       <w:pPr>
         <w:pStyle w:val="Ttulo3"/>
-        <w:spacing w:line="360" w:lineRule="auto"/>
-        <w:jc w:val="both"/>
       </w:pPr>
       <w:bookmarkStart w:id="54" w:name="_Toc188911556"/>
       <w:bookmarkStart w:id="55" w:name="_Toc196374725"/>
@@ -10144,8 +10133,6 @@
     <w:p>
       <w:pPr>
         <w:pStyle w:val="Ttulo3"/>
-        <w:spacing w:line="360" w:lineRule="auto"/>
-        <w:jc w:val="both"/>
       </w:pPr>
       <w:bookmarkStart w:id="56" w:name="_Toc188911557"/>
       <w:bookmarkStart w:id="57" w:name="_Toc196374726"/>
@@ -10237,8 +10224,6 @@
     <w:p>
       <w:pPr>
         <w:pStyle w:val="Ttulo3"/>
-        <w:spacing w:line="360" w:lineRule="auto"/>
-        <w:jc w:val="both"/>
       </w:pPr>
       <w:bookmarkStart w:id="58" w:name="_Toc188911558"/>
       <w:bookmarkStart w:id="59" w:name="_Toc196374727"/>
@@ -10326,7 +10311,6 @@
       <w:bookmarkStart w:id="60" w:name="_Toc188911559"/>
       <w:bookmarkStart w:id="61" w:name="_Toc196374728"/>
       <w:r>
-        <w:lastRenderedPageBreak/>
         <w:t>Lenguajes a emplear en el desarrollo del sistema</w:t>
       </w:r>
       <w:bookmarkEnd w:id="60"/>
@@ -10528,7 +10512,11 @@
       </w:r>
       <w:proofErr w:type="spellEnd"/>
       <w:r>
-        <w:t xml:space="preserve"> es una solución a un problema que los desarrolladores enfrentaban y es la creación de interfaces de usuario que pueden ser complejas debido a la cantidad de componentes que cambian frecuentemente con el tiempo y sin tener que escribir mucho código JavaScript. Esta librería comparte muchos aspectos de los </w:t>
+        <w:t xml:space="preserve"> es una solución a un problema que los desarrolladores enfrentaban y es la creación de interfaces de usuario que pueden ser complejas debido a la cantidad de </w:t>
+      </w:r>
+      <w:r>
+        <w:lastRenderedPageBreak/>
+        <w:t xml:space="preserve">componentes que cambian frecuentemente con el tiempo y sin tener que escribir mucho código JavaScript. Esta librería comparte muchos aspectos de los </w:t>
       </w:r>
       <w:proofErr w:type="spellStart"/>
       <w:r>
@@ -10565,8 +10553,6 @@
     <w:p>
       <w:pPr>
         <w:pStyle w:val="Ttulo3"/>
-        <w:spacing w:line="360" w:lineRule="auto"/>
-        <w:jc w:val="both"/>
       </w:pPr>
       <w:bookmarkStart w:id="64" w:name="_Toc188911561"/>
       <w:bookmarkStart w:id="65" w:name="_Toc196374730"/>
@@ -10634,8 +10620,6 @@
     <w:p>
       <w:pPr>
         <w:pStyle w:val="Ttulo3"/>
-        <w:spacing w:line="360" w:lineRule="auto"/>
-        <w:jc w:val="both"/>
       </w:pPr>
       <w:bookmarkStart w:id="66" w:name="_Toc188911562"/>
       <w:bookmarkStart w:id="67" w:name="_Toc196374731"/>
@@ -10687,8 +10671,6 @@
     <w:p>
       <w:pPr>
         <w:pStyle w:val="Ttulo3"/>
-        <w:spacing w:line="360" w:lineRule="auto"/>
-        <w:jc w:val="both"/>
       </w:pPr>
       <w:bookmarkStart w:id="68" w:name="_Toc188911563"/>
       <w:bookmarkStart w:id="69" w:name="_Toc196374732"/>
@@ -10749,13 +10731,10 @@
     <w:p>
       <w:pPr>
         <w:pStyle w:val="Ttulo3"/>
-        <w:spacing w:line="360" w:lineRule="auto"/>
-        <w:jc w:val="both"/>
       </w:pPr>
       <w:bookmarkStart w:id="70" w:name="_Toc188911564"/>
       <w:bookmarkStart w:id="71" w:name="_Toc196374733"/>
       <w:r>
-        <w:lastRenderedPageBreak/>
         <w:t>Mongo DB</w:t>
       </w:r>
       <w:bookmarkEnd w:id="70"/>
@@ -10815,6 +10794,7 @@
       <w:bookmarkStart w:id="72" w:name="_Toc188911565"/>
       <w:bookmarkStart w:id="73" w:name="_Toc196374734"/>
       <w:r>
+        <w:lastRenderedPageBreak/>
         <w:t>Arquitectura Cliente-Servidor</w:t>
       </w:r>
       <w:bookmarkEnd w:id="72"/>
@@ -11019,67 +10999,66 @@
         <w:rPr>
           <w:b/>
         </w:rPr>
+        <w:t>Planeación</w:t>
+      </w:r>
+      <w:r>
+        <w:t xml:space="preserve">: La actividad de planeación comienza escuchando. Escuchar lleva a la creación de algunas historias del usuario que describen la salida necesaria, características y funcionalidad del software que se va a elaborar. Cada historia es escrita por el cliente y colocada en una tarjeta indizada. El cliente asigna un valor (es decir, una prioridad) a la historia con base en el valor general de la característica o función para el negocio. </w:t>
+      </w:r>
+    </w:p>
+    <w:p>
+      <w:pPr>
+        <w:spacing w:line="360" w:lineRule="auto"/>
+      </w:pPr>
+      <w:r>
+        <w:rPr>
+          <w:b/>
+        </w:rPr>
         <w:lastRenderedPageBreak/>
-        <w:t>Planeación</w:t>
-      </w:r>
-      <w:r>
-        <w:t xml:space="preserve">: La actividad de planeación comienza escuchando. Escuchar lleva a la creación de algunas historias del usuario que describen la salida necesaria, características y funcionalidad del software que se va a elaborar. Cada historia es escrita por el cliente y colocada en una tarjeta indizada. El cliente asigna un valor (es decir, una prioridad) a la historia con base en el valor general de la característica o función para el negocio. </w:t>
-      </w:r>
-    </w:p>
-    <w:p>
-      <w:pPr>
-        <w:spacing w:line="360" w:lineRule="auto"/>
-      </w:pPr>
+        <w:t>Diseño</w:t>
+      </w:r>
+      <w:r>
+        <w:t>: El diseño XP sigue rigurosamente el principio MS (mantenlo sencillo). Un diseño sencillo siempre se prefiere sobre una representación más compleja. Además, el diseño guía la implementación de una historia conforme se escribe: nada más y nada menos. Se desalienta el diseño de funcionalidad adicional porque el desarrollador supone que se requerirá después. XP estimula el uso de las tarjetas CRC como un mecanismo eficaz para pensar en el software en un contexto orientado a objetos. Las tarjetas CRC (clase-responsabilidad-colaborador) identifican y organizan las clases orientadas a objetos que son relevantes para el incremento actual de software.</w:t>
+      </w:r>
+    </w:p>
+    <w:p>
       <w:r>
         <w:rPr>
           <w:b/>
         </w:rPr>
-        <w:t>Diseño</w:t>
-      </w:r>
-      <w:r>
-        <w:t>: El diseño XP sigue rigurosamente el principio MS (mantenlo sencillo). Un diseño sencillo siempre se prefiere sobre una representación más compleja. Además, el diseño guía la implementación de una historia conforme se escribe: nada más y nada menos. Se desalienta el diseño de funcionalidad adicional porque el desarrollador supone que se requerirá después. XP estimula el uso de las tarjetas CRC como un mecanismo eficaz para pensar en el software en un contexto orientado a objetos. Las tarjetas CRC (clase-responsabilidad-colaborador) identifican y organizan las clases orientadas a objetos que son relevantes para el incremento actual de software.</w:t>
-      </w:r>
-    </w:p>
-    <w:p>
+        <w:t>Codificación</w:t>
+      </w:r>
+      <w:r>
+        <w:t>: Después de que las historias han sido desarrolladas y de que se ha hecho el trabajo de diseño preliminar, el equipo no inicia la codificación, sino que desarrolla una serie de pruebas unitarias a cada una de las historias que se van a incluir en la entrega en curso (incremento de software).</w:t>
+      </w:r>
+      <w:r>
+        <w:t xml:space="preserve"> </w:t>
+      </w:r>
+      <w:r>
+        <w:t>Una vez creada la prueba unitaria, el desarrollador está mejor capacitado para centrarse en lo que debe implementarse para pasar la prueba. No se agrega nada extraño (MS). Una vez que el código está terminado, se le aplica de inmediato una prueba unitaria, con lo que se obtiene retroalimentación instantánea para los desarrolladores.</w:t>
+      </w:r>
+    </w:p>
+    <w:p>
+      <w:pPr>
+        <w:rPr>
+          <w:color w:val="222222"/>
+        </w:rPr>
+      </w:pPr>
       <w:r>
         <w:rPr>
           <w:b/>
         </w:rPr>
-        <w:t>Codificación</w:t>
-      </w:r>
-      <w:r>
-        <w:t>: Después de que las historias han sido desarrolladas y de que se ha hecho el trabajo de diseño preliminar, el equipo no inicia la codificación, sino que desarrolla una serie de pruebas unitarias a cada una de las historias que se van a incluir en la entrega en curso (incremento de software).</w:t>
-      </w:r>
-      <w:r>
-        <w:t xml:space="preserve"> </w:t>
-      </w:r>
-      <w:r>
-        <w:t>Una vez creada la prueba unitaria, el desarrollador está mejor capacitado para centrarse en lo que debe implementarse para pasar la prueba. No se agrega nada extraño (MS). Una vez que el código está terminado, se le aplica de inmediato una prueba unitaria, con lo que se obtiene retroalimentación instantánea para los desarrolladores.</w:t>
-      </w:r>
-    </w:p>
-    <w:p>
-      <w:pPr>
+        <w:t>Pruebas</w:t>
+      </w:r>
+      <w:r>
+        <w:t>. Las pruebas unitarias que se crean deben implementarse con el uso de una estructura que permita automatizarla. Esto estimula una estrategia de pruebas de regresión, siempre que se modifique el código. A medida que se organizan las pruebas unitarias individuales en un “grupo de prueba universal], las pruebas de la integración y validación del sistema pueden efectuarse a diario. Esto da al equipo XP una indicación continua del avance y también lanza señales de alerta si las cosas marchan mal. Las pruebas de aceptación XP, también llamadas pruebas del cliente, son especificadas por el cliente y se centran en las características y funcionalidad generales del sistema que son visibles y revisables por parte del cliente. Las pruebas de aceptación se derivan de las historias de los usuarios que se han implementado como parte de la liberación del software</w:t>
+      </w:r>
+      <w:r>
         <w:rPr>
           <w:color w:val="222222"/>
         </w:rPr>
-      </w:pPr>
-      <w:r>
-        <w:rPr>
-          <w:b/>
-        </w:rPr>
-        <w:t>Pruebas</w:t>
-      </w:r>
-      <w:r>
-        <w:t>. Las pruebas unitarias que se crean deben implementarse con el uso de una estructura que permita automatizarla. Esto estimula una estrategia de pruebas de regresión, siempre que se modifique el código. A medida que se organizan las pruebas unitarias individuales en un “grupo de prueba universal], las pruebas de la integración y validación del sistema pueden efectuarse a diario. Esto da al equipo XP una indicación continua del avance y también lanza señales de alerta si las cosas marchan mal. Las pruebas de aceptación XP, también llamadas pruebas del cliente, son especificadas por el cliente y se centran en las características y funcionalidad generales del sistema que son visibles y revisables por parte del cliente. Las pruebas de aceptación se derivan de las historias de los usuarios que se han implementado como parte de la liberación del software</w:t>
-      </w:r>
-      <w:r>
-        <w:rPr>
-          <w:color w:val="222222"/>
-        </w:rPr>
         <w:t xml:space="preserve">. </w:t>
       </w:r>
     </w:p>
-    <w:p/>
     <w:p>
       <w:pPr>
         <w:rPr>
@@ -11092,7 +11071,6 @@
           <w:b/>
           <w:bCs/>
         </w:rPr>
-        <w:lastRenderedPageBreak/>
         <w:t>Conclusiones del Capítulo</w:t>
       </w:r>
     </w:p>
@@ -11125,7 +11103,15 @@
           <w:rFonts w:eastAsia="Times New Roman"/>
           <w:color w:val="auto"/>
         </w:rPr>
-        <w:t>, que permiten realizar simulaciones avanzadas de transporte de sedimentos y dinámica costera, aunque presentan limitaciones como altos costos y la necesidad de conocimientos especializados. A nivel nacional, se constató el uso de modelos internacionales en estudios aplicados, pero no se encontró evidencia de un sistema de desarrollo local adaptado a las condiciones específicas de Cuba, lo que resalta la necesidad de alternativas propias y accesibles.</w:t>
+        <w:t xml:space="preserve">, que permiten realizar simulaciones avanzadas de transporte de sedimentos y dinámica costera, aunque presentan limitaciones como altos costos y la necesidad de conocimientos </w:t>
+      </w:r>
+      <w:r>
+        <w:rPr>
+          <w:rFonts w:eastAsia="Times New Roman"/>
+          <w:color w:val="auto"/>
+        </w:rPr>
+        <w:lastRenderedPageBreak/>
+        <w:t>especializados. A nivel nacional, se constató el uso de modelos internacionales en estudios aplicados, pero no se encontró evidencia de un sistema de desarrollo local adaptado a las condiciones específicas de Cuba, lo que resalta la necesidad de alternativas propias y accesibles.</w:t>
       </w:r>
       <w:r>
         <w:rPr>
@@ -11824,17 +11810,6 @@
         </w:rPr>
         <w:t>, teléfonos en campo) puedan comunicarse con el sistema central a través de internet, asegurando accesibilidad, interoperabilidad y eficiencia en la gestión de los datos.</w:t>
       </w:r>
-    </w:p>
-    <w:p>
-      <w:pPr>
-        <w:pStyle w:val="ds-markdown-paragraph"/>
-        <w:jc w:val="both"/>
-        <w:rPr>
-          <w:rFonts w:ascii="Arial" w:hAnsi="Arial" w:cs="Arial"/>
-          <w:sz w:val="22"/>
-          <w:szCs w:val="22"/>
-        </w:rPr>
-      </w:pPr>
     </w:p>
     <w:p>
       <w:pPr>
@@ -12064,11 +12039,11 @@
     </w:p>
     <w:p>
       <w:r>
-        <w:t xml:space="preserve">Las funcionalidades del sistema se refieren al conjunto de funciones que satisfagan las necesidades implícitas o explícitas de los usuarios, al ser utilizado bajo condiciones específicas. Se relaciona directamente con aquello que el software hace para satisfacer </w:t>
+        <w:t xml:space="preserve">Las funcionalidades del sistema se refieren al conjunto de funciones que satisfagan las necesidades implícitas o explícitas de los usuarios, al ser utilizado bajo condiciones específicas. Se relaciona directamente con aquello que el software hace para satisfacer necesidades, mientras que las demás características se refieren al cómo y al cuándo. Evalúa el cumplimiento de requerimientos, la exactitud de los resultados, la seguridad del producto y la </w:t>
       </w:r>
       <w:r>
         <w:lastRenderedPageBreak/>
-        <w:t>necesidades, mientras que las demás características se refieren al cómo y al cuándo. Evalúa el cumplimiento de requerimientos, la exactitud de los resultados, la seguridad del producto y la interacción con otros sistemas.</w:t>
+        <w:t>interacción con otros sistemas.</w:t>
       </w:r>
       <w:r>
         <w:fldChar w:fldCharType="begin"/>
@@ -12872,7 +12847,6 @@
           <w:rFonts w:cs="Arial"/>
           <w:szCs w:val="22"/>
         </w:rPr>
-        <w:lastRenderedPageBreak/>
         <w:t xml:space="preserve"> </w:t>
       </w:r>
       <w:r>
@@ -12921,6 +12895,7 @@
         <w:spacing w:before="100" w:beforeAutospacing="1" w:after="100" w:afterAutospacing="1" w:line="240" w:lineRule="auto"/>
       </w:pPr>
       <w:r>
+        <w:lastRenderedPageBreak/>
         <w:t>Tolerancia a fallos</w:t>
       </w:r>
     </w:p>
@@ -13408,21 +13383,11 @@
     </w:p>
     <w:p>
       <w:pPr>
-        <w:spacing w:before="100" w:beforeAutospacing="1" w:after="100" w:afterAutospacing="1" w:line="240" w:lineRule="auto"/>
-        <w:rPr>
-          <w:b/>
-          <w:bCs/>
-        </w:rPr>
-      </w:pPr>
-    </w:p>
-    <w:p>
-      <w:pPr>
         <w:pStyle w:val="Ttulo2"/>
       </w:pPr>
       <w:bookmarkStart w:id="104" w:name="_Toc193705054"/>
       <w:bookmarkStart w:id="105" w:name="_Toc196374748"/>
       <w:r>
-        <w:lastRenderedPageBreak/>
         <w:t>Historias de Usuarios:</w:t>
       </w:r>
       <w:bookmarkEnd w:id="104"/>
@@ -13442,25 +13407,6 @@
         <w:t xml:space="preserve"> la creación de las pruebas de aceptación</w:t>
       </w:r>
     </w:p>
-    <w:p/>
-    <w:p/>
-    <w:p/>
-    <w:p/>
-    <w:p/>
-    <w:p/>
-    <w:p/>
-    <w:p/>
-    <w:p/>
-    <w:p/>
-    <w:p/>
-    <w:p/>
-    <w:p/>
-    <w:p/>
-    <w:p/>
-    <w:p/>
-    <w:p/>
-    <w:p/>
-    <w:p/>
     <w:tbl>
       <w:tblPr>
         <w:tblStyle w:val="Tablaconcuadrcula"/>
@@ -15258,9 +15204,9 @@
           <w:noProof/>
         </w:rPr>
         <w:drawing>
-          <wp:inline distT="0" distB="0" distL="0" distR="0" wp14:anchorId="5437B684" wp14:editId="7861CD5A">
+          <wp:inline distT="0" distB="0" distL="0" distR="0" wp14:anchorId="5437B684" wp14:editId="68BE3F0A">
             <wp:extent cx="5391150" cy="2457450"/>
-            <wp:effectExtent l="19050" t="19050" r="19050" b="19050"/>
+            <wp:effectExtent l="76200" t="76200" r="133350" b="133350"/>
             <wp:docPr id="49" name="Imagen 49"/>
             <wp:cNvGraphicFramePr>
               <a:graphicFrameLocks xmlns:a="http://schemas.openxmlformats.org/drawingml/2006/main" noChangeAspect="1"/>
@@ -15295,16 +15241,20 @@
                     <a:prstGeom prst="rect">
                       <a:avLst/>
                     </a:prstGeom>
-                    <a:noFill/>
-                    <a:ln w="3175" cmpd="sng">
+                    <a:ln w="38100" cap="sq">
                       <a:solidFill>
                         <a:srgbClr val="000000"/>
                       </a:solidFill>
+                      <a:prstDash val="solid"/>
                       <a:miter lim="800000"/>
-                      <a:headEnd/>
-                      <a:tailEnd/>
                     </a:ln>
-                    <a:effectLst/>
+                    <a:effectLst>
+                      <a:outerShdw blurRad="50800" dist="38100" dir="2700000" algn="tl" rotWithShape="0">
+                        <a:srgbClr val="000000">
+                          <a:alpha val="43000"/>
+                        </a:srgbClr>
+                      </a:outerShdw>
+                    </a:effectLst>
                   </pic:spPr>
                 </pic:pic>
               </a:graphicData>
@@ -15331,7 +15281,6 @@
         <w:t>Figura 2.1 Modelo Vista Controlador</w:t>
       </w:r>
     </w:p>
-    <w:p/>
     <w:p>
       <w:pPr>
         <w:pStyle w:val="Ttulo2"/>
@@ -17387,7 +17336,6 @@
           <w:rStyle w:val="Refdecomentario"/>
           <w:rFonts w:eastAsiaTheme="minorHAnsi"/>
           <w:b w:val="0"/>
-          <w:color w:val="auto"/>
           <w:shd w:val="clear" w:color="auto" w:fill="FFFFFF"/>
           <w:lang w:val="es-ES" w:eastAsia="en-US"/>
         </w:rPr>
@@ -17457,37 +17405,59 @@
     </w:p>
     <w:p>
       <w:pPr>
-        <w:pStyle w:val="Ttulo3"/>
-        <w:numPr>
-          <w:ilvl w:val="0"/>
-          <w:numId w:val="0"/>
-        </w:numPr>
-        <w:ind w:left="504" w:hanging="504"/>
-        <w:rPr>
-          <w:lang w:val="es-ES"/>
-        </w:rPr>
-      </w:pPr>
-      <w:r>
-        <w:rPr>
-          <w:lang w:val="es-ES"/>
-        </w:rPr>
-        <w:t xml:space="preserve"> Patrón SAGA</w:t>
-      </w:r>
-    </w:p>
-    <w:p>
-      <w:pPr>
         <w:tabs>
           <w:tab w:val="left" w:pos="2067"/>
         </w:tabs>
-        <w:rPr>
-          <w:lang w:val="es-ES"/>
-        </w:rPr>
-      </w:pPr>
-      <w:r>
-        <w:rPr>
-          <w:lang w:val="es-ES"/>
-        </w:rPr>
-        <w:t>El patrón SAGA propone una alternativa al uso de transacciones distribuidas tradicionales, mediante la coordinación de una serie de transacciones locales que, ejecutadas en secuencia, logran mantener la consistencia del sistema. Cada transacción debe contar con una acción compensatoria que revierta los efectos en caso de fallo.</w:t>
+      </w:pPr>
+      <w:r>
+        <w:t xml:space="preserve">El patrón </w:t>
+      </w:r>
+      <w:proofErr w:type="spellStart"/>
+      <w:r>
+        <w:rPr>
+          <w:b/>
+          <w:bCs/>
+        </w:rPr>
+        <w:t>Circuit</w:t>
+      </w:r>
+      <w:proofErr w:type="spellEnd"/>
+      <w:r>
+        <w:rPr>
+          <w:b/>
+          <w:bCs/>
+        </w:rPr>
+        <w:t xml:space="preserve"> Breaker</w:t>
+      </w:r>
+      <w:r>
+        <w:t xml:space="preserve"> (disyuntor) se implementa directamente en el sistema para mejorar la </w:t>
+      </w:r>
+      <w:r>
+        <w:rPr>
+          <w:b/>
+          <w:bCs/>
+        </w:rPr>
+        <w:t>resiliencia</w:t>
+      </w:r>
+      <w:r>
+        <w:t xml:space="preserve"> del microservicio </w:t>
+      </w:r>
+      <w:proofErr w:type="spellStart"/>
+      <w:r>
+        <w:t>gateway</w:t>
+      </w:r>
+      <w:proofErr w:type="spellEnd"/>
+      <w:r>
+        <w:t xml:space="preserve">, que actúa como intermediario entre el cliente y el microservicio de cálculo. Su función es </w:t>
+      </w:r>
+      <w:r>
+        <w:rPr>
+          <w:b/>
+          <w:bCs/>
+        </w:rPr>
+        <w:t>detectar fallos repetidos</w:t>
+      </w:r>
+      <w:r>
+        <w:t xml:space="preserve"> en la comunicación con servicios remotos y suspender temporalmente las solicitudes hacia ellos, previniendo una degradación generalizada del sistema.</w:t>
       </w:r>
     </w:p>
     <w:p>
@@ -17496,35 +17466,39 @@
           <w:tab w:val="left" w:pos="2067"/>
         </w:tabs>
         <w:rPr>
-          <w:lang w:val="es-ES"/>
-        </w:rPr>
-      </w:pPr>
-      <w:r>
-        <w:rPr>
-          <w:lang w:val="es-ES"/>
-        </w:rPr>
-        <w:t xml:space="preserve">En el sistema de cálculo de sedimentos, este patrón se propone para coordinar operaciones entre el microservicio </w:t>
-      </w:r>
-      <w:proofErr w:type="spellStart"/>
-      <w:r>
-        <w:rPr>
-          <w:lang w:val="es-ES"/>
-        </w:rPr>
-        <w:t>gateway</w:t>
-      </w:r>
-      <w:proofErr w:type="spellEnd"/>
-      <w:r>
-        <w:rPr>
-          <w:lang w:val="es-ES"/>
-        </w:rPr>
-        <w:t xml:space="preserve"> (responsable de autenticación, configuración y control de acceso) y el microservicio de cálculo. Dado que las operaciones del sistema pueden implicar múltiples pasos </w:t>
-      </w:r>
-      <w:r>
-        <w:rPr>
-          <w:lang w:val="es-ES"/>
-        </w:rPr>
-        <w:lastRenderedPageBreak/>
-        <w:t>secuenciales —por ejemplo, autenticación del usuario, validación de datos, obtención de parámetros de configuración y ejecución de algoritmos de cálculo—, se requiere garantizar que, ante fallos, el sistema mantenga la coherencia del flujo.</w:t>
+          <w:b/>
+          <w:bCs/>
+        </w:rPr>
+      </w:pPr>
+      <w:r>
+        <w:t xml:space="preserve">El patrón </w:t>
+      </w:r>
+      <w:r>
+        <w:rPr>
+          <w:b/>
+          <w:bCs/>
+        </w:rPr>
+        <w:t>SAGA</w:t>
+      </w:r>
+      <w:r>
+        <w:t xml:space="preserve"> permite manejar la consistencia en procesos distribuidos que abarcan varios servicios. En este sistema, aunque </w:t>
+      </w:r>
+      <w:r>
+        <w:rPr>
+          <w:b/>
+          <w:bCs/>
+        </w:rPr>
+        <w:t>no se implementa un orquestador centralizado</w:t>
+      </w:r>
+      <w:r>
+        <w:t xml:space="preserve">, se aplica una forma de </w:t>
+      </w:r>
+      <w:r>
+        <w:rPr>
+          <w:b/>
+          <w:bCs/>
+        </w:rPr>
+        <w:t>coreografía de eventos</w:t>
       </w:r>
     </w:p>
     <w:p>
@@ -17540,21 +17514,88 @@
         <w:rPr>
           <w:lang w:val="es-ES"/>
         </w:rPr>
-        <w:t xml:space="preserve">Se propone el uso del enfoque de Orquestación, donde un orquestador centralizado dirige cada transacción, notifica el éxito o fallo de las acciones y coordina las compensaciones necesarias. Por ejemplo, si un usuario inicia un </w:t>
-      </w:r>
-      <w:proofErr w:type="gramStart"/>
-      <w:r>
-        <w:rPr>
+        <w:lastRenderedPageBreak/>
+        <w:t xml:space="preserve">La incorporación de los patrones </w:t>
+      </w:r>
+      <w:proofErr w:type="spellStart"/>
+      <w:r>
+        <w:rPr>
+          <w:b/>
+          <w:bCs/>
           <w:lang w:val="es-ES"/>
         </w:rPr>
-        <w:t>cálculo</w:t>
-      </w:r>
-      <w:proofErr w:type="gramEnd"/>
-      <w:r>
-        <w:rPr>
+        <w:t>Circuit</w:t>
+      </w:r>
+      <w:proofErr w:type="spellEnd"/>
+      <w:r>
+        <w:rPr>
+          <w:b/>
+          <w:bCs/>
           <w:lang w:val="es-ES"/>
         </w:rPr>
-        <w:t xml:space="preserve"> pero se detecta inconsistencia en la configuración o falla la ejecución del algoritmo, el orquestador se encarga de notificar los módulos afectados y deshacer operaciones previas.</w:t>
+        <w:t xml:space="preserve"> Breaker</w:t>
+      </w:r>
+      <w:r>
+        <w:rPr>
+          <w:lang w:val="es-ES"/>
+        </w:rPr>
+        <w:t xml:space="preserve"> y </w:t>
+      </w:r>
+      <w:r>
+        <w:rPr>
+          <w:b/>
+          <w:bCs/>
+          <w:lang w:val="es-ES"/>
+        </w:rPr>
+        <w:t>SAGA por eventos</w:t>
+      </w:r>
+      <w:r>
+        <w:rPr>
+          <w:lang w:val="es-ES"/>
+        </w:rPr>
+        <w:t xml:space="preserve"> (demuestra una clara orientación del sistema hacia la </w:t>
+      </w:r>
+      <w:r>
+        <w:rPr>
+          <w:b/>
+          <w:bCs/>
+          <w:lang w:val="es-ES"/>
+        </w:rPr>
+        <w:t>resiliencia</w:t>
+      </w:r>
+      <w:r>
+        <w:rPr>
+          <w:lang w:val="es-ES"/>
+        </w:rPr>
+        <w:t xml:space="preserve">, </w:t>
+      </w:r>
+      <w:r>
+        <w:rPr>
+          <w:b/>
+          <w:bCs/>
+          <w:lang w:val="es-ES"/>
+        </w:rPr>
+        <w:t>tolerancia a fallos</w:t>
+      </w:r>
+      <w:r>
+        <w:rPr>
+          <w:lang w:val="es-ES"/>
+        </w:rPr>
+        <w:t xml:space="preserve"> y </w:t>
+      </w:r>
+      <w:r>
+        <w:rPr>
+          <w:b/>
+          <w:bCs/>
+          <w:lang w:val="es-ES"/>
+        </w:rPr>
+        <w:t>coherencia distribuida</w:t>
+      </w:r>
+      <w:r>
+        <w:rPr>
+          <w:lang w:val="es-ES"/>
+        </w:rPr>
+        <w:t>. Aunque la lógica de compensación no se ha desarrollado por completo, la infraestructura está preparada para extenderse bajo el enfoque de coreografía o evolucionar hacia una orquestación más robusta.</w:t>
       </w:r>
     </w:p>
     <w:p>
@@ -17563,36 +17604,6 @@
           <w:tab w:val="left" w:pos="2067"/>
         </w:tabs>
         <w:rPr>
-          <w:lang w:val="en-US"/>
-        </w:rPr>
-      </w:pPr>
-      <w:proofErr w:type="spellStart"/>
-      <w:r>
-        <w:rPr>
-          <w:b/>
-          <w:bCs/>
-          <w:lang w:val="en-US"/>
-        </w:rPr>
-        <w:t>Ventajas</w:t>
-      </w:r>
-      <w:proofErr w:type="spellEnd"/>
-      <w:r>
-        <w:rPr>
-          <w:lang w:val="en-US"/>
-        </w:rPr>
-        <w:t>:</w:t>
-      </w:r>
-    </w:p>
-    <w:p>
-      <w:pPr>
-        <w:numPr>
-          <w:ilvl w:val="0"/>
-          <w:numId w:val="46"/>
-        </w:numPr>
-        <w:tabs>
-          <w:tab w:val="left" w:pos="2067"/>
-        </w:tabs>
-        <w:rPr>
           <w:lang w:val="es-ES"/>
         </w:rPr>
       </w:pPr>
@@ -17600,665 +17611,49 @@
         <w:rPr>
           <w:lang w:val="es-ES"/>
         </w:rPr>
-        <w:t>Ideal para flujos complejos como el proceso de cálculo de sedimento, donde varios servicios intervienen.</w:t>
-      </w:r>
-    </w:p>
-    <w:p>
-      <w:pPr>
-        <w:numPr>
-          <w:ilvl w:val="0"/>
-          <w:numId w:val="46"/>
-        </w:numPr>
-        <w:tabs>
-          <w:tab w:val="left" w:pos="2067"/>
-        </w:tabs>
-        <w:rPr>
-          <w:lang w:val="es-ES"/>
-        </w:rPr>
-      </w:pPr>
-      <w:r>
-        <w:rPr>
-          <w:lang w:val="es-ES"/>
-        </w:rPr>
-        <w:t>Centraliza la lógica de coordinación, facilitando su seguimiento y auditoría.</w:t>
-      </w:r>
-    </w:p>
-    <w:p>
-      <w:pPr>
-        <w:numPr>
-          <w:ilvl w:val="0"/>
-          <w:numId w:val="46"/>
-        </w:numPr>
-        <w:tabs>
-          <w:tab w:val="left" w:pos="2067"/>
-        </w:tabs>
-        <w:rPr>
-          <w:lang w:val="es-ES"/>
-        </w:rPr>
-      </w:pPr>
-      <w:r>
-        <w:rPr>
-          <w:lang w:val="es-ES"/>
-        </w:rPr>
-        <w:t>Reduce el acoplamiento entre servicios, mejorando la mantenibilidad.</w:t>
-      </w:r>
-    </w:p>
-    <w:p>
-      <w:pPr>
-        <w:tabs>
-          <w:tab w:val="left" w:pos="2067"/>
-        </w:tabs>
-        <w:rPr>
-          <w:lang w:val="en-US"/>
-        </w:rPr>
-      </w:pPr>
-      <w:proofErr w:type="spellStart"/>
-      <w:r>
-        <w:rPr>
-          <w:b/>
-          <w:bCs/>
-          <w:lang w:val="en-US"/>
-        </w:rPr>
-        <w:t>Desventaja</w:t>
-      </w:r>
-      <w:proofErr w:type="spellEnd"/>
-      <w:r>
-        <w:rPr>
-          <w:lang w:val="en-US"/>
-        </w:rPr>
-        <w:t>:</w:t>
-      </w:r>
-    </w:p>
-    <w:p>
-      <w:pPr>
-        <w:numPr>
-          <w:ilvl w:val="0"/>
-          <w:numId w:val="47"/>
-        </w:numPr>
-        <w:tabs>
-          <w:tab w:val="left" w:pos="2067"/>
-        </w:tabs>
-        <w:rPr>
-          <w:lang w:val="es-ES"/>
-        </w:rPr>
-      </w:pPr>
-      <w:r>
-        <w:rPr>
-          <w:lang w:val="es-ES"/>
-        </w:rPr>
-        <w:t xml:space="preserve">Si el </w:t>
-      </w:r>
-      <w:proofErr w:type="gramStart"/>
-      <w:r>
-        <w:rPr>
-          <w:lang w:val="es-ES"/>
-        </w:rPr>
-        <w:t>orquestador falla</w:t>
-      </w:r>
-      <w:proofErr w:type="gramEnd"/>
-      <w:r>
-        <w:rPr>
-          <w:lang w:val="es-ES"/>
-        </w:rPr>
-        <w:t>, puede afectar a todo el sistema; por ello, su diseño debe ser robusto y enfocado exclusivamente en la coordinación, no en lógica de negocio.</w:t>
-      </w:r>
-    </w:p>
-    <w:p>
-      <w:pPr>
-        <w:pStyle w:val="Ttulo3"/>
-        <w:numPr>
-          <w:ilvl w:val="0"/>
-          <w:numId w:val="0"/>
-        </w:numPr>
-        <w:ind w:left="504" w:hanging="504"/>
-        <w:rPr>
-          <w:lang w:val="es-ES"/>
-        </w:rPr>
-      </w:pPr>
-      <w:r>
-        <w:rPr>
-          <w:lang w:val="es-ES"/>
-        </w:rPr>
-        <w:t xml:space="preserve">Patrón </w:t>
-      </w:r>
-      <w:proofErr w:type="spellStart"/>
-      <w:r>
-        <w:rPr>
-          <w:lang w:val="es-ES"/>
-        </w:rPr>
-        <w:t>Circuit</w:t>
-      </w:r>
-      <w:proofErr w:type="spellEnd"/>
-      <w:r>
-        <w:rPr>
-          <w:lang w:val="es-ES"/>
-        </w:rPr>
-        <w:t xml:space="preserve"> Breaker</w:t>
-      </w:r>
-    </w:p>
-    <w:p>
-      <w:pPr>
-        <w:tabs>
-          <w:tab w:val="left" w:pos="2067"/>
-        </w:tabs>
-        <w:rPr>
-          <w:lang w:val="es-ES"/>
-        </w:rPr>
-      </w:pPr>
-      <w:r>
-        <w:rPr>
-          <w:lang w:val="es-ES"/>
-        </w:rPr>
-        <w:t xml:space="preserve">El patrón </w:t>
-      </w:r>
-      <w:proofErr w:type="spellStart"/>
-      <w:r>
-        <w:rPr>
-          <w:lang w:val="es-ES"/>
-        </w:rPr>
-        <w:t>Circuit</w:t>
-      </w:r>
-      <w:proofErr w:type="spellEnd"/>
-      <w:r>
-        <w:rPr>
-          <w:lang w:val="es-ES"/>
-        </w:rPr>
-        <w:t xml:space="preserve"> Breaker se implementa para aumentar la resiliencia del sistema, evitando que los microservicios continúen enviando solicitudes a servicios que están fallando. Funciona como un disyuntor que monitorea el número de fallos y corta el tráfico a servicios inestables hasta que se recuperen.</w:t>
-      </w:r>
-    </w:p>
-    <w:p>
-      <w:pPr>
-        <w:tabs>
-          <w:tab w:val="left" w:pos="2067"/>
-        </w:tabs>
-        <w:rPr>
-          <w:lang w:val="es-ES"/>
-        </w:rPr>
-      </w:pPr>
-      <w:r>
-        <w:rPr>
-          <w:lang w:val="es-ES"/>
-        </w:rPr>
-        <w:t xml:space="preserve">En el sistema, este patrón puede aplicarse entre el </w:t>
-      </w:r>
-      <w:proofErr w:type="spellStart"/>
-      <w:r>
-        <w:rPr>
-          <w:lang w:val="es-ES"/>
-        </w:rPr>
-        <w:t>gateway</w:t>
-      </w:r>
-      <w:proofErr w:type="spellEnd"/>
-      <w:r>
-        <w:rPr>
-          <w:lang w:val="es-ES"/>
-        </w:rPr>
-        <w:t xml:space="preserve"> y el microservicio de cálculo, dado que este último puede implicar operaciones intensivas en CPU o en lectura de datos, propensas a latencia o errores si los recursos se saturan.</w:t>
-      </w:r>
-    </w:p>
-    <w:p>
-      <w:pPr>
-        <w:tabs>
-          <w:tab w:val="left" w:pos="2067"/>
-        </w:tabs>
-        <w:rPr>
-          <w:lang w:val="es-ES"/>
-        </w:rPr>
-      </w:pPr>
-      <w:r>
-        <w:rPr>
-          <w:lang w:val="es-ES"/>
-        </w:rPr>
-        <w:t xml:space="preserve">Supongamos que el microservicio de cálculo se encuentra bajo alta carga o tiene un error de procesamiento: el </w:t>
-      </w:r>
-      <w:proofErr w:type="spellStart"/>
-      <w:r>
-        <w:rPr>
-          <w:lang w:val="es-ES"/>
-        </w:rPr>
-        <w:t>Circuit</w:t>
-      </w:r>
-      <w:proofErr w:type="spellEnd"/>
-      <w:r>
-        <w:rPr>
-          <w:lang w:val="es-ES"/>
-        </w:rPr>
-        <w:t xml:space="preserve"> Breaker evitará seguir enviando solicitudes, permitiendo que el sistema degrade su servicio de forma controlada, por ejemplo, devolviendo respuestas en caché, errores personalizados o notificaciones de mantenimiento</w:t>
-      </w:r>
-      <w:r>
-        <w:rPr>
-          <w:lang w:val="es-ES"/>
-        </w:rPr>
-        <w:t>.</w:t>
-      </w:r>
-    </w:p>
-    <w:p>
-      <w:pPr>
-        <w:tabs>
-          <w:tab w:val="left" w:pos="2067"/>
-        </w:tabs>
-        <w:rPr>
-          <w:lang w:val="en-US"/>
-        </w:rPr>
-      </w:pPr>
-      <w:proofErr w:type="spellStart"/>
-      <w:r>
-        <w:rPr>
-          <w:b/>
-          <w:bCs/>
-          <w:lang w:val="en-US"/>
-        </w:rPr>
-        <w:lastRenderedPageBreak/>
-        <w:t>Componentes</w:t>
-      </w:r>
-      <w:proofErr w:type="spellEnd"/>
-      <w:r>
-        <w:rPr>
-          <w:b/>
-          <w:bCs/>
-          <w:lang w:val="en-US"/>
-        </w:rPr>
-        <w:t xml:space="preserve"> clave</w:t>
-      </w:r>
-      <w:r>
-        <w:rPr>
-          <w:lang w:val="en-US"/>
-        </w:rPr>
-        <w:t>:</w:t>
-      </w:r>
-    </w:p>
-    <w:p>
-      <w:pPr>
-        <w:numPr>
-          <w:ilvl w:val="0"/>
-          <w:numId w:val="48"/>
-        </w:numPr>
-        <w:tabs>
-          <w:tab w:val="left" w:pos="2067"/>
-        </w:tabs>
-        <w:rPr>
-          <w:lang w:val="es-ES"/>
-        </w:rPr>
-      </w:pPr>
+        <w:t xml:space="preserve">Esto posiciona al sistema como </w:t>
+      </w:r>
       <w:r>
         <w:rPr>
           <w:b/>
           <w:bCs/>
           <w:lang w:val="es-ES"/>
         </w:rPr>
-        <w:t>Disyuntor</w:t>
+        <w:t>escalable y preparado</w:t>
       </w:r>
       <w:r>
         <w:rPr>
           <w:lang w:val="es-ES"/>
         </w:rPr>
-        <w:t>: encapsula llamadas hacia el microservicio de cálculo.</w:t>
-      </w:r>
-    </w:p>
-    <w:p>
-      <w:pPr>
-        <w:numPr>
-          <w:ilvl w:val="0"/>
-          <w:numId w:val="48"/>
-        </w:numPr>
-        <w:tabs>
-          <w:tab w:val="left" w:pos="2067"/>
-        </w:tabs>
+        <w:t xml:space="preserve"> para soportar escenarios complejos de integración y procesamiento distribuido, esenciales para la correcta gestión de cálculos científicos en entornos multiusuario y </w:t>
+      </w:r>
+      <w:proofErr w:type="spellStart"/>
+      <w:r>
         <w:rPr>
           <w:lang w:val="es-ES"/>
         </w:rPr>
-      </w:pPr>
-      <w:r>
-        <w:rPr>
-          <w:b/>
-          <w:bCs/>
+        <w:t>multientidad</w:t>
+      </w:r>
+      <w:proofErr w:type="spellEnd"/>
+      <w:r>
+        <w:rPr>
           <w:lang w:val="es-ES"/>
         </w:rPr>
-        <w:t>Umbral</w:t>
-      </w:r>
-      <w:r>
+        <w:t>.</w:t>
+      </w:r>
+    </w:p>
+    <w:p>
+      <w:pPr>
+        <w:pStyle w:val="Ttulo2"/>
         <w:rPr>
           <w:lang w:val="es-ES"/>
         </w:rPr>
-        <w:t>: número de fallos permitidos antes de cortar el servicio (por ejemplo, 3 errores consecutivos).</w:t>
-      </w:r>
-    </w:p>
-    <w:p>
-      <w:pPr>
-        <w:numPr>
-          <w:ilvl w:val="0"/>
-          <w:numId w:val="48"/>
-        </w:numPr>
-        <w:tabs>
-          <w:tab w:val="left" w:pos="2067"/>
-        </w:tabs>
+      </w:pPr>
+      <w:r>
         <w:rPr>
           <w:lang w:val="es-ES"/>
         </w:rPr>
-      </w:pPr>
-      <w:r>
-        <w:rPr>
-          <w:b/>
-          <w:bCs/>
-          <w:lang w:val="es-ES"/>
-        </w:rPr>
-        <w:t>Tiempo de recuperación</w:t>
-      </w:r>
-      <w:r>
-        <w:rPr>
-          <w:lang w:val="es-ES"/>
-        </w:rPr>
-        <w:t>: intervalo antes de reintentar acceder al servicio (por ejemplo, 1 minuto).</w:t>
-      </w:r>
-    </w:p>
-    <w:p>
-      <w:pPr>
-        <w:numPr>
-          <w:ilvl w:val="0"/>
-          <w:numId w:val="48"/>
-        </w:numPr>
-        <w:tabs>
-          <w:tab w:val="left" w:pos="2067"/>
-        </w:tabs>
-        <w:rPr>
-          <w:lang w:val="es-ES"/>
-        </w:rPr>
-      </w:pPr>
-      <w:r>
-        <w:rPr>
-          <w:b/>
-          <w:bCs/>
-          <w:lang w:val="es-ES"/>
-        </w:rPr>
-        <w:t>Estados</w:t>
-      </w:r>
-      <w:r>
-        <w:rPr>
-          <w:lang w:val="es-ES"/>
-        </w:rPr>
-        <w:t xml:space="preserve">: Cerrado (funciona normalmente), Abierto (no se permiten llamadas), </w:t>
-      </w:r>
-      <w:proofErr w:type="spellStart"/>
-      <w:r>
-        <w:rPr>
-          <w:lang w:val="es-ES"/>
-        </w:rPr>
-        <w:t>Semi-abierto</w:t>
-      </w:r>
-      <w:proofErr w:type="spellEnd"/>
-      <w:r>
-        <w:rPr>
-          <w:lang w:val="es-ES"/>
-        </w:rPr>
-        <w:t xml:space="preserve"> (se permiten algunas llamadas para evaluar la recuperación).</w:t>
-      </w:r>
-    </w:p>
-    <w:p>
-      <w:pPr>
-        <w:tabs>
-          <w:tab w:val="left" w:pos="2067"/>
-        </w:tabs>
-        <w:rPr>
-          <w:lang w:val="en-US"/>
-        </w:rPr>
-      </w:pPr>
-      <w:proofErr w:type="spellStart"/>
-      <w:r>
-        <w:rPr>
-          <w:b/>
-          <w:bCs/>
-          <w:lang w:val="en-US"/>
-        </w:rPr>
-        <w:t>Ventajas</w:t>
-      </w:r>
-      <w:proofErr w:type="spellEnd"/>
-      <w:r>
-        <w:rPr>
-          <w:lang w:val="en-US"/>
-        </w:rPr>
-        <w:t>:</w:t>
-      </w:r>
-    </w:p>
-    <w:p>
-      <w:pPr>
-        <w:numPr>
-          <w:ilvl w:val="0"/>
-          <w:numId w:val="49"/>
-        </w:numPr>
-        <w:tabs>
-          <w:tab w:val="left" w:pos="2067"/>
-        </w:tabs>
-        <w:rPr>
-          <w:lang w:val="es-ES"/>
-        </w:rPr>
-      </w:pPr>
-      <w:r>
-        <w:rPr>
-          <w:lang w:val="es-ES"/>
-        </w:rPr>
-        <w:t>Mejora la disponibilidad general del sistema, aislando servicios defectuosos.</w:t>
-      </w:r>
-    </w:p>
-    <w:p>
-      <w:pPr>
-        <w:numPr>
-          <w:ilvl w:val="0"/>
-          <w:numId w:val="49"/>
-        </w:numPr>
-        <w:tabs>
-          <w:tab w:val="left" w:pos="2067"/>
-        </w:tabs>
-        <w:rPr>
-          <w:lang w:val="en-US"/>
-        </w:rPr>
-      </w:pPr>
-      <w:r>
-        <w:rPr>
-          <w:lang w:val="en-US"/>
-        </w:rPr>
-        <w:t xml:space="preserve">Evita </w:t>
-      </w:r>
-      <w:proofErr w:type="spellStart"/>
-      <w:r>
-        <w:rPr>
-          <w:lang w:val="en-US"/>
-        </w:rPr>
-        <w:t>saturar</w:t>
-      </w:r>
-      <w:proofErr w:type="spellEnd"/>
-      <w:r>
-        <w:rPr>
-          <w:lang w:val="en-US"/>
-        </w:rPr>
-        <w:t xml:space="preserve"> </w:t>
-      </w:r>
-      <w:proofErr w:type="spellStart"/>
-      <w:r>
-        <w:rPr>
-          <w:lang w:val="en-US"/>
-        </w:rPr>
-        <w:t>microservicios</w:t>
-      </w:r>
-      <w:proofErr w:type="spellEnd"/>
-      <w:r>
-        <w:rPr>
-          <w:lang w:val="en-US"/>
-        </w:rPr>
-        <w:t xml:space="preserve"> </w:t>
-      </w:r>
-      <w:proofErr w:type="spellStart"/>
-      <w:r>
-        <w:rPr>
-          <w:lang w:val="en-US"/>
-        </w:rPr>
-        <w:t>inestables</w:t>
-      </w:r>
-      <w:proofErr w:type="spellEnd"/>
-      <w:r>
-        <w:rPr>
-          <w:lang w:val="en-US"/>
-        </w:rPr>
-        <w:t>.</w:t>
-      </w:r>
-    </w:p>
-    <w:p>
-      <w:pPr>
-        <w:numPr>
-          <w:ilvl w:val="0"/>
-          <w:numId w:val="49"/>
-        </w:numPr>
-        <w:tabs>
-          <w:tab w:val="left" w:pos="2067"/>
-        </w:tabs>
-        <w:rPr>
-          <w:lang w:val="es-ES"/>
-        </w:rPr>
-      </w:pPr>
-      <w:r>
-        <w:rPr>
-          <w:lang w:val="es-ES"/>
-        </w:rPr>
-        <w:t>Permite aplicar estrategias de respuesta alternativas (</w:t>
-      </w:r>
-      <w:proofErr w:type="spellStart"/>
-      <w:r>
-        <w:rPr>
-          <w:lang w:val="es-ES"/>
-        </w:rPr>
-        <w:t>fallbacks</w:t>
-      </w:r>
-      <w:proofErr w:type="spellEnd"/>
-      <w:r>
-        <w:rPr>
-          <w:lang w:val="es-ES"/>
-        </w:rPr>
-        <w:t>).</w:t>
-      </w:r>
-    </w:p>
-    <w:p>
-      <w:pPr>
-        <w:tabs>
-          <w:tab w:val="left" w:pos="2067"/>
-        </w:tabs>
-        <w:rPr>
-          <w:lang w:val="en-US"/>
-        </w:rPr>
-      </w:pPr>
-      <w:proofErr w:type="spellStart"/>
-      <w:r>
-        <w:rPr>
-          <w:b/>
-          <w:bCs/>
-          <w:lang w:val="en-US"/>
-        </w:rPr>
-        <w:t>Desventaja</w:t>
-      </w:r>
-      <w:proofErr w:type="spellEnd"/>
-      <w:r>
-        <w:rPr>
-          <w:lang w:val="en-US"/>
-        </w:rPr>
-        <w:t>:</w:t>
-      </w:r>
-    </w:p>
-    <w:p>
-      <w:pPr>
-        <w:numPr>
-          <w:ilvl w:val="0"/>
-          <w:numId w:val="50"/>
-        </w:numPr>
-        <w:tabs>
-          <w:tab w:val="left" w:pos="2067"/>
-        </w:tabs>
-        <w:rPr>
-          <w:lang w:val="es-ES"/>
-        </w:rPr>
-      </w:pPr>
-      <w:r>
-        <w:rPr>
-          <w:lang w:val="es-ES"/>
-        </w:rPr>
-        <w:t>Elegir mal los tiempos o umbrales puede ocasionar falsos positivos o latencia adicional.</w:t>
-      </w:r>
-    </w:p>
-    <w:p>
-      <w:pPr>
-        <w:tabs>
-          <w:tab w:val="left" w:pos="2067"/>
-        </w:tabs>
-        <w:rPr>
-          <w:lang w:val="es-ES"/>
-        </w:rPr>
-      </w:pPr>
-      <w:r>
-        <w:rPr>
-          <w:lang w:val="es-ES"/>
-        </w:rPr>
-        <w:t xml:space="preserve">La incorporación de los patrones </w:t>
-      </w:r>
-      <w:r>
-        <w:rPr>
-          <w:b/>
-          <w:bCs/>
-          <w:lang w:val="es-ES"/>
-        </w:rPr>
-        <w:t>SAGA (Orquestación)</w:t>
-      </w:r>
-      <w:r>
-        <w:rPr>
-          <w:lang w:val="es-ES"/>
-        </w:rPr>
-        <w:t xml:space="preserve"> y </w:t>
-      </w:r>
-      <w:proofErr w:type="spellStart"/>
-      <w:r>
-        <w:rPr>
-          <w:b/>
-          <w:bCs/>
-          <w:lang w:val="es-ES"/>
-        </w:rPr>
-        <w:t>Circuit</w:t>
-      </w:r>
-      <w:proofErr w:type="spellEnd"/>
-      <w:r>
-        <w:rPr>
-          <w:b/>
-          <w:bCs/>
-          <w:lang w:val="es-ES"/>
-        </w:rPr>
-        <w:t xml:space="preserve"> Breaker</w:t>
-      </w:r>
-      <w:r>
-        <w:rPr>
-          <w:lang w:val="es-ES"/>
-        </w:rPr>
-        <w:t xml:space="preserve"> al sistema para </w:t>
-      </w:r>
-      <w:r>
-        <w:rPr>
-          <w:lang w:val="es-ES"/>
-        </w:rPr>
-        <w:t>la gestión del cálculo del transporte de sedimentos</w:t>
-      </w:r>
-      <w:r>
-        <w:rPr>
-          <w:lang w:val="es-ES"/>
-        </w:rPr>
-        <w:t xml:space="preserve"> no solo responde a necesidades técnicas específicas —consistencia y tolerancia a fallos—, sino que también sienta las bases para un sistema más robusto, escalable y mantenible a futuro. Si bien no se implementan en su totalidad en esta versión, su modelación y análisis permiten prever su adopción en futuras extensiones del sistema, garantizando un mejor manejo de flujos complejos y mayor resistencia a fallos imprevistos.</w:t>
-      </w:r>
-    </w:p>
-    <w:p>
-      <w:pPr>
-        <w:pStyle w:val="Ttulo2"/>
-        <w:rPr>
-          <w:lang w:val="es-ES"/>
-        </w:rPr>
-      </w:pPr>
-      <w:r>
-        <w:rPr>
-          <w:lang w:val="es-ES"/>
-        </w:rPr>
-        <w:t xml:space="preserve">Seguridad del Sistema de Gestión </w:t>
+        <w:t xml:space="preserve"> Seguridad del Sistema de Gestión </w:t>
       </w:r>
       <w:r>
         <w:rPr>
@@ -18320,7 +17715,6 @@
         <w:rPr>
           <w:lang w:val="es-ES"/>
         </w:rPr>
-        <w:lastRenderedPageBreak/>
         <w:t>Para proteger los recursos expuestos a través de los servicios web implementados, se adoptará un mecanismo de autenticación basado en la tecnología JSON Web Token (JWT).</w:t>
       </w:r>
     </w:p>
@@ -18437,42 +17831,24 @@
         <w:pStyle w:val="Ttulo2"/>
       </w:pPr>
       <w:r>
+        <w:lastRenderedPageBreak/>
         <w:t>Conclusiones del Capítulo</w:t>
       </w:r>
     </w:p>
     <w:p>
       <w:pPr>
-        <w:pStyle w:val="Ttulo2"/>
-        <w:numPr>
-          <w:ilvl w:val="0"/>
-          <w:numId w:val="0"/>
-        </w:numPr>
-        <w:jc w:val="both"/>
-        <w:rPr>
-          <w:b w:val="0"/>
-          <w:bCs/>
+        <w:rPr>
+          <w:b/>
         </w:rPr>
       </w:pPr>
       <w:commentRangeStart w:id="118"/>
       <w:r>
-        <w:rPr>
-          <w:b w:val="0"/>
-          <w:bCs/>
-        </w:rPr>
         <w:t>En este capítulo se abordaron las fases de planificación y diseño en el desarrollo del software. Se definieron las funcionalidades a implementar mediante los artefactos propuestos por la metodología XP, incluyendo las historias de usuario y las historias técnicas. Asimismo, se elaboraron el diagrama de clases y el modelo de base de datos. Finalmente, se destacaron aspectos clave para la incorporación de la arquitectura basada en microservicios dentro del sistema de gestión</w:t>
       </w:r>
       <w:r>
-        <w:rPr>
-          <w:b w:val="0"/>
-          <w:bCs/>
-        </w:rPr>
         <w:t xml:space="preserve"> del cálculo del transporte de sedimentos</w:t>
       </w:r>
       <w:r>
-        <w:rPr>
-          <w:b w:val="0"/>
-          <w:bCs/>
-        </w:rPr>
         <w:t>.</w:t>
       </w:r>
       <w:commentRangeEnd w:id="118"/>
@@ -18480,7 +17856,6 @@
         <w:rPr>
           <w:rStyle w:val="Refdecomentario"/>
           <w:rFonts w:eastAsiaTheme="minorHAnsi"/>
-          <w:b w:val="0"/>
           <w:color w:val="auto"/>
           <w:shd w:val="clear" w:color="auto" w:fill="FFFFFF"/>
           <w:lang w:val="es-ES" w:eastAsia="en-US"/>
@@ -20086,7 +19461,6 @@
           <w:ilvl w:val="2"/>
           <w:numId w:val="40"/>
         </w:numPr>
-        <w:ind w:left="2160" w:hanging="360"/>
       </w:pPr>
       <w:r>
         <w:t xml:space="preserve">Directorio </w:t>
@@ -20278,9 +19652,9 @@
         </w:rPr>
         <w:lastRenderedPageBreak/>
         <w:drawing>
-          <wp:inline distT="0" distB="0" distL="0" distR="0" wp14:anchorId="10F4F90C" wp14:editId="210307DE">
+          <wp:inline distT="0" distB="0" distL="0" distR="0" wp14:anchorId="10F4F90C" wp14:editId="32AE9C0C">
             <wp:extent cx="2743200" cy="2657335"/>
-            <wp:effectExtent l="0" t="0" r="0" b="0"/>
+            <wp:effectExtent l="95250" t="95250" r="95250" b="86360"/>
             <wp:docPr id="10" name="Imagen 10"/>
             <wp:cNvGraphicFramePr>
               <a:graphicFrameLocks xmlns:a="http://schemas.openxmlformats.org/drawingml/2006/main" noChangeAspect="1"/>
@@ -20315,10 +19689,18 @@
                     <a:prstGeom prst="rect">
                       <a:avLst/>
                     </a:prstGeom>
-                    <a:noFill/>
-                    <a:ln>
-                      <a:noFill/>
+                    <a:ln w="88900" cap="sq" cmpd="thickThin">
+                      <a:solidFill>
+                        <a:srgbClr val="000000"/>
+                      </a:solidFill>
+                      <a:prstDash val="solid"/>
+                      <a:miter lim="800000"/>
                     </a:ln>
+                    <a:effectLst>
+                      <a:innerShdw blurRad="76200">
+                        <a:srgbClr val="000000"/>
+                      </a:innerShdw>
+                    </a:effectLst>
                   </pic:spPr>
                 </pic:pic>
               </a:graphicData>
@@ -20668,16 +20050,18 @@
     </w:p>
     <w:p>
       <w:pPr>
-        <w:spacing w:before="100" w:beforeAutospacing="1" w:after="100" w:afterAutospacing="1"/>
+        <w:pStyle w:val="Ttulo3"/>
         <w:rPr>
           <w:rStyle w:val="Textoennegrita"/>
-          <w:color w:val="auto"/>
+          <w:b/>
+          <w:bCs w:val="0"/>
         </w:rPr>
       </w:pPr>
       <w:r>
         <w:rPr>
           <w:rStyle w:val="Textoennegrita"/>
-          <w:color w:val="auto"/>
+          <w:b/>
+          <w:bCs w:val="0"/>
         </w:rPr>
         <w:t>Autenticación y autorización con contexto</w:t>
       </w:r>
@@ -20860,6 +20244,7 @@
           <w:sz w:val="22"/>
           <w:szCs w:val="22"/>
         </w:rPr>
+        <w:lastRenderedPageBreak/>
         <w:t>login</w:t>
       </w:r>
       <w:proofErr w:type="spellEnd"/>
@@ -20916,9 +20301,79 @@
       </w:pPr>
       <w:r>
         <w:rPr>
+          <w:noProof/>
           <w:color w:val="auto"/>
         </w:rPr>
-        <w:lastRenderedPageBreak/>
+        <w:drawing>
+          <wp:inline distT="0" distB="0" distL="0" distR="0" wp14:anchorId="41D17234" wp14:editId="3F5DF60E">
+            <wp:extent cx="5895975" cy="4685030"/>
+            <wp:effectExtent l="95250" t="95250" r="104775" b="96520"/>
+            <wp:docPr id="1002300084" name="Imagen 32"/>
+            <wp:cNvGraphicFramePr>
+              <a:graphicFrameLocks xmlns:a="http://schemas.openxmlformats.org/drawingml/2006/main" noChangeAspect="1"/>
+            </wp:cNvGraphicFramePr>
+            <a:graphic xmlns:a="http://schemas.openxmlformats.org/drawingml/2006/main">
+              <a:graphicData uri="http://schemas.openxmlformats.org/drawingml/2006/picture">
+                <pic:pic xmlns:pic="http://schemas.openxmlformats.org/drawingml/2006/picture">
+                  <pic:nvPicPr>
+                    <pic:cNvPr id="0" name="Picture 3"/>
+                    <pic:cNvPicPr>
+                      <a:picLocks noChangeAspect="1" noChangeArrowheads="1"/>
+                    </pic:cNvPicPr>
+                  </pic:nvPicPr>
+                  <pic:blipFill>
+                    <a:blip r:embed="rId78">
+                      <a:extLst>
+                        <a:ext uri="{28A0092B-C50C-407E-A947-70E740481C1C}">
+                          <a14:useLocalDpi xmlns:a14="http://schemas.microsoft.com/office/drawing/2010/main" val="0"/>
+                        </a:ext>
+                      </a:extLst>
+                    </a:blip>
+                    <a:srcRect/>
+                    <a:stretch>
+                      <a:fillRect/>
+                    </a:stretch>
+                  </pic:blipFill>
+                  <pic:spPr bwMode="auto">
+                    <a:xfrm>
+                      <a:off x="0" y="0"/>
+                      <a:ext cx="5895975" cy="4685030"/>
+                    </a:xfrm>
+                    <a:prstGeom prst="rect">
+                      <a:avLst/>
+                    </a:prstGeom>
+                    <a:ln w="88900" cap="sq" cmpd="thickThin">
+                      <a:solidFill>
+                        <a:srgbClr val="000000"/>
+                      </a:solidFill>
+                      <a:prstDash val="solid"/>
+                      <a:miter lim="800000"/>
+                    </a:ln>
+                    <a:effectLst>
+                      <a:innerShdw blurRad="76200">
+                        <a:srgbClr val="000000"/>
+                      </a:innerShdw>
+                    </a:effectLst>
+                  </pic:spPr>
+                </pic:pic>
+              </a:graphicData>
+            </a:graphic>
+          </wp:inline>
+        </w:drawing>
+      </w:r>
+    </w:p>
+    <w:p>
+      <w:pPr>
+        <w:spacing w:before="100" w:beforeAutospacing="1" w:after="100" w:afterAutospacing="1"/>
+        <w:ind w:left="0" w:firstLine="0"/>
+        <w:rPr>
+          <w:color w:val="auto"/>
+        </w:rPr>
+      </w:pPr>
+      <w:r>
+        <w:rPr>
+          <w:color w:val="auto"/>
+        </w:rPr>
         <w:t xml:space="preserve">El token JWT se almacena en </w:t>
       </w:r>
       <w:proofErr w:type="spellStart"/>
@@ -20960,6 +20415,57 @@
     </w:p>
     <w:p>
       <w:pPr>
+        <w:pStyle w:val="Ttulo3"/>
+      </w:pPr>
+      <w:r>
+        <w:t>Validación de roles permitidos</w:t>
+      </w:r>
+    </w:p>
+    <w:p>
+      <w:pPr>
+        <w:spacing w:before="100" w:beforeAutospacing="1" w:after="100" w:afterAutospacing="1"/>
+        <w:ind w:left="0" w:firstLine="0"/>
+        <w:rPr>
+          <w:color w:val="auto"/>
+        </w:rPr>
+      </w:pPr>
+      <w:r>
+        <w:rPr>
+          <w:color w:val="auto"/>
+        </w:rPr>
+        <w:t xml:space="preserve">El sistema implementa una función llamada </w:t>
+      </w:r>
+      <w:proofErr w:type="spellStart"/>
+      <w:r>
+        <w:rPr>
+          <w:color w:val="auto"/>
+        </w:rPr>
+        <w:t>getRoutes</w:t>
+      </w:r>
+      <w:proofErr w:type="spellEnd"/>
+      <w:r>
+        <w:rPr>
+          <w:color w:val="auto"/>
+        </w:rPr>
+        <w:t xml:space="preserve"> que se encarga de generar dinámicamente las rutas del sistema a partir de una lista estructurada de definiciones de rutas (</w:t>
+      </w:r>
+      <w:proofErr w:type="spellStart"/>
+      <w:r>
+        <w:rPr>
+          <w:color w:val="auto"/>
+        </w:rPr>
+        <w:t>allRoutes</w:t>
+      </w:r>
+      <w:proofErr w:type="spellEnd"/>
+      <w:r>
+        <w:rPr>
+          <w:color w:val="auto"/>
+        </w:rPr>
+        <w:t>). Esta función es crucial dentro del esquema de seguridad, ya que aplica las políticas de autenticación y autorización directamente en el momento de definir cada ruta.</w:t>
+      </w:r>
+    </w:p>
+    <w:p>
+      <w:pPr>
         <w:spacing w:before="100" w:beforeAutospacing="1" w:after="100" w:afterAutospacing="1"/>
         <w:ind w:left="0" w:firstLine="0"/>
         <w:rPr>
@@ -20972,23 +20478,448 @@
         <w:rPr>
           <w:b/>
           <w:bCs/>
+          <w:noProof/>
           <w:color w:val="auto"/>
         </w:rPr>
-        <w:t>Validación de roles permitidos</w:t>
+        <w:lastRenderedPageBreak/>
+        <w:drawing>
+          <wp:inline distT="0" distB="0" distL="0" distR="0" wp14:anchorId="3F3D084C" wp14:editId="126381BA">
+            <wp:extent cx="5977255" cy="5029200"/>
+            <wp:effectExtent l="95250" t="95250" r="99695" b="95250"/>
+            <wp:docPr id="943537165" name="Imagen 30"/>
+            <wp:cNvGraphicFramePr>
+              <a:graphicFrameLocks xmlns:a="http://schemas.openxmlformats.org/drawingml/2006/main" noChangeAspect="1"/>
+            </wp:cNvGraphicFramePr>
+            <a:graphic xmlns:a="http://schemas.openxmlformats.org/drawingml/2006/main">
+              <a:graphicData uri="http://schemas.openxmlformats.org/drawingml/2006/picture">
+                <pic:pic xmlns:pic="http://schemas.openxmlformats.org/drawingml/2006/picture">
+                  <pic:nvPicPr>
+                    <pic:cNvPr id="0" name="Picture 1"/>
+                    <pic:cNvPicPr>
+                      <a:picLocks noChangeAspect="1" noChangeArrowheads="1"/>
+                    </pic:cNvPicPr>
+                  </pic:nvPicPr>
+                  <pic:blipFill>
+                    <a:blip r:embed="rId79">
+                      <a:extLst>
+                        <a:ext uri="{28A0092B-C50C-407E-A947-70E740481C1C}">
+                          <a14:useLocalDpi xmlns:a14="http://schemas.microsoft.com/office/drawing/2010/main" val="0"/>
+                        </a:ext>
+                      </a:extLst>
+                    </a:blip>
+                    <a:srcRect/>
+                    <a:stretch>
+                      <a:fillRect/>
+                    </a:stretch>
+                  </pic:blipFill>
+                  <pic:spPr bwMode="auto">
+                    <a:xfrm>
+                      <a:off x="0" y="0"/>
+                      <a:ext cx="5977255" cy="5029200"/>
+                    </a:xfrm>
+                    <a:prstGeom prst="rect">
+                      <a:avLst/>
+                    </a:prstGeom>
+                    <a:ln w="88900" cap="sq" cmpd="thickThin">
+                      <a:solidFill>
+                        <a:srgbClr val="000000"/>
+                      </a:solidFill>
+                      <a:prstDash val="solid"/>
+                      <a:miter lim="800000"/>
+                    </a:ln>
+                    <a:effectLst>
+                      <a:innerShdw blurRad="76200">
+                        <a:srgbClr val="000000"/>
+                      </a:innerShdw>
+                    </a:effectLst>
+                  </pic:spPr>
+                </pic:pic>
+              </a:graphicData>
+            </a:graphic>
+          </wp:inline>
+        </w:drawing>
       </w:r>
     </w:p>
     <w:p>
       <w:pPr>
         <w:spacing w:before="100" w:beforeAutospacing="1" w:after="100" w:afterAutospacing="1"/>
+        <w:ind w:left="0" w:firstLine="0"/>
         <w:rPr>
           <w:color w:val="auto"/>
+          <w:lang w:val="es-ES"/>
         </w:rPr>
       </w:pPr>
       <w:r>
         <w:rPr>
           <w:color w:val="auto"/>
-        </w:rPr>
-        <w:t>El sistema define un conjunto explícito de roles válidos mediante la constante:</w:t>
+          <w:lang w:val="es-ES"/>
+        </w:rPr>
+        <w:t>Las demás rutas se encapsulan condicionalmente con componentes de seguridad:</w:t>
+      </w:r>
+    </w:p>
+    <w:p>
+      <w:pPr>
+        <w:spacing w:before="100" w:beforeAutospacing="1" w:after="100" w:afterAutospacing="1"/>
+        <w:rPr>
+          <w:color w:val="auto"/>
+          <w:lang w:val="es-ES"/>
+        </w:rPr>
+      </w:pPr>
+      <w:r>
+        <w:rPr>
+          <w:color w:val="auto"/>
+          <w:lang w:val="es-ES"/>
+        </w:rPr>
+        <w:t>Si la ruta requiere rol de administrador (</w:t>
+      </w:r>
+      <w:proofErr w:type="spellStart"/>
+      <w:proofErr w:type="gramStart"/>
+      <w:r>
+        <w:rPr>
+          <w:color w:val="auto"/>
+          <w:lang w:val="es-ES"/>
+        </w:rPr>
+        <w:t>route.adminOnly</w:t>
+      </w:r>
+      <w:proofErr w:type="spellEnd"/>
+      <w:proofErr w:type="gramEnd"/>
+      <w:r>
+        <w:rPr>
+          <w:color w:val="auto"/>
+          <w:lang w:val="es-ES"/>
+        </w:rPr>
+        <w:t xml:space="preserve"> === true), se envuelve en el componente </w:t>
+      </w:r>
+      <w:proofErr w:type="spellStart"/>
+      <w:r>
+        <w:rPr>
+          <w:color w:val="auto"/>
+          <w:lang w:val="es-ES"/>
+        </w:rPr>
+        <w:t>AdminRoute</w:t>
+      </w:r>
+      <w:proofErr w:type="spellEnd"/>
+      <w:r>
+        <w:rPr>
+          <w:color w:val="auto"/>
+          <w:lang w:val="es-ES"/>
+        </w:rPr>
+        <w:t xml:space="preserve">, el cual verifica que el usuario esté autenticado </w:t>
+      </w:r>
+      <w:r>
+        <w:rPr>
+          <w:b/>
+          <w:bCs/>
+          <w:color w:val="auto"/>
+          <w:lang w:val="es-ES"/>
+        </w:rPr>
+        <w:t>y</w:t>
+      </w:r>
+      <w:r>
+        <w:rPr>
+          <w:color w:val="auto"/>
+          <w:lang w:val="es-ES"/>
+        </w:rPr>
+        <w:t xml:space="preserve"> tenga el rol </w:t>
+      </w:r>
+      <w:proofErr w:type="spellStart"/>
+      <w:r>
+        <w:rPr>
+          <w:color w:val="auto"/>
+          <w:lang w:val="es-ES"/>
+        </w:rPr>
+        <w:t>admin</w:t>
+      </w:r>
+      <w:proofErr w:type="spellEnd"/>
+      <w:r>
+        <w:rPr>
+          <w:color w:val="auto"/>
+          <w:lang w:val="es-ES"/>
+        </w:rPr>
+        <w:t>:</w:t>
+      </w:r>
+    </w:p>
+    <w:p>
+      <w:pPr>
+        <w:spacing w:before="100" w:beforeAutospacing="1" w:after="100" w:afterAutospacing="1"/>
+        <w:rPr>
+          <w:b/>
+          <w:bCs/>
+          <w:color w:val="auto"/>
+          <w:lang w:val="es-ES"/>
+        </w:rPr>
+      </w:pPr>
+      <w:r>
+        <w:rPr>
+          <w:b/>
+          <w:bCs/>
+          <w:color w:val="auto"/>
+          <w:lang w:val="es-ES"/>
+        </w:rPr>
+        <w:t>&lt;</w:t>
+      </w:r>
+      <w:proofErr w:type="spellStart"/>
+      <w:r>
+        <w:rPr>
+          <w:b/>
+          <w:bCs/>
+          <w:color w:val="auto"/>
+          <w:lang w:val="es-ES"/>
+        </w:rPr>
+        <w:t>AdminRoute</w:t>
+      </w:r>
+      <w:proofErr w:type="spellEnd"/>
+      <w:r>
+        <w:rPr>
+          <w:b/>
+          <w:bCs/>
+          <w:color w:val="auto"/>
+          <w:lang w:val="es-ES"/>
+        </w:rPr>
+        <w:t>&gt;{</w:t>
+      </w:r>
+      <w:proofErr w:type="spellStart"/>
+      <w:proofErr w:type="gramStart"/>
+      <w:r>
+        <w:rPr>
+          <w:b/>
+          <w:bCs/>
+          <w:color w:val="auto"/>
+          <w:lang w:val="es-ES"/>
+        </w:rPr>
+        <w:t>route.component</w:t>
+      </w:r>
+      <w:proofErr w:type="spellEnd"/>
+      <w:proofErr w:type="gramEnd"/>
+      <w:r>
+        <w:rPr>
+          <w:b/>
+          <w:bCs/>
+          <w:color w:val="auto"/>
+          <w:lang w:val="es-ES"/>
+        </w:rPr>
+        <w:t>}&lt;/</w:t>
+      </w:r>
+      <w:proofErr w:type="spellStart"/>
+      <w:r>
+        <w:rPr>
+          <w:b/>
+          <w:bCs/>
+          <w:color w:val="auto"/>
+          <w:lang w:val="es-ES"/>
+        </w:rPr>
+        <w:t>AdminRoute</w:t>
+      </w:r>
+      <w:proofErr w:type="spellEnd"/>
+      <w:r>
+        <w:rPr>
+          <w:b/>
+          <w:bCs/>
+          <w:color w:val="auto"/>
+          <w:lang w:val="es-ES"/>
+        </w:rPr>
+        <w:t>&gt;</w:t>
+      </w:r>
+    </w:p>
+    <w:p>
+      <w:pPr>
+        <w:spacing w:before="100" w:beforeAutospacing="1" w:after="100" w:afterAutospacing="1"/>
+        <w:ind w:left="0" w:firstLine="0"/>
+        <w:rPr>
+          <w:color w:val="auto"/>
+        </w:rPr>
+      </w:pPr>
+      <w:r>
+        <w:rPr>
+          <w:color w:val="auto"/>
+        </w:rPr>
+        <w:t xml:space="preserve">Si no es exclusiva para administradores, se utiliza </w:t>
+      </w:r>
+      <w:proofErr w:type="spellStart"/>
+      <w:r>
+        <w:rPr>
+          <w:color w:val="auto"/>
+        </w:rPr>
+        <w:t>ProtectedRoute</w:t>
+      </w:r>
+      <w:proofErr w:type="spellEnd"/>
+      <w:r>
+        <w:rPr>
+          <w:color w:val="auto"/>
+        </w:rPr>
+        <w:t>, que únicamente valida si el usuario está autenticado (</w:t>
+      </w:r>
+      <w:proofErr w:type="spellStart"/>
+      <w:r>
+        <w:rPr>
+          <w:color w:val="auto"/>
+        </w:rPr>
+        <w:t>isAuthenticated</w:t>
+      </w:r>
+      <w:proofErr w:type="spellEnd"/>
+      <w:r>
+        <w:rPr>
+          <w:color w:val="auto"/>
+        </w:rPr>
+        <w:t>):</w:t>
+      </w:r>
+    </w:p>
+    <w:p>
+      <w:pPr>
+        <w:spacing w:before="100" w:beforeAutospacing="1" w:after="100" w:afterAutospacing="1"/>
+        <w:ind w:left="0" w:firstLine="0"/>
+        <w:rPr>
+          <w:b/>
+          <w:bCs/>
+          <w:color w:val="auto"/>
+          <w:lang w:val="en-US"/>
+        </w:rPr>
+      </w:pPr>
+      <w:r>
+        <w:rPr>
+          <w:b/>
+          <w:bCs/>
+          <w:color w:val="auto"/>
+          <w:lang w:val="en-US"/>
+        </w:rPr>
+        <w:lastRenderedPageBreak/>
+        <w:t xml:space="preserve">&lt;ProtectedRoute </w:t>
+      </w:r>
+      <w:proofErr w:type="spellStart"/>
+      <w:r>
+        <w:rPr>
+          <w:b/>
+          <w:bCs/>
+          <w:color w:val="auto"/>
+          <w:lang w:val="en-US"/>
+        </w:rPr>
+        <w:t>isAuthenticated</w:t>
+      </w:r>
+      <w:proofErr w:type="spellEnd"/>
+      <w:proofErr w:type="gramStart"/>
+      <w:r>
+        <w:rPr>
+          <w:b/>
+          <w:bCs/>
+          <w:color w:val="auto"/>
+          <w:lang w:val="en-US"/>
+        </w:rPr>
+        <w:t>={</w:t>
+      </w:r>
+      <w:proofErr w:type="spellStart"/>
+      <w:proofErr w:type="gramEnd"/>
+      <w:r>
+        <w:rPr>
+          <w:b/>
+          <w:bCs/>
+          <w:color w:val="auto"/>
+          <w:lang w:val="en-US"/>
+        </w:rPr>
+        <w:t>authContext.isAuthenticated</w:t>
+      </w:r>
+      <w:proofErr w:type="spellEnd"/>
+      <w:r>
+        <w:rPr>
+          <w:b/>
+          <w:bCs/>
+          <w:color w:val="auto"/>
+          <w:lang w:val="en-US"/>
+        </w:rPr>
+        <w:t>}&gt;</w:t>
+      </w:r>
+    </w:p>
+    <w:p>
+      <w:pPr>
+        <w:spacing w:before="100" w:beforeAutospacing="1" w:after="100" w:afterAutospacing="1"/>
+        <w:ind w:left="0" w:firstLine="0"/>
+        <w:rPr>
+          <w:b/>
+          <w:bCs/>
+          <w:color w:val="auto"/>
+          <w:lang w:val="en-US"/>
+        </w:rPr>
+      </w:pPr>
+      <w:r>
+        <w:rPr>
+          <w:b/>
+          <w:bCs/>
+          <w:color w:val="auto"/>
+          <w:lang w:val="en-US"/>
+        </w:rPr>
+        <w:t xml:space="preserve">  {</w:t>
+      </w:r>
+      <w:proofErr w:type="spellStart"/>
+      <w:proofErr w:type="gramStart"/>
+      <w:r>
+        <w:rPr>
+          <w:b/>
+          <w:bCs/>
+          <w:color w:val="auto"/>
+          <w:lang w:val="en-US"/>
+        </w:rPr>
+        <w:t>route.component</w:t>
+      </w:r>
+      <w:proofErr w:type="spellEnd"/>
+      <w:proofErr w:type="gramEnd"/>
+      <w:r>
+        <w:rPr>
+          <w:b/>
+          <w:bCs/>
+          <w:color w:val="auto"/>
+          <w:lang w:val="en-US"/>
+        </w:rPr>
+        <w:t>}</w:t>
+      </w:r>
+    </w:p>
+    <w:p>
+      <w:pPr>
+        <w:spacing w:before="100" w:beforeAutospacing="1" w:after="100" w:afterAutospacing="1"/>
+        <w:ind w:left="0" w:firstLine="0"/>
+        <w:rPr>
+          <w:b/>
+          <w:bCs/>
+          <w:color w:val="auto"/>
+        </w:rPr>
+      </w:pPr>
+      <w:r>
+        <w:rPr>
+          <w:b/>
+          <w:bCs/>
+          <w:color w:val="auto"/>
+        </w:rPr>
+        <w:t>&lt;/</w:t>
+      </w:r>
+      <w:proofErr w:type="spellStart"/>
+      <w:r>
+        <w:rPr>
+          <w:b/>
+          <w:bCs/>
+          <w:color w:val="auto"/>
+        </w:rPr>
+        <w:t>ProtectedRoute</w:t>
+      </w:r>
+      <w:proofErr w:type="spellEnd"/>
+      <w:r>
+        <w:rPr>
+          <w:b/>
+          <w:bCs/>
+          <w:color w:val="auto"/>
+        </w:rPr>
+        <w:t>&gt;</w:t>
+      </w:r>
+    </w:p>
+    <w:p>
+      <w:pPr>
+        <w:pStyle w:val="Ttulo3"/>
+        <w:rPr>
+          <w:lang w:val="es-ES"/>
+        </w:rPr>
+      </w:pPr>
+      <w:r>
+        <w:rPr>
+          <w:lang w:val="es-ES"/>
+        </w:rPr>
+        <w:t>Rutas públicas y protegidas</w:t>
       </w:r>
     </w:p>
     <w:p>
@@ -20996,36 +20927,48 @@
         <w:spacing w:before="100" w:beforeAutospacing="1" w:after="100" w:afterAutospacing="1"/>
         <w:jc w:val="left"/>
         <w:rPr>
-          <w:rFonts w:ascii="Consolas" w:hAnsi="Consolas"/>
           <w:color w:val="auto"/>
-          <w:lang w:val="en-US"/>
-        </w:rPr>
-      </w:pPr>
-      <w:r>
-        <w:rPr>
-          <w:rFonts w:ascii="Consolas" w:hAnsi="Consolas"/>
+          <w:lang w:val="es-ES"/>
+        </w:rPr>
+      </w:pPr>
+      <w:r>
+        <w:rPr>
           <w:color w:val="auto"/>
-          <w:lang w:val="en-US"/>
-        </w:rPr>
-        <w:t xml:space="preserve">&lt;ProtectedRoute </w:t>
-      </w:r>
-      <w:proofErr w:type="spellStart"/>
-      <w:r>
-        <w:rPr>
-          <w:rFonts w:ascii="Consolas" w:hAnsi="Consolas"/>
+          <w:lang w:val="es-ES"/>
+        </w:rPr>
+        <w:t xml:space="preserve">El sistema organiza su navegación mediante un conjunto estructurado de rutas definidas en un archivo central. Estas rutas se clasifican en </w:t>
+      </w:r>
+      <w:r>
+        <w:rPr>
+          <w:b/>
+          <w:bCs/>
           <w:color w:val="auto"/>
-          <w:lang w:val="en-US"/>
-        </w:rPr>
-        <w:t>requiredRoles</w:t>
-      </w:r>
-      <w:proofErr w:type="spellEnd"/>
-      <w:r>
-        <w:rPr>
-          <w:rFonts w:ascii="Consolas" w:hAnsi="Consolas"/>
+          <w:lang w:val="es-ES"/>
+        </w:rPr>
+        <w:t>públicas</w:t>
+      </w:r>
+      <w:r>
+        <w:rPr>
           <w:color w:val="auto"/>
-          <w:lang w:val="en-US"/>
-        </w:rPr>
-        <w:t>={["admin"]}&gt;</w:t>
+          <w:lang w:val="es-ES"/>
+        </w:rPr>
+        <w:t xml:space="preserve"> y </w:t>
+      </w:r>
+      <w:r>
+        <w:rPr>
+          <w:b/>
+          <w:bCs/>
+          <w:color w:val="auto"/>
+          <w:lang w:val="es-ES"/>
+        </w:rPr>
+        <w:t>protegidas</w:t>
+      </w:r>
+      <w:r>
+        <w:rPr>
+          <w:color w:val="auto"/>
+          <w:lang w:val="es-ES"/>
+        </w:rPr>
+        <w:t>, y se controlan según el estado de autenticación del usuario y su rol.</w:t>
       </w:r>
     </w:p>
     <w:p>
@@ -21033,18 +20976,96 @@
         <w:spacing w:before="100" w:beforeAutospacing="1" w:after="100" w:afterAutospacing="1"/>
         <w:jc w:val="left"/>
         <w:rPr>
-          <w:rFonts w:ascii="Consolas" w:hAnsi="Consolas"/>
           <w:color w:val="auto"/>
-          <w:lang w:val="en-US"/>
-        </w:rPr>
-      </w:pPr>
-      <w:r>
-        <w:rPr>
-          <w:rFonts w:ascii="Consolas" w:hAnsi="Consolas"/>
+          <w:lang w:val="es-ES"/>
+        </w:rPr>
+      </w:pPr>
+      <w:r>
+        <w:rPr>
           <w:color w:val="auto"/>
-          <w:lang w:val="en-US"/>
-        </w:rPr>
-        <w:t>&lt;Users /&gt;</w:t>
+          <w:lang w:val="es-ES"/>
+        </w:rPr>
+        <w:t xml:space="preserve">Las </w:t>
+      </w:r>
+      <w:r>
+        <w:rPr>
+          <w:b/>
+          <w:bCs/>
+          <w:color w:val="auto"/>
+          <w:lang w:val="es-ES"/>
+        </w:rPr>
+        <w:t>rutas públicas</w:t>
+      </w:r>
+      <w:r>
+        <w:rPr>
+          <w:color w:val="auto"/>
+          <w:lang w:val="es-ES"/>
+        </w:rPr>
+        <w:t xml:space="preserve"> incluyen páginas como inicio de sesión (/</w:t>
+      </w:r>
+      <w:proofErr w:type="spellStart"/>
+      <w:r>
+        <w:rPr>
+          <w:color w:val="auto"/>
+          <w:lang w:val="es-ES"/>
+        </w:rPr>
+        <w:t>auth</w:t>
+      </w:r>
+      <w:proofErr w:type="spellEnd"/>
+      <w:r>
+        <w:rPr>
+          <w:color w:val="auto"/>
+          <w:lang w:val="es-ES"/>
+        </w:rPr>
+        <w:t>/</w:t>
+      </w:r>
+      <w:proofErr w:type="spellStart"/>
+      <w:r>
+        <w:rPr>
+          <w:color w:val="auto"/>
+          <w:lang w:val="es-ES"/>
+        </w:rPr>
+        <w:t>login</w:t>
+      </w:r>
+      <w:proofErr w:type="spellEnd"/>
+      <w:r>
+        <w:rPr>
+          <w:color w:val="auto"/>
+          <w:lang w:val="es-ES"/>
+        </w:rPr>
+        <w:t>), registro (/</w:t>
+      </w:r>
+      <w:proofErr w:type="spellStart"/>
+      <w:r>
+        <w:rPr>
+          <w:color w:val="auto"/>
+          <w:lang w:val="es-ES"/>
+        </w:rPr>
+        <w:t>auth</w:t>
+      </w:r>
+      <w:proofErr w:type="spellEnd"/>
+      <w:r>
+        <w:rPr>
+          <w:color w:val="auto"/>
+          <w:lang w:val="es-ES"/>
+        </w:rPr>
+        <w:t>/</w:t>
+      </w:r>
+      <w:proofErr w:type="spellStart"/>
+      <w:r>
+        <w:rPr>
+          <w:color w:val="auto"/>
+          <w:lang w:val="es-ES"/>
+        </w:rPr>
+        <w:t>register</w:t>
+      </w:r>
+      <w:proofErr w:type="spellEnd"/>
+      <w:r>
+        <w:rPr>
+          <w:color w:val="auto"/>
+          <w:lang w:val="es-ES"/>
+        </w:rPr>
+        <w:t>) y recuperación de contraseña. Estas están disponibles sin requerir autenticación.</w:t>
       </w:r>
     </w:p>
     <w:p>
@@ -21052,19 +21073,344 @@
         <w:spacing w:before="100" w:beforeAutospacing="1" w:after="100" w:afterAutospacing="1"/>
         <w:jc w:val="left"/>
         <w:rPr>
-          <w:rFonts w:ascii="Consolas" w:hAnsi="Consolas"/>
           <w:color w:val="auto"/>
-          <w:u w:val="single"/>
-          <w:lang w:val="en-US"/>
-        </w:rPr>
-      </w:pPr>
-      <w:r>
-        <w:rPr>
-          <w:rFonts w:ascii="Consolas" w:hAnsi="Consolas"/>
+          <w:lang w:val="es-ES"/>
+        </w:rPr>
+      </w:pPr>
+      <w:r>
+        <w:rPr>
           <w:color w:val="auto"/>
-          <w:lang w:val="en-US"/>
-        </w:rPr>
-        <w:t>&lt;/ProtectedRoute&gt;</w:t>
+          <w:lang w:val="es-ES"/>
+        </w:rPr>
+        <w:t xml:space="preserve">Por otro lado, las </w:t>
+      </w:r>
+      <w:r>
+        <w:rPr>
+          <w:b/>
+          <w:bCs/>
+          <w:color w:val="auto"/>
+          <w:lang w:val="es-ES"/>
+        </w:rPr>
+        <w:t>rutas protegidas</w:t>
+      </w:r>
+      <w:r>
+        <w:rPr>
+          <w:color w:val="auto"/>
+          <w:lang w:val="es-ES"/>
+        </w:rPr>
+        <w:t xml:space="preserve"> requieren que el usuario esté autenticado. Este control se logra a través de componentes como </w:t>
+      </w:r>
+      <w:proofErr w:type="spellStart"/>
+      <w:r>
+        <w:rPr>
+          <w:color w:val="auto"/>
+          <w:lang w:val="es-ES"/>
+        </w:rPr>
+        <w:t>ProtectedRoute</w:t>
+      </w:r>
+      <w:proofErr w:type="spellEnd"/>
+      <w:r>
+        <w:rPr>
+          <w:color w:val="auto"/>
+          <w:lang w:val="es-ES"/>
+        </w:rPr>
+        <w:t xml:space="preserve"> y </w:t>
+      </w:r>
+      <w:proofErr w:type="spellStart"/>
+      <w:r>
+        <w:rPr>
+          <w:color w:val="auto"/>
+          <w:lang w:val="es-ES"/>
+        </w:rPr>
+        <w:t>AdminRoute</w:t>
+      </w:r>
+      <w:proofErr w:type="spellEnd"/>
+      <w:r>
+        <w:rPr>
+          <w:color w:val="auto"/>
+          <w:lang w:val="es-ES"/>
+        </w:rPr>
+        <w:t>, los cuales se encargan de verificar el estado de autenticación y el rol del usuario. Si no cumple con los requisitos, el sistema redirige automáticamente al formulario de acceso o a una página de acceso denegado.</w:t>
+      </w:r>
+    </w:p>
+    <w:p>
+      <w:pPr>
+        <w:spacing w:before="100" w:beforeAutospacing="1" w:after="100" w:afterAutospacing="1"/>
+        <w:jc w:val="left"/>
+        <w:rPr>
+          <w:color w:val="auto"/>
+          <w:lang w:val="es-ES"/>
+        </w:rPr>
+      </w:pPr>
+      <w:r>
+        <w:rPr>
+          <w:noProof/>
+          <w:color w:val="auto"/>
+          <w:lang w:val="es-ES"/>
+        </w:rPr>
+        <w:lastRenderedPageBreak/>
+        <w:drawing>
+          <wp:inline distT="0" distB="0" distL="0" distR="0" wp14:anchorId="6EE3EA52" wp14:editId="0F6A2733">
+            <wp:extent cx="5930265" cy="3666490"/>
+            <wp:effectExtent l="95250" t="95250" r="89535" b="86360"/>
+            <wp:docPr id="629272286" name="Imagen 31"/>
+            <wp:cNvGraphicFramePr>
+              <a:graphicFrameLocks xmlns:a="http://schemas.openxmlformats.org/drawingml/2006/main" noChangeAspect="1"/>
+            </wp:cNvGraphicFramePr>
+            <a:graphic xmlns:a="http://schemas.openxmlformats.org/drawingml/2006/main">
+              <a:graphicData uri="http://schemas.openxmlformats.org/drawingml/2006/picture">
+                <pic:pic xmlns:pic="http://schemas.openxmlformats.org/drawingml/2006/picture">
+                  <pic:nvPicPr>
+                    <pic:cNvPr id="0" name="Picture 2"/>
+                    <pic:cNvPicPr>
+                      <a:picLocks noChangeAspect="1" noChangeArrowheads="1"/>
+                    </pic:cNvPicPr>
+                  </pic:nvPicPr>
+                  <pic:blipFill>
+                    <a:blip r:embed="rId80">
+                      <a:extLst>
+                        <a:ext uri="{28A0092B-C50C-407E-A947-70E740481C1C}">
+                          <a14:useLocalDpi xmlns:a14="http://schemas.microsoft.com/office/drawing/2010/main" val="0"/>
+                        </a:ext>
+                      </a:extLst>
+                    </a:blip>
+                    <a:srcRect/>
+                    <a:stretch>
+                      <a:fillRect/>
+                    </a:stretch>
+                  </pic:blipFill>
+                  <pic:spPr bwMode="auto">
+                    <a:xfrm>
+                      <a:off x="0" y="0"/>
+                      <a:ext cx="5930265" cy="3666490"/>
+                    </a:xfrm>
+                    <a:prstGeom prst="rect">
+                      <a:avLst/>
+                    </a:prstGeom>
+                    <a:ln w="88900" cap="sq" cmpd="thickThin">
+                      <a:solidFill>
+                        <a:srgbClr val="000000"/>
+                      </a:solidFill>
+                      <a:prstDash val="solid"/>
+                      <a:miter lim="800000"/>
+                    </a:ln>
+                    <a:effectLst>
+                      <a:innerShdw blurRad="76200">
+                        <a:srgbClr val="000000"/>
+                      </a:innerShdw>
+                    </a:effectLst>
+                  </pic:spPr>
+                </pic:pic>
+              </a:graphicData>
+            </a:graphic>
+          </wp:inline>
+        </w:drawing>
+      </w:r>
+    </w:p>
+    <w:p>
+      <w:pPr>
+        <w:spacing w:before="100" w:beforeAutospacing="1" w:after="100" w:afterAutospacing="1"/>
+        <w:ind w:left="0" w:firstLine="0"/>
+        <w:jc w:val="left"/>
+        <w:rPr>
+          <w:color w:val="auto"/>
+          <w:lang w:val="es-ES"/>
+        </w:rPr>
+      </w:pPr>
+      <w:r>
+        <w:rPr>
+          <w:color w:val="auto"/>
+          <w:lang w:val="es-ES"/>
+        </w:rPr>
+        <w:t xml:space="preserve">El sistema define explícitamente en cada ruta si esta es exclusiva para administradores (propiedad </w:t>
+      </w:r>
+      <w:proofErr w:type="spellStart"/>
+      <w:r>
+        <w:rPr>
+          <w:color w:val="auto"/>
+          <w:lang w:val="es-ES"/>
+        </w:rPr>
+        <w:t>adminOnly</w:t>
+      </w:r>
+      <w:proofErr w:type="spellEnd"/>
+      <w:r>
+        <w:rPr>
+          <w:color w:val="auto"/>
+          <w:lang w:val="es-ES"/>
+        </w:rPr>
+        <w:t>: true) o si está accesible para todos los usuarios autenticados. Por ejemplo:</w:t>
+      </w:r>
+    </w:p>
+    <w:p>
+      <w:pPr>
+        <w:numPr>
+          <w:ilvl w:val="0"/>
+          <w:numId w:val="57"/>
+        </w:numPr>
+        <w:spacing w:before="100" w:beforeAutospacing="1" w:after="100" w:afterAutospacing="1"/>
+        <w:jc w:val="left"/>
+        <w:rPr>
+          <w:color w:val="auto"/>
+          <w:lang w:val="es-ES"/>
+        </w:rPr>
+      </w:pPr>
+      <w:r>
+        <w:rPr>
+          <w:color w:val="auto"/>
+          <w:lang w:val="es-ES"/>
+        </w:rPr>
+        <w:t>Rutas como /</w:t>
+      </w:r>
+      <w:proofErr w:type="spellStart"/>
+      <w:r>
+        <w:rPr>
+          <w:color w:val="auto"/>
+          <w:lang w:val="es-ES"/>
+        </w:rPr>
+        <w:t>dashboard</w:t>
+      </w:r>
+      <w:proofErr w:type="spellEnd"/>
+      <w:r>
+        <w:rPr>
+          <w:color w:val="auto"/>
+          <w:lang w:val="es-ES"/>
+        </w:rPr>
+        <w:t>, /</w:t>
+      </w:r>
+      <w:proofErr w:type="spellStart"/>
+      <w:r>
+        <w:rPr>
+          <w:color w:val="auto"/>
+          <w:lang w:val="es-ES"/>
+        </w:rPr>
+        <w:t>calculation</w:t>
+      </w:r>
+      <w:proofErr w:type="spellEnd"/>
+      <w:r>
+        <w:rPr>
+          <w:color w:val="auto"/>
+          <w:lang w:val="es-ES"/>
+        </w:rPr>
+        <w:t>, o /</w:t>
+      </w:r>
+      <w:proofErr w:type="spellStart"/>
+      <w:r>
+        <w:rPr>
+          <w:color w:val="auto"/>
+          <w:lang w:val="es-ES"/>
+        </w:rPr>
+        <w:t>estadistica</w:t>
+      </w:r>
+      <w:proofErr w:type="spellEnd"/>
+      <w:r>
+        <w:rPr>
+          <w:color w:val="auto"/>
+          <w:lang w:val="es-ES"/>
+        </w:rPr>
+        <w:t xml:space="preserve"> son accesibles para cualquier usuario autenticado.</w:t>
+      </w:r>
+    </w:p>
+    <w:p>
+      <w:pPr>
+        <w:numPr>
+          <w:ilvl w:val="0"/>
+          <w:numId w:val="57"/>
+        </w:numPr>
+        <w:spacing w:before="100" w:beforeAutospacing="1" w:after="100" w:afterAutospacing="1"/>
+        <w:jc w:val="left"/>
+        <w:rPr>
+          <w:color w:val="auto"/>
+          <w:lang w:val="es-ES"/>
+        </w:rPr>
+      </w:pPr>
+      <w:r>
+        <w:rPr>
+          <w:color w:val="auto"/>
+          <w:lang w:val="es-ES"/>
+        </w:rPr>
+        <w:t>Rutas como /</w:t>
+      </w:r>
+      <w:proofErr w:type="spellStart"/>
+      <w:r>
+        <w:rPr>
+          <w:color w:val="auto"/>
+          <w:lang w:val="es-ES"/>
+        </w:rPr>
+        <w:t>users</w:t>
+      </w:r>
+      <w:proofErr w:type="spellEnd"/>
+      <w:r>
+        <w:rPr>
+          <w:color w:val="auto"/>
+          <w:lang w:val="es-ES"/>
+        </w:rPr>
+        <w:t>, /trazas, o /</w:t>
+      </w:r>
+      <w:proofErr w:type="spellStart"/>
+      <w:r>
+        <w:rPr>
+          <w:color w:val="auto"/>
+          <w:lang w:val="es-ES"/>
+        </w:rPr>
+        <w:t>configuracion</w:t>
+      </w:r>
+      <w:proofErr w:type="spellEnd"/>
+      <w:r>
+        <w:rPr>
+          <w:color w:val="auto"/>
+          <w:lang w:val="es-ES"/>
+        </w:rPr>
+        <w:t xml:space="preserve"> están restringidas exclusivamente a usuarios con rol de administrador.</w:t>
+      </w:r>
+    </w:p>
+    <w:p>
+      <w:pPr>
+        <w:spacing w:before="100" w:beforeAutospacing="1" w:after="100" w:afterAutospacing="1"/>
+        <w:jc w:val="left"/>
+        <w:rPr>
+          <w:color w:val="auto"/>
+          <w:lang w:val="es-ES"/>
+        </w:rPr>
+      </w:pPr>
+      <w:r>
+        <w:rPr>
+          <w:color w:val="auto"/>
+          <w:lang w:val="es-ES"/>
+        </w:rPr>
+        <w:t xml:space="preserve">Cada ruta incluye además propiedades como </w:t>
+      </w:r>
+      <w:proofErr w:type="spellStart"/>
+      <w:r>
+        <w:rPr>
+          <w:color w:val="auto"/>
+          <w:lang w:val="es-ES"/>
+        </w:rPr>
+        <w:t>showInMenu</w:t>
+      </w:r>
+      <w:proofErr w:type="spellEnd"/>
+      <w:r>
+        <w:rPr>
+          <w:color w:val="auto"/>
+          <w:lang w:val="es-ES"/>
+        </w:rPr>
+        <w:t>, que determina si debe aparecer en la navegación principal, y componentes visuales personalizados con íconos o imágenes que mejoran la experiencia del usuario.</w:t>
+      </w:r>
+    </w:p>
+    <w:p>
+      <w:pPr>
+        <w:spacing w:before="100" w:beforeAutospacing="1" w:after="100" w:afterAutospacing="1"/>
+        <w:jc w:val="left"/>
+        <w:rPr>
+          <w:color w:val="auto"/>
+          <w:lang w:val="es-ES"/>
+        </w:rPr>
+      </w:pPr>
+      <w:r>
+        <w:rPr>
+          <w:color w:val="auto"/>
+          <w:lang w:val="es-ES"/>
+        </w:rPr>
+        <w:t>De esta forma, la arquitectura del enrutamiento no solo garantiza un acceso controlado y seguro, sino también una interfaz organizada, clara y adaptable según el tipo de usuario.</w:t>
       </w:r>
     </w:p>
     <w:p>
@@ -21630,11 +21976,7 @@
     </w:p>
     <w:p>
       <w:r>
-        <w:t xml:space="preserve">En la Tabla 3.2. Caso de Prueba “Cálculo”, se describe las diversas formas y resultados esperados. En el primero, al entrar datos válidos el sistema permite su entrada y procede al caso dos que se calcula a partir de que el usuario presiona el botón calcular y se guardan los datos </w:t>
-      </w:r>
-      <w:r>
-        <w:lastRenderedPageBreak/>
-        <w:t xml:space="preserve">entrados en la base de datos, posterior a esto los datos serán mostrados en una tabla. En el caso tres si el usuario entra un dato erróneo, ya sea letras en vez de números o cualquier dato que no es el correspondiente a esa entrada, el sistema debe notificarle la mismo que el dato es incorrecto. </w:t>
+        <w:t xml:space="preserve">En la Tabla 3.2. Caso de Prueba “Cálculo”, se describe las diversas formas y resultados esperados. En el primero, al entrar datos válidos el sistema permite su entrada y procede al caso dos que se calcula a partir de que el usuario presiona el botón calcular y se guardan los datos entrados en la base de datos, posterior a esto los datos serán mostrados en una tabla. En el caso tres si el usuario entra un dato erróneo, ya sea letras en vez de números o cualquier dato que no es el correspondiente a esa entrada, el sistema debe notificarle la mismo que el dato es incorrecto. </w:t>
       </w:r>
     </w:p>
     <w:p>
@@ -21884,7 +22226,11 @@
               <w:spacing w:after="0" w:line="360" w:lineRule="auto"/>
             </w:pPr>
             <w:r>
-              <w:t>Permite calcular los datos entrados y se guardan en la base de datos, debe mostrar una tabla los datos entrados y el resultado de dicho calculo</w:t>
+              <w:t xml:space="preserve">Permite calcular los datos entrados y se guardan en la base de datos, debe mostrar </w:t>
+            </w:r>
+            <w:r>
+              <w:lastRenderedPageBreak/>
+              <w:t>una tabla los datos entrados y el resultado de dicho calculo</w:t>
             </w:r>
           </w:p>
         </w:tc>
@@ -21908,6 +22254,7 @@
               <w:spacing w:after="0" w:line="360" w:lineRule="auto"/>
             </w:pPr>
             <w:r>
+              <w:lastRenderedPageBreak/>
               <w:t>Se calcula y se guardan los datos</w:t>
             </w:r>
           </w:p>
@@ -22323,7 +22670,7 @@
         <w:keepLines/>
         <w:numPr>
           <w:ilvl w:val="0"/>
-          <w:numId w:val="16"/>
+          <w:numId w:val="35"/>
         </w:numPr>
         <w:spacing w:after="227" w:line="259" w:lineRule="auto"/>
         <w:contextualSpacing w:val="0"/>
@@ -22344,105 +22691,41 @@
     </w:p>
     <w:p>
       <w:pPr>
-        <w:pStyle w:val="Prrafodelista"/>
-        <w:keepNext/>
-        <w:keepLines/>
-        <w:numPr>
-          <w:ilvl w:val="1"/>
-          <w:numId w:val="16"/>
-        </w:numPr>
-        <w:spacing w:after="227" w:line="259" w:lineRule="auto"/>
-        <w:contextualSpacing w:val="0"/>
-        <w:jc w:val="left"/>
-        <w:outlineLvl w:val="2"/>
+        <w:pStyle w:val="Ttulo2"/>
         <w:rPr>
           <w:rStyle w:val="Textoennegrita"/>
-          <w:rFonts w:eastAsia="Arial"/>
           <w:bCs w:val="0"/>
           <w:vanish/>
-          <w:color w:val="000000"/>
-          <w:sz w:val="22"/>
-          <w:szCs w:val="22"/>
-          <w:shd w:val="clear" w:color="auto" w:fill="auto"/>
-          <w:lang w:val="es-CU" w:eastAsia="es-CU"/>
-        </w:rPr>
-      </w:pPr>
-    </w:p>
-    <w:p>
-      <w:pPr>
-        <w:pStyle w:val="Prrafodelista"/>
-        <w:keepNext/>
-        <w:keepLines/>
-        <w:numPr>
-          <w:ilvl w:val="1"/>
-          <w:numId w:val="16"/>
-        </w:numPr>
-        <w:spacing w:after="227" w:line="259" w:lineRule="auto"/>
-        <w:contextualSpacing w:val="0"/>
-        <w:jc w:val="left"/>
-        <w:outlineLvl w:val="2"/>
+        </w:rPr>
+      </w:pPr>
+    </w:p>
+    <w:p>
+      <w:pPr>
+        <w:pStyle w:val="Ttulo2"/>
         <w:rPr>
           <w:rStyle w:val="Textoennegrita"/>
-          <w:rFonts w:eastAsia="Arial"/>
           <w:bCs w:val="0"/>
           <w:vanish/>
-          <w:color w:val="000000"/>
-          <w:sz w:val="22"/>
-          <w:szCs w:val="22"/>
-          <w:shd w:val="clear" w:color="auto" w:fill="auto"/>
-          <w:lang w:val="es-CU" w:eastAsia="es-CU"/>
-        </w:rPr>
-      </w:pPr>
-    </w:p>
-    <w:p>
-      <w:pPr>
-        <w:pStyle w:val="Prrafodelista"/>
-        <w:keepNext/>
-        <w:keepLines/>
-        <w:numPr>
-          <w:ilvl w:val="1"/>
-          <w:numId w:val="16"/>
-        </w:numPr>
-        <w:spacing w:after="227" w:line="259" w:lineRule="auto"/>
-        <w:contextualSpacing w:val="0"/>
-        <w:jc w:val="left"/>
-        <w:outlineLvl w:val="2"/>
+        </w:rPr>
+      </w:pPr>
+    </w:p>
+    <w:p>
+      <w:pPr>
+        <w:pStyle w:val="Ttulo2"/>
         <w:rPr>
           <w:rStyle w:val="Textoennegrita"/>
-          <w:rFonts w:eastAsia="Arial"/>
           <w:bCs w:val="0"/>
           <w:vanish/>
-          <w:color w:val="000000"/>
-          <w:sz w:val="22"/>
-          <w:szCs w:val="22"/>
-          <w:shd w:val="clear" w:color="auto" w:fill="auto"/>
-          <w:lang w:val="es-CU" w:eastAsia="es-CU"/>
-        </w:rPr>
-      </w:pPr>
-    </w:p>
-    <w:p>
-      <w:pPr>
-        <w:pStyle w:val="Prrafodelista"/>
-        <w:keepNext/>
-        <w:keepLines/>
-        <w:numPr>
-          <w:ilvl w:val="1"/>
-          <w:numId w:val="16"/>
-        </w:numPr>
-        <w:spacing w:after="227" w:line="259" w:lineRule="auto"/>
-        <w:contextualSpacing w:val="0"/>
-        <w:jc w:val="left"/>
-        <w:outlineLvl w:val="2"/>
+        </w:rPr>
+      </w:pPr>
+    </w:p>
+    <w:p>
+      <w:pPr>
+        <w:pStyle w:val="Ttulo2"/>
         <w:rPr>
           <w:rStyle w:val="Textoennegrita"/>
-          <w:rFonts w:eastAsia="Arial"/>
           <w:bCs w:val="0"/>
           <w:vanish/>
-          <w:color w:val="000000"/>
-          <w:sz w:val="22"/>
-          <w:szCs w:val="22"/>
-          <w:shd w:val="clear" w:color="auto" w:fill="auto"/>
-          <w:lang w:val="es-CU" w:eastAsia="es-CU"/>
         </w:rPr>
       </w:pPr>
     </w:p>
@@ -22612,9 +22895,9 @@
         </w:rPr>
         <w:lastRenderedPageBreak/>
         <w:drawing>
-          <wp:inline distT="0" distB="0" distL="0" distR="0" wp14:anchorId="468E7A8D" wp14:editId="07917320">
+          <wp:inline distT="0" distB="0" distL="0" distR="0" wp14:anchorId="468E7A8D" wp14:editId="081AC641">
             <wp:extent cx="5641675" cy="3522071"/>
-            <wp:effectExtent l="0" t="0" r="0" b="2540"/>
+            <wp:effectExtent l="95250" t="95250" r="92710" b="97790"/>
             <wp:docPr id="15" name="Imagen 15"/>
             <wp:cNvGraphicFramePr>
               <a:graphicFrameLocks xmlns:a="http://schemas.openxmlformats.org/drawingml/2006/main" noChangeAspect="1"/>
@@ -22629,7 +22912,7 @@
                     </pic:cNvPicPr>
                   </pic:nvPicPr>
                   <pic:blipFill>
-                    <a:blip r:embed="rId78">
+                    <a:blip r:embed="rId81">
                       <a:extLst>
                         <a:ext uri="{28A0092B-C50C-407E-A947-70E740481C1C}">
                           <a14:useLocalDpi xmlns:a14="http://schemas.microsoft.com/office/drawing/2010/main" val="0"/>
@@ -22649,10 +22932,18 @@
                     <a:prstGeom prst="rect">
                       <a:avLst/>
                     </a:prstGeom>
-                    <a:noFill/>
-                    <a:ln>
-                      <a:noFill/>
+                    <a:ln w="88900" cap="sq" cmpd="thickThin">
+                      <a:solidFill>
+                        <a:srgbClr val="000000"/>
+                      </a:solidFill>
+                      <a:prstDash val="solid"/>
+                      <a:miter lim="800000"/>
                     </a:ln>
+                    <a:effectLst>
+                      <a:innerShdw blurRad="76200">
+                        <a:srgbClr val="000000"/>
+                      </a:innerShdw>
+                    </a:effectLst>
                   </pic:spPr>
                 </pic:pic>
               </a:graphicData>
@@ -22748,7 +23039,6 @@
           <w:rStyle w:val="Refdecomentario"/>
           <w:rFonts w:eastAsiaTheme="minorHAnsi"/>
           <w:b w:val="0"/>
-          <w:color w:val="auto"/>
           <w:shd w:val="clear" w:color="auto" w:fill="FFFFFF"/>
           <w:lang w:val="es-ES" w:eastAsia="en-US"/>
         </w:rPr>
@@ -22771,9 +23061,9 @@
           <w:noProof/>
         </w:rPr>
         <w:drawing>
-          <wp:inline distT="0" distB="0" distL="0" distR="0" wp14:anchorId="565B9990" wp14:editId="6FACE11D">
+          <wp:inline distT="0" distB="0" distL="0" distR="0" wp14:anchorId="565B9990" wp14:editId="7E6FE0B9">
             <wp:extent cx="5977890" cy="1915160"/>
-            <wp:effectExtent l="0" t="0" r="3810" b="8890"/>
+            <wp:effectExtent l="95250" t="95250" r="99060" b="104140"/>
             <wp:docPr id="16" name="Imagen 16"/>
             <wp:cNvGraphicFramePr>
               <a:graphicFrameLocks xmlns:a="http://schemas.openxmlformats.org/drawingml/2006/main" noChangeAspect="1"/>
@@ -22788,7 +23078,7 @@
                     </pic:cNvPicPr>
                   </pic:nvPicPr>
                   <pic:blipFill>
-                    <a:blip r:embed="rId79">
+                    <a:blip r:embed="rId82">
                       <a:extLst>
                         <a:ext uri="{28A0092B-C50C-407E-A947-70E740481C1C}">
                           <a14:useLocalDpi xmlns:a14="http://schemas.microsoft.com/office/drawing/2010/main" val="0"/>
@@ -22808,10 +23098,18 @@
                     <a:prstGeom prst="rect">
                       <a:avLst/>
                     </a:prstGeom>
-                    <a:noFill/>
-                    <a:ln>
-                      <a:noFill/>
+                    <a:ln w="88900" cap="sq" cmpd="thickThin">
+                      <a:solidFill>
+                        <a:srgbClr val="000000"/>
+                      </a:solidFill>
+                      <a:prstDash val="solid"/>
+                      <a:miter lim="800000"/>
                     </a:ln>
+                    <a:effectLst>
+                      <a:innerShdw blurRad="76200">
+                        <a:srgbClr val="000000"/>
+                      </a:innerShdw>
+                    </a:effectLst>
                   </pic:spPr>
                 </pic:pic>
               </a:graphicData>
@@ -23200,8 +23498,8 @@
       <w:pPr>
         <w:ind w:left="0" w:firstLine="0"/>
         <w:sectPr>
-          <w:headerReference w:type="default" r:id="rId80"/>
-          <w:headerReference w:type="first" r:id="rId81"/>
+          <w:headerReference w:type="default" r:id="rId83"/>
+          <w:headerReference w:type="first" r:id="rId84"/>
           <w:pgSz w:w="12240" w:h="15840"/>
           <w:pgMar w:top="725" w:right="1126" w:bottom="2517" w:left="1702" w:header="725" w:footer="981" w:gutter="0"/>
           <w:cols w:space="720"/>
@@ -23245,7 +23543,7 @@
       <w:pPr>
         <w:ind w:left="0" w:firstLine="0"/>
         <w:sectPr>
-          <w:headerReference w:type="first" r:id="rId82"/>
+          <w:headerReference w:type="first" r:id="rId85"/>
           <w:pgSz w:w="12240" w:h="15840"/>
           <w:pgMar w:top="725" w:right="1126" w:bottom="2517" w:left="1702" w:header="725" w:footer="981" w:gutter="0"/>
           <w:cols w:space="720"/>
@@ -23951,9 +24249,9 @@
     <w:p>
       <w:pPr>
         <w:sectPr>
-          <w:headerReference w:type="even" r:id="rId83"/>
-          <w:headerReference w:type="default" r:id="rId84"/>
-          <w:headerReference w:type="first" r:id="rId85"/>
+          <w:headerReference w:type="even" r:id="rId86"/>
+          <w:headerReference w:type="default" r:id="rId87"/>
+          <w:headerReference w:type="first" r:id="rId88"/>
           <w:pgSz w:w="12240" w:h="15840"/>
           <w:pgMar w:top="725" w:right="1126" w:bottom="2517" w:left="1702" w:header="725" w:footer="981" w:gutter="0"/>
           <w:cols w:space="720"/>
@@ -25053,7 +25351,7 @@
           <w:ilvl w:val="0"/>
           <w:numId w:val="0"/>
         </w:numPr>
-        <w:ind w:left="504" w:hanging="504"/>
+        <w:ind w:left="504"/>
         <w:rPr>
           <w:rFonts w:eastAsiaTheme="majorEastAsia"/>
           <w:lang w:val="es-ES"/>
@@ -25940,7 +26238,7 @@
           <w:ilvl w:val="0"/>
           <w:numId w:val="0"/>
         </w:numPr>
-        <w:ind w:left="504" w:hanging="504"/>
+        <w:ind w:left="504"/>
       </w:pPr>
       <w:bookmarkStart w:id="146" w:name="_Toc193705071"/>
       <w:r>
@@ -26146,7 +26444,7 @@
           <w:ilvl w:val="0"/>
           <w:numId w:val="0"/>
         </w:numPr>
-        <w:ind w:left="504" w:hanging="504"/>
+        <w:ind w:left="504"/>
       </w:pPr>
       <w:bookmarkStart w:id="147" w:name="_Toc193705072"/>
       <w:r>
@@ -28443,7 +28741,6 @@
           <w:numId w:val="0"/>
         </w:numPr>
         <w:rPr>
-          <w:color w:val="auto"/>
           <w:lang w:val="es-ES"/>
         </w:rPr>
       </w:pPr>
@@ -30168,7 +30465,7 @@
           <w:ilvl w:val="0"/>
           <w:numId w:val="0"/>
         </w:numPr>
-        <w:ind w:left="504" w:hanging="504"/>
+        <w:ind w:left="504"/>
       </w:pPr>
       <w:r>
         <w:t>Estimación de esfuerzo a través de los Puntos de Historias de Usuario</w:t>
@@ -31138,8 +31435,8 @@
           <w:lang w:val="es-ES"/>
         </w:rPr>
         <w:sectPr>
-          <w:headerReference w:type="default" r:id="rId86"/>
-          <w:headerReference w:type="first" r:id="rId87"/>
+          <w:headerReference w:type="default" r:id="rId89"/>
+          <w:headerReference w:type="first" r:id="rId90"/>
           <w:pgSz w:w="12240" w:h="15840"/>
           <w:pgMar w:top="725" w:right="1126" w:bottom="2517" w:left="1702" w:header="725" w:footer="981" w:gutter="0"/>
           <w:cols w:space="720"/>
@@ -31257,8 +31554,8 @@
         </w:tabs>
         <w:ind w:left="0" w:firstLine="0"/>
         <w:sectPr>
-          <w:headerReference w:type="default" r:id="rId88"/>
-          <w:headerReference w:type="first" r:id="rId89"/>
+          <w:headerReference w:type="default" r:id="rId91"/>
+          <w:headerReference w:type="first" r:id="rId92"/>
           <w:pgSz w:w="12240" w:h="15840"/>
           <w:pgMar w:top="725" w:right="1126" w:bottom="2517" w:left="1702" w:header="725" w:footer="981" w:gutter="0"/>
           <w:cols w:space="720"/>
@@ -31274,12 +31571,12 @@
       </w:pPr>
     </w:p>
     <w:sectPr>
-      <w:headerReference w:type="even" r:id="rId90"/>
-      <w:headerReference w:type="default" r:id="rId91"/>
-      <w:footerReference w:type="even" r:id="rId92"/>
-      <w:footerReference w:type="default" r:id="rId93"/>
-      <w:headerReference w:type="first" r:id="rId94"/>
-      <w:footerReference w:type="first" r:id="rId95"/>
+      <w:headerReference w:type="even" r:id="rId93"/>
+      <w:headerReference w:type="default" r:id="rId94"/>
+      <w:footerReference w:type="even" r:id="rId95"/>
+      <w:footerReference w:type="default" r:id="rId96"/>
+      <w:headerReference w:type="first" r:id="rId97"/>
+      <w:footerReference w:type="first" r:id="rId98"/>
       <w:pgSz w:w="12240" w:h="15840"/>
       <w:pgMar w:top="1440" w:right="1129" w:bottom="1440" w:left="1702" w:header="970" w:footer="720" w:gutter="0"/>
       <w:cols w:space="720"/>
@@ -39705,6 +40002,155 @@
     </w:lvl>
   </w:abstractNum>
   <w:abstractNum w:abstractNumId="24" w15:restartNumberingAfterBreak="0">
+    <w:nsid w:val="32F468E2"/>
+    <w:multiLevelType w:val="multilevel"/>
+    <w:tmpl w:val="01A2FC68"/>
+    <w:lvl w:ilvl="0">
+      <w:start w:val="1"/>
+      <w:numFmt w:val="bullet"/>
+      <w:lvlText w:val=""/>
+      <w:lvlJc w:val="left"/>
+      <w:pPr>
+        <w:tabs>
+          <w:tab w:val="num" w:pos="720"/>
+        </w:tabs>
+        <w:ind w:left="720" w:hanging="360"/>
+      </w:pPr>
+      <w:rPr>
+        <w:rFonts w:ascii="Symbol" w:hAnsi="Symbol" w:hint="default"/>
+        <w:sz w:val="20"/>
+      </w:rPr>
+    </w:lvl>
+    <w:lvl w:ilvl="1" w:tentative="1">
+      <w:start w:val="1"/>
+      <w:numFmt w:val="bullet"/>
+      <w:lvlText w:val="o"/>
+      <w:lvlJc w:val="left"/>
+      <w:pPr>
+        <w:tabs>
+          <w:tab w:val="num" w:pos="1440"/>
+        </w:tabs>
+        <w:ind w:left="1440" w:hanging="360"/>
+      </w:pPr>
+      <w:rPr>
+        <w:rFonts w:ascii="Courier New" w:hAnsi="Courier New" w:hint="default"/>
+        <w:sz w:val="20"/>
+      </w:rPr>
+    </w:lvl>
+    <w:lvl w:ilvl="2" w:tentative="1">
+      <w:start w:val="1"/>
+      <w:numFmt w:val="bullet"/>
+      <w:lvlText w:val=""/>
+      <w:lvlJc w:val="left"/>
+      <w:pPr>
+        <w:tabs>
+          <w:tab w:val="num" w:pos="2160"/>
+        </w:tabs>
+        <w:ind w:left="2160" w:hanging="360"/>
+      </w:pPr>
+      <w:rPr>
+        <w:rFonts w:ascii="Wingdings" w:hAnsi="Wingdings" w:hint="default"/>
+        <w:sz w:val="20"/>
+      </w:rPr>
+    </w:lvl>
+    <w:lvl w:ilvl="3" w:tentative="1">
+      <w:start w:val="1"/>
+      <w:numFmt w:val="bullet"/>
+      <w:lvlText w:val=""/>
+      <w:lvlJc w:val="left"/>
+      <w:pPr>
+        <w:tabs>
+          <w:tab w:val="num" w:pos="2880"/>
+        </w:tabs>
+        <w:ind w:left="2880" w:hanging="360"/>
+      </w:pPr>
+      <w:rPr>
+        <w:rFonts w:ascii="Wingdings" w:hAnsi="Wingdings" w:hint="default"/>
+        <w:sz w:val="20"/>
+      </w:rPr>
+    </w:lvl>
+    <w:lvl w:ilvl="4" w:tentative="1">
+      <w:start w:val="1"/>
+      <w:numFmt w:val="bullet"/>
+      <w:lvlText w:val=""/>
+      <w:lvlJc w:val="left"/>
+      <w:pPr>
+        <w:tabs>
+          <w:tab w:val="num" w:pos="3600"/>
+        </w:tabs>
+        <w:ind w:left="3600" w:hanging="360"/>
+      </w:pPr>
+      <w:rPr>
+        <w:rFonts w:ascii="Wingdings" w:hAnsi="Wingdings" w:hint="default"/>
+        <w:sz w:val="20"/>
+      </w:rPr>
+    </w:lvl>
+    <w:lvl w:ilvl="5" w:tentative="1">
+      <w:start w:val="1"/>
+      <w:numFmt w:val="bullet"/>
+      <w:lvlText w:val=""/>
+      <w:lvlJc w:val="left"/>
+      <w:pPr>
+        <w:tabs>
+          <w:tab w:val="num" w:pos="4320"/>
+        </w:tabs>
+        <w:ind w:left="4320" w:hanging="360"/>
+      </w:pPr>
+      <w:rPr>
+        <w:rFonts w:ascii="Wingdings" w:hAnsi="Wingdings" w:hint="default"/>
+        <w:sz w:val="20"/>
+      </w:rPr>
+    </w:lvl>
+    <w:lvl w:ilvl="6" w:tentative="1">
+      <w:start w:val="1"/>
+      <w:numFmt w:val="bullet"/>
+      <w:lvlText w:val=""/>
+      <w:lvlJc w:val="left"/>
+      <w:pPr>
+        <w:tabs>
+          <w:tab w:val="num" w:pos="5040"/>
+        </w:tabs>
+        <w:ind w:left="5040" w:hanging="360"/>
+      </w:pPr>
+      <w:rPr>
+        <w:rFonts w:ascii="Wingdings" w:hAnsi="Wingdings" w:hint="default"/>
+        <w:sz w:val="20"/>
+      </w:rPr>
+    </w:lvl>
+    <w:lvl w:ilvl="7" w:tentative="1">
+      <w:start w:val="1"/>
+      <w:numFmt w:val="bullet"/>
+      <w:lvlText w:val=""/>
+      <w:lvlJc w:val="left"/>
+      <w:pPr>
+        <w:tabs>
+          <w:tab w:val="num" w:pos="5760"/>
+        </w:tabs>
+        <w:ind w:left="5760" w:hanging="360"/>
+      </w:pPr>
+      <w:rPr>
+        <w:rFonts w:ascii="Wingdings" w:hAnsi="Wingdings" w:hint="default"/>
+        <w:sz w:val="20"/>
+      </w:rPr>
+    </w:lvl>
+    <w:lvl w:ilvl="8" w:tentative="1">
+      <w:start w:val="1"/>
+      <w:numFmt w:val="bullet"/>
+      <w:lvlText w:val=""/>
+      <w:lvlJc w:val="left"/>
+      <w:pPr>
+        <w:tabs>
+          <w:tab w:val="num" w:pos="6480"/>
+        </w:tabs>
+        <w:ind w:left="6480" w:hanging="360"/>
+      </w:pPr>
+      <w:rPr>
+        <w:rFonts w:ascii="Wingdings" w:hAnsi="Wingdings" w:hint="default"/>
+        <w:sz w:val="20"/>
+      </w:rPr>
+    </w:lvl>
+  </w:abstractNum>
+  <w:abstractNum w:abstractNumId="25" w15:restartNumberingAfterBreak="0">
     <w:nsid w:val="36825645"/>
     <w:multiLevelType w:val="multilevel"/>
     <w:tmpl w:val="9FAE41F6"/>
@@ -39853,7 +40299,7 @@
       </w:rPr>
     </w:lvl>
   </w:abstractNum>
-  <w:abstractNum w:abstractNumId="25" w15:restartNumberingAfterBreak="0">
+  <w:abstractNum w:abstractNumId="26" w15:restartNumberingAfterBreak="0">
     <w:nsid w:val="37B558C7"/>
     <w:multiLevelType w:val="multilevel"/>
     <w:tmpl w:val="23FE0854"/>
@@ -40002,7 +40448,7 @@
       </w:rPr>
     </w:lvl>
   </w:abstractNum>
-  <w:abstractNum w:abstractNumId="26" w15:restartNumberingAfterBreak="0">
+  <w:abstractNum w:abstractNumId="27" w15:restartNumberingAfterBreak="0">
     <w:nsid w:val="3B3643C0"/>
     <w:multiLevelType w:val="hybridMultilevel"/>
     <w:tmpl w:val="B0204FDE"/>
@@ -40115,7 +40561,7 @@
       </w:rPr>
     </w:lvl>
   </w:abstractNum>
-  <w:abstractNum w:abstractNumId="27" w15:restartNumberingAfterBreak="0">
+  <w:abstractNum w:abstractNumId="28" w15:restartNumberingAfterBreak="0">
     <w:nsid w:val="3CF241D0"/>
     <w:multiLevelType w:val="hybridMultilevel"/>
     <w:tmpl w:val="26C24F84"/>
@@ -40229,7 +40675,7 @@
       </w:rPr>
     </w:lvl>
   </w:abstractNum>
-  <w:abstractNum w:abstractNumId="28" w15:restartNumberingAfterBreak="0">
+  <w:abstractNum w:abstractNumId="29" w15:restartNumberingAfterBreak="0">
     <w:nsid w:val="3CF70D2D"/>
     <w:multiLevelType w:val="multilevel"/>
     <w:tmpl w:val="397CD71C"/>
@@ -40378,7 +40824,7 @@
       </w:rPr>
     </w:lvl>
   </w:abstractNum>
-  <w:abstractNum w:abstractNumId="29" w15:restartNumberingAfterBreak="0">
+  <w:abstractNum w:abstractNumId="30" w15:restartNumberingAfterBreak="0">
     <w:nsid w:val="43596F09"/>
     <w:multiLevelType w:val="hybridMultilevel"/>
     <w:tmpl w:val="DC40FDE0"/>
@@ -40491,7 +40937,7 @@
       </w:rPr>
     </w:lvl>
   </w:abstractNum>
-  <w:abstractNum w:abstractNumId="30" w15:restartNumberingAfterBreak="0">
+  <w:abstractNum w:abstractNumId="31" w15:restartNumberingAfterBreak="0">
     <w:nsid w:val="44384A50"/>
     <w:multiLevelType w:val="multilevel"/>
     <w:tmpl w:val="2BB8BA68"/>
@@ -40640,7 +41086,7 @@
       </w:rPr>
     </w:lvl>
   </w:abstractNum>
-  <w:abstractNum w:abstractNumId="31" w15:restartNumberingAfterBreak="0">
+  <w:abstractNum w:abstractNumId="32" w15:restartNumberingAfterBreak="0">
     <w:nsid w:val="4A4E6987"/>
     <w:multiLevelType w:val="hybridMultilevel"/>
     <w:tmpl w:val="319CBDFA"/>
@@ -40753,7 +41199,7 @@
       </w:rPr>
     </w:lvl>
   </w:abstractNum>
-  <w:abstractNum w:abstractNumId="32" w15:restartNumberingAfterBreak="0">
+  <w:abstractNum w:abstractNumId="33" w15:restartNumberingAfterBreak="0">
     <w:nsid w:val="4B61053E"/>
     <w:multiLevelType w:val="hybridMultilevel"/>
     <w:tmpl w:val="A07C533A"/>
@@ -40866,7 +41312,7 @@
       </w:rPr>
     </w:lvl>
   </w:abstractNum>
-  <w:abstractNum w:abstractNumId="33" w15:restartNumberingAfterBreak="0">
+  <w:abstractNum w:abstractNumId="34" w15:restartNumberingAfterBreak="0">
     <w:nsid w:val="50AD4D7E"/>
     <w:multiLevelType w:val="hybridMultilevel"/>
     <w:tmpl w:val="29B0C2E0"/>
@@ -40980,7 +41426,7 @@
       </w:rPr>
     </w:lvl>
   </w:abstractNum>
-  <w:abstractNum w:abstractNumId="34" w15:restartNumberingAfterBreak="0">
+  <w:abstractNum w:abstractNumId="35" w15:restartNumberingAfterBreak="0">
     <w:nsid w:val="516A0573"/>
     <w:multiLevelType w:val="hybridMultilevel"/>
     <w:tmpl w:val="6B6CACC6"/>
@@ -41093,7 +41539,7 @@
       </w:rPr>
     </w:lvl>
   </w:abstractNum>
-  <w:abstractNum w:abstractNumId="35" w15:restartNumberingAfterBreak="0">
+  <w:abstractNum w:abstractNumId="36" w15:restartNumberingAfterBreak="0">
     <w:nsid w:val="52B8359A"/>
     <w:multiLevelType w:val="multilevel"/>
     <w:tmpl w:val="14C06CD2"/>
@@ -41179,10 +41625,10 @@
       </w:pPr>
     </w:lvl>
   </w:abstractNum>
-  <w:abstractNum w:abstractNumId="36" w15:restartNumberingAfterBreak="0">
+  <w:abstractNum w:abstractNumId="37" w15:restartNumberingAfterBreak="0">
     <w:nsid w:val="54D35F71"/>
     <w:multiLevelType w:val="multilevel"/>
-    <w:tmpl w:val="81B0B628"/>
+    <w:tmpl w:val="A4DE6F8A"/>
     <w:lvl w:ilvl="0">
       <w:start w:val="1"/>
       <w:numFmt w:val="decimal"/>
@@ -41211,6 +41657,7 @@
     <w:lvl w:ilvl="2">
       <w:start w:val="1"/>
       <w:numFmt w:val="decimal"/>
+      <w:pStyle w:val="Ttulo3"/>
       <w:lvlText w:val="%1.%2.%3"/>
       <w:lvlJc w:val="left"/>
       <w:pPr>
@@ -41293,7 +41740,7 @@
       </w:rPr>
     </w:lvl>
   </w:abstractNum>
-  <w:abstractNum w:abstractNumId="37" w15:restartNumberingAfterBreak="0">
+  <w:abstractNum w:abstractNumId="38" w15:restartNumberingAfterBreak="0">
     <w:nsid w:val="58184D6F"/>
     <w:multiLevelType w:val="hybridMultilevel"/>
     <w:tmpl w:val="B6D244C0"/>
@@ -41406,7 +41853,7 @@
       </w:rPr>
     </w:lvl>
   </w:abstractNum>
-  <w:abstractNum w:abstractNumId="38" w15:restartNumberingAfterBreak="0">
+  <w:abstractNum w:abstractNumId="39" w15:restartNumberingAfterBreak="0">
     <w:nsid w:val="59357C29"/>
     <w:multiLevelType w:val="hybridMultilevel"/>
     <w:tmpl w:val="3064CE70"/>
@@ -41519,7 +41966,156 @@
       </w:rPr>
     </w:lvl>
   </w:abstractNum>
-  <w:abstractNum w:abstractNumId="39" w15:restartNumberingAfterBreak="0">
+  <w:abstractNum w:abstractNumId="40" w15:restartNumberingAfterBreak="0">
+    <w:nsid w:val="5C6C697D"/>
+    <w:multiLevelType w:val="multilevel"/>
+    <w:tmpl w:val="617A2476"/>
+    <w:lvl w:ilvl="0">
+      <w:start w:val="1"/>
+      <w:numFmt w:val="bullet"/>
+      <w:lvlText w:val=""/>
+      <w:lvlJc w:val="left"/>
+      <w:pPr>
+        <w:tabs>
+          <w:tab w:val="num" w:pos="720"/>
+        </w:tabs>
+        <w:ind w:left="720" w:hanging="360"/>
+      </w:pPr>
+      <w:rPr>
+        <w:rFonts w:ascii="Symbol" w:hAnsi="Symbol" w:hint="default"/>
+        <w:sz w:val="20"/>
+      </w:rPr>
+    </w:lvl>
+    <w:lvl w:ilvl="1" w:tentative="1">
+      <w:start w:val="1"/>
+      <w:numFmt w:val="bullet"/>
+      <w:lvlText w:val="o"/>
+      <w:lvlJc w:val="left"/>
+      <w:pPr>
+        <w:tabs>
+          <w:tab w:val="num" w:pos="1440"/>
+        </w:tabs>
+        <w:ind w:left="1440" w:hanging="360"/>
+      </w:pPr>
+      <w:rPr>
+        <w:rFonts w:ascii="Courier New" w:hAnsi="Courier New" w:hint="default"/>
+        <w:sz w:val="20"/>
+      </w:rPr>
+    </w:lvl>
+    <w:lvl w:ilvl="2" w:tentative="1">
+      <w:start w:val="1"/>
+      <w:numFmt w:val="bullet"/>
+      <w:lvlText w:val=""/>
+      <w:lvlJc w:val="left"/>
+      <w:pPr>
+        <w:tabs>
+          <w:tab w:val="num" w:pos="2160"/>
+        </w:tabs>
+        <w:ind w:left="2160" w:hanging="360"/>
+      </w:pPr>
+      <w:rPr>
+        <w:rFonts w:ascii="Wingdings" w:hAnsi="Wingdings" w:hint="default"/>
+        <w:sz w:val="20"/>
+      </w:rPr>
+    </w:lvl>
+    <w:lvl w:ilvl="3" w:tentative="1">
+      <w:start w:val="1"/>
+      <w:numFmt w:val="bullet"/>
+      <w:lvlText w:val=""/>
+      <w:lvlJc w:val="left"/>
+      <w:pPr>
+        <w:tabs>
+          <w:tab w:val="num" w:pos="2880"/>
+        </w:tabs>
+        <w:ind w:left="2880" w:hanging="360"/>
+      </w:pPr>
+      <w:rPr>
+        <w:rFonts w:ascii="Wingdings" w:hAnsi="Wingdings" w:hint="default"/>
+        <w:sz w:val="20"/>
+      </w:rPr>
+    </w:lvl>
+    <w:lvl w:ilvl="4" w:tentative="1">
+      <w:start w:val="1"/>
+      <w:numFmt w:val="bullet"/>
+      <w:lvlText w:val=""/>
+      <w:lvlJc w:val="left"/>
+      <w:pPr>
+        <w:tabs>
+          <w:tab w:val="num" w:pos="3600"/>
+        </w:tabs>
+        <w:ind w:left="3600" w:hanging="360"/>
+      </w:pPr>
+      <w:rPr>
+        <w:rFonts w:ascii="Wingdings" w:hAnsi="Wingdings" w:hint="default"/>
+        <w:sz w:val="20"/>
+      </w:rPr>
+    </w:lvl>
+    <w:lvl w:ilvl="5" w:tentative="1">
+      <w:start w:val="1"/>
+      <w:numFmt w:val="bullet"/>
+      <w:lvlText w:val=""/>
+      <w:lvlJc w:val="left"/>
+      <w:pPr>
+        <w:tabs>
+          <w:tab w:val="num" w:pos="4320"/>
+        </w:tabs>
+        <w:ind w:left="4320" w:hanging="360"/>
+      </w:pPr>
+      <w:rPr>
+        <w:rFonts w:ascii="Wingdings" w:hAnsi="Wingdings" w:hint="default"/>
+        <w:sz w:val="20"/>
+      </w:rPr>
+    </w:lvl>
+    <w:lvl w:ilvl="6" w:tentative="1">
+      <w:start w:val="1"/>
+      <w:numFmt w:val="bullet"/>
+      <w:lvlText w:val=""/>
+      <w:lvlJc w:val="left"/>
+      <w:pPr>
+        <w:tabs>
+          <w:tab w:val="num" w:pos="5040"/>
+        </w:tabs>
+        <w:ind w:left="5040" w:hanging="360"/>
+      </w:pPr>
+      <w:rPr>
+        <w:rFonts w:ascii="Wingdings" w:hAnsi="Wingdings" w:hint="default"/>
+        <w:sz w:val="20"/>
+      </w:rPr>
+    </w:lvl>
+    <w:lvl w:ilvl="7" w:tentative="1">
+      <w:start w:val="1"/>
+      <w:numFmt w:val="bullet"/>
+      <w:lvlText w:val=""/>
+      <w:lvlJc w:val="left"/>
+      <w:pPr>
+        <w:tabs>
+          <w:tab w:val="num" w:pos="5760"/>
+        </w:tabs>
+        <w:ind w:left="5760" w:hanging="360"/>
+      </w:pPr>
+      <w:rPr>
+        <w:rFonts w:ascii="Wingdings" w:hAnsi="Wingdings" w:hint="default"/>
+        <w:sz w:val="20"/>
+      </w:rPr>
+    </w:lvl>
+    <w:lvl w:ilvl="8" w:tentative="1">
+      <w:start w:val="1"/>
+      <w:numFmt w:val="bullet"/>
+      <w:lvlText w:val=""/>
+      <w:lvlJc w:val="left"/>
+      <w:pPr>
+        <w:tabs>
+          <w:tab w:val="num" w:pos="6480"/>
+        </w:tabs>
+        <w:ind w:left="6480" w:hanging="360"/>
+      </w:pPr>
+      <w:rPr>
+        <w:rFonts w:ascii="Wingdings" w:hAnsi="Wingdings" w:hint="default"/>
+        <w:sz w:val="20"/>
+      </w:rPr>
+    </w:lvl>
+  </w:abstractNum>
+  <w:abstractNum w:abstractNumId="41" w15:restartNumberingAfterBreak="0">
     <w:nsid w:val="645D0617"/>
     <w:multiLevelType w:val="multilevel"/>
     <w:tmpl w:val="B9D0D63C"/>
@@ -41668,7 +42264,7 @@
       </w:rPr>
     </w:lvl>
   </w:abstractNum>
-  <w:abstractNum w:abstractNumId="40" w15:restartNumberingAfterBreak="0">
+  <w:abstractNum w:abstractNumId="42" w15:restartNumberingAfterBreak="0">
     <w:nsid w:val="67405DA2"/>
     <w:multiLevelType w:val="multilevel"/>
     <w:tmpl w:val="98766F2A"/>
@@ -41781,7 +42377,7 @@
       </w:pPr>
     </w:lvl>
   </w:abstractNum>
-  <w:abstractNum w:abstractNumId="41" w15:restartNumberingAfterBreak="0">
+  <w:abstractNum w:abstractNumId="43" w15:restartNumberingAfterBreak="0">
     <w:nsid w:val="67AD18D2"/>
     <w:multiLevelType w:val="multilevel"/>
     <w:tmpl w:val="5A305338"/>
@@ -41894,7 +42490,7 @@
       </w:rPr>
     </w:lvl>
   </w:abstractNum>
-  <w:abstractNum w:abstractNumId="42" w15:restartNumberingAfterBreak="0">
+  <w:abstractNum w:abstractNumId="44" w15:restartNumberingAfterBreak="0">
     <w:nsid w:val="68CE6173"/>
     <w:multiLevelType w:val="multilevel"/>
     <w:tmpl w:val="5C0A001F"/>
@@ -41980,7 +42576,7 @@
       </w:pPr>
     </w:lvl>
   </w:abstractNum>
-  <w:abstractNum w:abstractNumId="43" w15:restartNumberingAfterBreak="0">
+  <w:abstractNum w:abstractNumId="45" w15:restartNumberingAfterBreak="0">
     <w:nsid w:val="6B753581"/>
     <w:multiLevelType w:val="multilevel"/>
     <w:tmpl w:val="941C599A"/>
@@ -42129,7 +42725,7 @@
       </w:rPr>
     </w:lvl>
   </w:abstractNum>
-  <w:abstractNum w:abstractNumId="44" w15:restartNumberingAfterBreak="0">
+  <w:abstractNum w:abstractNumId="46" w15:restartNumberingAfterBreak="0">
     <w:nsid w:val="6F155348"/>
     <w:multiLevelType w:val="multilevel"/>
     <w:tmpl w:val="EBCA3440"/>
@@ -42154,7 +42750,6 @@
     <w:lvl w:ilvl="2">
       <w:start w:val="1"/>
       <w:numFmt w:val="decimal"/>
-      <w:pStyle w:val="Ttulo3"/>
       <w:lvlText w:val="%1.%2.%3."/>
       <w:lvlJc w:val="left"/>
       <w:pPr>
@@ -42216,7 +42811,7 @@
       </w:pPr>
     </w:lvl>
   </w:abstractNum>
-  <w:abstractNum w:abstractNumId="45" w15:restartNumberingAfterBreak="0">
+  <w:abstractNum w:abstractNumId="47" w15:restartNumberingAfterBreak="0">
     <w:nsid w:val="70442DED"/>
     <w:multiLevelType w:val="multilevel"/>
     <w:tmpl w:val="4DBA6AE6"/>
@@ -42365,7 +42960,7 @@
       </w:rPr>
     </w:lvl>
   </w:abstractNum>
-  <w:abstractNum w:abstractNumId="46" w15:restartNumberingAfterBreak="0">
+  <w:abstractNum w:abstractNumId="48" w15:restartNumberingAfterBreak="0">
     <w:nsid w:val="711914F5"/>
     <w:multiLevelType w:val="multilevel"/>
     <w:tmpl w:val="6D68B112"/>
@@ -42514,7 +43109,7 @@
       </w:rPr>
     </w:lvl>
   </w:abstractNum>
-  <w:abstractNum w:abstractNumId="47" w15:restartNumberingAfterBreak="0">
+  <w:abstractNum w:abstractNumId="49" w15:restartNumberingAfterBreak="0">
     <w:nsid w:val="73A553BF"/>
     <w:multiLevelType w:val="multilevel"/>
     <w:tmpl w:val="295C2B9A"/>
@@ -42663,7 +43258,7 @@
       </w:rPr>
     </w:lvl>
   </w:abstractNum>
-  <w:abstractNum w:abstractNumId="48" w15:restartNumberingAfterBreak="0">
+  <w:abstractNum w:abstractNumId="50" w15:restartNumberingAfterBreak="0">
     <w:nsid w:val="765860BC"/>
     <w:multiLevelType w:val="hybridMultilevel"/>
     <w:tmpl w:val="9A72A908"/>
@@ -42776,7 +43371,7 @@
       </w:rPr>
     </w:lvl>
   </w:abstractNum>
-  <w:abstractNum w:abstractNumId="49" w15:restartNumberingAfterBreak="0">
+  <w:abstractNum w:abstractNumId="51" w15:restartNumberingAfterBreak="0">
     <w:nsid w:val="78216ECD"/>
     <w:multiLevelType w:val="hybridMultilevel"/>
     <w:tmpl w:val="4AB21884"/>
@@ -42867,7 +43462,7 @@
       </w:pPr>
     </w:lvl>
   </w:abstractNum>
-  <w:abstractNum w:abstractNumId="50" w15:restartNumberingAfterBreak="0">
+  <w:abstractNum w:abstractNumId="52" w15:restartNumberingAfterBreak="0">
     <w:nsid w:val="7A5D0759"/>
     <w:multiLevelType w:val="hybridMultilevel"/>
     <w:tmpl w:val="0C08EEFE"/>
@@ -42980,7 +43575,7 @@
       </w:rPr>
     </w:lvl>
   </w:abstractNum>
-  <w:abstractNum w:abstractNumId="51" w15:restartNumberingAfterBreak="0">
+  <w:abstractNum w:abstractNumId="53" w15:restartNumberingAfterBreak="0">
     <w:nsid w:val="7AA558D2"/>
     <w:multiLevelType w:val="multilevel"/>
     <w:tmpl w:val="72C21220"/>
@@ -43129,7 +43724,7 @@
       </w:rPr>
     </w:lvl>
   </w:abstractNum>
-  <w:abstractNum w:abstractNumId="52" w15:restartNumberingAfterBreak="0">
+  <w:abstractNum w:abstractNumId="54" w15:restartNumberingAfterBreak="0">
     <w:nsid w:val="7AC77673"/>
     <w:multiLevelType w:val="multilevel"/>
     <w:tmpl w:val="D8EC9284"/>
@@ -43219,25 +43814,25 @@
     <w:abstractNumId w:val="22"/>
   </w:num>
   <w:num w:numId="2" w16cid:durableId="1840542852">
-    <w:abstractNumId w:val="29"/>
+    <w:abstractNumId w:val="30"/>
   </w:num>
   <w:num w:numId="3" w16cid:durableId="1275095667">
     <w:abstractNumId w:val="9"/>
   </w:num>
   <w:num w:numId="4" w16cid:durableId="41558580">
-    <w:abstractNumId w:val="34"/>
+    <w:abstractNumId w:val="35"/>
   </w:num>
   <w:num w:numId="5" w16cid:durableId="207304020">
     <w:abstractNumId w:val="19"/>
   </w:num>
   <w:num w:numId="6" w16cid:durableId="1857386155">
-    <w:abstractNumId w:val="48"/>
+    <w:abstractNumId w:val="50"/>
   </w:num>
   <w:num w:numId="7" w16cid:durableId="1872261165">
-    <w:abstractNumId w:val="38"/>
+    <w:abstractNumId w:val="39"/>
   </w:num>
   <w:num w:numId="8" w16cid:durableId="158471307">
-    <w:abstractNumId w:val="33"/>
+    <w:abstractNumId w:val="34"/>
   </w:num>
   <w:num w:numId="9" w16cid:durableId="1764952692">
     <w:abstractNumId w:val="11"/>
@@ -43246,55 +43841,55 @@
     <w:abstractNumId w:val="20"/>
   </w:num>
   <w:num w:numId="11" w16cid:durableId="1248534509">
-    <w:abstractNumId w:val="26"/>
+    <w:abstractNumId w:val="27"/>
   </w:num>
   <w:num w:numId="12" w16cid:durableId="210503888">
     <w:abstractNumId w:val="17"/>
   </w:num>
   <w:num w:numId="13" w16cid:durableId="1555702285">
-    <w:abstractNumId w:val="39"/>
+    <w:abstractNumId w:val="41"/>
   </w:num>
   <w:num w:numId="14" w16cid:durableId="248271054">
     <w:abstractNumId w:val="13"/>
   </w:num>
   <w:num w:numId="15" w16cid:durableId="1646204645">
-    <w:abstractNumId w:val="42"/>
+    <w:abstractNumId w:val="44"/>
   </w:num>
   <w:num w:numId="16" w16cid:durableId="1903249540">
-    <w:abstractNumId w:val="44"/>
+    <w:abstractNumId w:val="46"/>
   </w:num>
   <w:num w:numId="17" w16cid:durableId="1396002656">
     <w:abstractNumId w:val="10"/>
   </w:num>
   <w:num w:numId="18" w16cid:durableId="106200278">
-    <w:abstractNumId w:val="27"/>
+    <w:abstractNumId w:val="28"/>
   </w:num>
   <w:num w:numId="19" w16cid:durableId="463885504">
-    <w:abstractNumId w:val="35"/>
+    <w:abstractNumId w:val="36"/>
   </w:num>
   <w:num w:numId="20" w16cid:durableId="2133787372">
     <w:abstractNumId w:val="7"/>
   </w:num>
   <w:num w:numId="21" w16cid:durableId="1609922111">
-    <w:abstractNumId w:val="45"/>
+    <w:abstractNumId w:val="47"/>
   </w:num>
   <w:num w:numId="22" w16cid:durableId="1668896990">
     <w:abstractNumId w:val="14"/>
   </w:num>
   <w:num w:numId="23" w16cid:durableId="1796021903">
-    <w:abstractNumId w:val="46"/>
+    <w:abstractNumId w:val="48"/>
   </w:num>
   <w:num w:numId="24" w16cid:durableId="1391226069">
     <w:abstractNumId w:val="0"/>
   </w:num>
   <w:num w:numId="25" w16cid:durableId="857423298">
-    <w:abstractNumId w:val="31"/>
+    <w:abstractNumId w:val="32"/>
   </w:num>
   <w:num w:numId="26" w16cid:durableId="1619019686">
-    <w:abstractNumId w:val="41"/>
+    <w:abstractNumId w:val="43"/>
   </w:num>
   <w:num w:numId="27" w16cid:durableId="1878353781">
-    <w:abstractNumId w:val="41"/>
+    <w:abstractNumId w:val="43"/>
     <w:lvlOverride w:ilvl="0">
       <w:startOverride w:val="1"/>
     </w:lvlOverride>
@@ -43324,7 +43919,7 @@
     </w:lvlOverride>
   </w:num>
   <w:num w:numId="28" w16cid:durableId="353383719">
-    <w:abstractNumId w:val="52"/>
+    <w:abstractNumId w:val="54"/>
     <w:lvlOverride w:ilvl="0">
       <w:startOverride w:val="3"/>
     </w:lvlOverride>
@@ -43357,7 +43952,7 @@
     <w:abstractNumId w:val="5"/>
   </w:num>
   <w:num w:numId="30" w16cid:durableId="1994019352">
-    <w:abstractNumId w:val="49"/>
+    <w:abstractNumId w:val="51"/>
     <w:lvlOverride w:ilvl="0">
       <w:startOverride w:val="1"/>
     </w:lvlOverride>
@@ -43387,10 +43982,10 @@
     </w:lvlOverride>
   </w:num>
   <w:num w:numId="31" w16cid:durableId="1696078723">
-    <w:abstractNumId w:val="50"/>
+    <w:abstractNumId w:val="52"/>
   </w:num>
   <w:num w:numId="32" w16cid:durableId="1111170998">
-    <w:abstractNumId w:val="32"/>
+    <w:abstractNumId w:val="33"/>
   </w:num>
   <w:num w:numId="33" w16cid:durableId="1792938269">
     <w:abstractNumId w:val="2"/>
@@ -43399,16 +43994,16 @@
     <w:abstractNumId w:val="8"/>
   </w:num>
   <w:num w:numId="35" w16cid:durableId="1016495433">
-    <w:abstractNumId w:val="36"/>
+    <w:abstractNumId w:val="37"/>
   </w:num>
   <w:num w:numId="36" w16cid:durableId="1875848394">
-    <w:abstractNumId w:val="40"/>
+    <w:abstractNumId w:val="42"/>
   </w:num>
   <w:num w:numId="37" w16cid:durableId="1604075479">
     <w:abstractNumId w:val="6"/>
   </w:num>
   <w:num w:numId="38" w16cid:durableId="1323120294">
-    <w:abstractNumId w:val="37"/>
+    <w:abstractNumId w:val="38"/>
   </w:num>
   <w:num w:numId="39" w16cid:durableId="1398894379">
     <w:abstractNumId w:val="16"/>
@@ -43420,13 +44015,13 @@
     <w:abstractNumId w:val="23"/>
   </w:num>
   <w:num w:numId="42" w16cid:durableId="1600334535">
-    <w:abstractNumId w:val="30"/>
+    <w:abstractNumId w:val="31"/>
   </w:num>
   <w:num w:numId="43" w16cid:durableId="61222334">
-    <w:abstractNumId w:val="28"/>
+    <w:abstractNumId w:val="29"/>
   </w:num>
   <w:num w:numId="44" w16cid:durableId="2025980791">
-    <w:abstractNumId w:val="24"/>
+    <w:abstractNumId w:val="25"/>
   </w:num>
   <w:num w:numId="45" w16cid:durableId="1200051858">
     <w:abstractNumId w:val="4"/>
@@ -43435,7 +44030,7 @@
     <w:abstractNumId w:val="15"/>
   </w:num>
   <w:num w:numId="47" w16cid:durableId="2033872056">
-    <w:abstractNumId w:val="43"/>
+    <w:abstractNumId w:val="45"/>
   </w:num>
   <w:num w:numId="48" w16cid:durableId="2102489703">
     <w:abstractNumId w:val="18"/>
@@ -43450,10 +44045,10 @@
     <w:abstractNumId w:val="12"/>
   </w:num>
   <w:num w:numId="52" w16cid:durableId="213783911">
-    <w:abstractNumId w:val="49"/>
+    <w:abstractNumId w:val="51"/>
   </w:num>
   <w:num w:numId="53" w16cid:durableId="1462963260">
-    <w:abstractNumId w:val="36"/>
+    <w:abstractNumId w:val="37"/>
     <w:lvlOverride w:ilvl="0">
       <w:startOverride w:val="3"/>
     </w:lvlOverride>
@@ -43462,13 +44057,19 @@
     </w:lvlOverride>
   </w:num>
   <w:num w:numId="54" w16cid:durableId="230502457">
-    <w:abstractNumId w:val="47"/>
+    <w:abstractNumId w:val="49"/>
   </w:num>
   <w:num w:numId="55" w16cid:durableId="20203624">
-    <w:abstractNumId w:val="25"/>
+    <w:abstractNumId w:val="26"/>
   </w:num>
   <w:num w:numId="56" w16cid:durableId="1740060485">
-    <w:abstractNumId w:val="51"/>
+    <w:abstractNumId w:val="53"/>
+  </w:num>
+  <w:num w:numId="57" w16cid:durableId="1704675748">
+    <w:abstractNumId w:val="24"/>
+  </w:num>
+  <w:num w:numId="58" w16cid:durableId="278730376">
+    <w:abstractNumId w:val="40"/>
   </w:num>
   <w:numIdMacAtCleanup w:val="51"/>
 </w:numbering>
@@ -43956,22 +44557,20 @@
     <w:uiPriority w:val="9"/>
     <w:unhideWhenUsed/>
     <w:qFormat/>
-    <w:rsid w:val="004E76DD"/>
+    <w:rsid w:val="00F45C40"/>
     <w:pPr>
       <w:keepNext/>
       <w:keepLines/>
       <w:numPr>
         <w:ilvl w:val="2"/>
-        <w:numId w:val="16"/>
+        <w:numId w:val="35"/>
       </w:numPr>
       <w:spacing w:after="227"/>
-      <w:ind w:left="504"/>
       <w:outlineLvl w:val="2"/>
     </w:pPr>
     <w:rPr>
       <w:rFonts w:ascii="Arial" w:eastAsia="Arial" w:hAnsi="Arial" w:cs="Arial"/>
       <w:b/>
-      <w:color w:val="000000"/>
     </w:rPr>
   </w:style>
   <w:style w:type="paragraph" w:styleId="Ttulo4">
@@ -44082,11 +44681,10 @@
     <w:name w:val="Título 3 Car"/>
     <w:link w:val="Ttulo3"/>
     <w:uiPriority w:val="9"/>
-    <w:rsid w:val="004E76DD"/>
+    <w:rsid w:val="00F45C40"/>
     <w:rPr>
       <w:rFonts w:ascii="Arial" w:eastAsia="Arial" w:hAnsi="Arial" w:cs="Arial"/>
       <w:b/>
-      <w:color w:val="000000"/>
     </w:rPr>
   </w:style>
   <w:style w:type="paragraph" w:styleId="TDC1">

</xml_diff>

<commit_message>
Algoritmos Importantes Capitulo 3
</commit_message>
<xml_diff>
--- a/DOC/Informe de Tesis Dariel Cabrera Lopez con formato J (1).docx
+++ b/DOC/Informe de Tesis Dariel Cabrera Lopez con formato J (1).docx
@@ -7885,7 +7885,25 @@
           <w:sz w:val="22"/>
           <w:szCs w:val="22"/>
         </w:rPr>
-        <w:t>Cuenta con servicio web pero no ofrece todas las funcionalidades que su versión de escritorio.</w:t>
+        <w:t xml:space="preserve">Cuenta con servicio </w:t>
+      </w:r>
+      <w:proofErr w:type="gramStart"/>
+      <w:r>
+        <w:rPr>
+          <w:rFonts w:ascii="Arial" w:hAnsi="Arial" w:cs="Arial"/>
+          <w:sz w:val="22"/>
+          <w:szCs w:val="22"/>
+        </w:rPr>
+        <w:t>web</w:t>
+      </w:r>
+      <w:proofErr w:type="gramEnd"/>
+      <w:r>
+        <w:rPr>
+          <w:rFonts w:ascii="Arial" w:hAnsi="Arial" w:cs="Arial"/>
+          <w:sz w:val="22"/>
+          <w:szCs w:val="22"/>
+        </w:rPr>
+        <w:t xml:space="preserve"> pero no ofrece todas las funcionalidades que su versión de escritorio.</w:t>
       </w:r>
     </w:p>
     <w:p>
@@ -8204,8 +8222,18 @@
           <w:sz w:val="22"/>
           <w:szCs w:val="22"/>
         </w:rPr>
-        <w:t xml:space="preserve"> y  Linux</w:t>
-      </w:r>
+        <w:t xml:space="preserve"> </w:t>
+      </w:r>
+      <w:proofErr w:type="gramStart"/>
+      <w:r>
+        <w:rPr>
+          <w:rFonts w:ascii="Arial" w:hAnsi="Arial" w:cs="Arial"/>
+          <w:sz w:val="22"/>
+          <w:szCs w:val="22"/>
+        </w:rPr>
+        <w:t>y  Linux</w:t>
+      </w:r>
+      <w:proofErr w:type="gramEnd"/>
     </w:p>
     <w:p>
       <w:pPr>
@@ -10224,7 +10252,15 @@
         <w:spacing w:line="360" w:lineRule="auto"/>
       </w:pPr>
       <w:r>
-        <w:t xml:space="preserve">Es un entorno en tiempo de ejecución multiplataforma de código abierto del lado del servidor en el lenguaje de programación JavaScript, asíncrono, con E/S (Entrada y salida) de datos en una arquitectura orientada a eventos y basado en el motor V8 de Google. Fue creado con el enfoque de ser útil en la creación de programas de red altamente escalables, como por ejemplo, servidores web. Fue creado por Ryan Dahl en 2009 y su evolución está apadrinada por la empresa </w:t>
+        <w:t xml:space="preserve">Es un entorno en tiempo de ejecución multiplataforma de código abierto del lado del servidor en el lenguaje de programación JavaScript, asíncrono, con E/S (Entrada y salida) de datos en una arquitectura orientada a eventos y basado en el motor V8 de Google. Fue creado con el enfoque de ser útil en la creación de programas de red altamente escalables, </w:t>
+      </w:r>
+      <w:proofErr w:type="gramStart"/>
+      <w:r>
+        <w:t>como</w:t>
+      </w:r>
+      <w:proofErr w:type="gramEnd"/>
+      <w:r>
+        <w:t xml:space="preserve"> por ejemplo, servidores web. Fue creado por Ryan Dahl en 2009 y su evolución está apadrinada por la empresa </w:t>
       </w:r>
       <w:proofErr w:type="spellStart"/>
       <w:r>
@@ -19354,9 +19390,19 @@
           <w:sz w:val="22"/>
           <w:szCs w:val="22"/>
         </w:rPr>
-        <w:t>l fichero  .</w:t>
+        <w:t xml:space="preserve">l </w:t>
+      </w:r>
+      <w:proofErr w:type="gramStart"/>
+      <w:r>
+        <w:rPr>
+          <w:b/>
+          <w:sz w:val="22"/>
+          <w:szCs w:val="22"/>
+        </w:rPr>
+        <w:t>fichero  .</w:t>
       </w:r>
       <w:proofErr w:type="spellStart"/>
+      <w:proofErr w:type="gramEnd"/>
       <w:r>
         <w:rPr>
           <w:b/>
@@ -19655,16 +19701,34 @@
           <w:sz w:val="18"/>
           <w:szCs w:val="18"/>
         </w:rPr>
-        <w:t>Figura 3.2 Fichero .</w:t>
-      </w:r>
-      <w:proofErr w:type="spellStart"/>
+        <w:t xml:space="preserve">Figura 3.2 </w:t>
+      </w:r>
+      <w:proofErr w:type="gramStart"/>
       <w:r>
         <w:rPr>
           <w:bCs/>
           <w:sz w:val="18"/>
           <w:szCs w:val="18"/>
         </w:rPr>
-        <w:t>env.example</w:t>
+        <w:t>Fichero .</w:t>
+      </w:r>
+      <w:proofErr w:type="spellStart"/>
+      <w:r>
+        <w:rPr>
+          <w:bCs/>
+          <w:sz w:val="18"/>
+          <w:szCs w:val="18"/>
+        </w:rPr>
+        <w:t>env</w:t>
+      </w:r>
+      <w:proofErr w:type="gramEnd"/>
+      <w:r>
+        <w:rPr>
+          <w:bCs/>
+          <w:sz w:val="18"/>
+          <w:szCs w:val="18"/>
+        </w:rPr>
+        <w:t>.example</w:t>
       </w:r>
       <w:proofErr w:type="spellEnd"/>
     </w:p>
@@ -19858,13 +19922,6 @@
         </w:rPr>
         <w:t>.</w:t>
       </w:r>
-    </w:p>
-    <w:p>
-      <w:pPr>
-        <w:rPr>
-          <w:color w:val="auto"/>
-        </w:rPr>
-      </w:pPr>
     </w:p>
     <w:p>
       <w:pPr>
@@ -20275,7 +20332,6 @@
           <w:b/>
           <w:bCs w:val="0"/>
         </w:rPr>
-        <w:lastRenderedPageBreak/>
         <w:t>Autenticación y autorización con contexto</w:t>
       </w:r>
     </w:p>
@@ -20331,6 +20387,7 @@
           <w:sz w:val="22"/>
           <w:szCs w:val="22"/>
         </w:rPr>
+        <w:lastRenderedPageBreak/>
         <w:t>isAuthenticated</w:t>
       </w:r>
       <w:proofErr w:type="spellEnd"/>
@@ -20643,7 +20700,6 @@
         <w:rPr>
           <w:color w:val="auto"/>
         </w:rPr>
-        <w:lastRenderedPageBreak/>
         <w:t xml:space="preserve">El token JWT se almacena en </w:t>
       </w:r>
       <w:proofErr w:type="spellStart"/>
@@ -20688,6 +20744,7 @@
         <w:pStyle w:val="Ttulo3"/>
       </w:pPr>
       <w:r>
+        <w:lastRenderedPageBreak/>
         <w:t>Validación de roles permitidos</w:t>
       </w:r>
     </w:p>
@@ -20827,7 +20884,6 @@
           <w:sz w:val="18"/>
           <w:szCs w:val="18"/>
         </w:rPr>
-        <w:lastRenderedPageBreak/>
         <w:t>Figura 3.5</w:t>
       </w:r>
       <w:r>
@@ -20869,9 +20925,11 @@
           <w:color w:val="auto"/>
           <w:lang w:val="es-ES"/>
         </w:rPr>
+        <w:lastRenderedPageBreak/>
         <w:t>Si la ruta requiere rol de administrador (</w:t>
       </w:r>
       <w:proofErr w:type="spellStart"/>
+      <w:proofErr w:type="gramStart"/>
       <w:r>
         <w:rPr>
           <w:color w:val="auto"/>
@@ -20880,6 +20938,7 @@
         <w:t>route.adminOnly</w:t>
       </w:r>
       <w:proofErr w:type="spellEnd"/>
+      <w:proofErr w:type="gramEnd"/>
       <w:r>
         <w:rPr>
           <w:color w:val="auto"/>
@@ -20940,17 +20999,19 @@
       <w:pPr>
         <w:spacing w:before="100" w:beforeAutospacing="1" w:after="100" w:afterAutospacing="1"/>
         <w:rPr>
-          <w:b/>
-          <w:bCs/>
+          <w:rFonts w:ascii="Courier New" w:hAnsi="Courier New" w:cs="Courier New"/>
           <w:color w:val="auto"/>
+          <w:sz w:val="18"/>
+          <w:szCs w:val="18"/>
           <w:lang w:val="es-ES"/>
         </w:rPr>
       </w:pPr>
       <w:r>
         <w:rPr>
-          <w:b/>
-          <w:bCs/>
+          <w:rFonts w:ascii="Courier New" w:hAnsi="Courier New" w:cs="Courier New"/>
           <w:color w:val="auto"/>
+          <w:sz w:val="18"/>
+          <w:szCs w:val="18"/>
           <w:lang w:val="es-ES"/>
         </w:rPr>
         <w:t>&lt;</w:t>
@@ -20958,9 +21019,10 @@
       <w:proofErr w:type="spellStart"/>
       <w:r>
         <w:rPr>
-          <w:b/>
-          <w:bCs/>
+          <w:rFonts w:ascii="Courier New" w:hAnsi="Courier New" w:cs="Courier New"/>
           <w:color w:val="auto"/>
+          <w:sz w:val="18"/>
+          <w:szCs w:val="18"/>
           <w:lang w:val="es-ES"/>
         </w:rPr>
         <w:t>AdminRoute</w:t>
@@ -20968,29 +21030,34 @@
       <w:proofErr w:type="spellEnd"/>
       <w:r>
         <w:rPr>
-          <w:b/>
-          <w:bCs/>
+          <w:rFonts w:ascii="Courier New" w:hAnsi="Courier New" w:cs="Courier New"/>
           <w:color w:val="auto"/>
+          <w:sz w:val="18"/>
+          <w:szCs w:val="18"/>
           <w:lang w:val="es-ES"/>
         </w:rPr>
         <w:t>&gt;{</w:t>
       </w:r>
       <w:proofErr w:type="spellStart"/>
-      <w:r>
-        <w:rPr>
-          <w:b/>
-          <w:bCs/>
+      <w:proofErr w:type="gramStart"/>
+      <w:r>
+        <w:rPr>
+          <w:rFonts w:ascii="Courier New" w:hAnsi="Courier New" w:cs="Courier New"/>
           <w:color w:val="auto"/>
+          <w:sz w:val="18"/>
+          <w:szCs w:val="18"/>
           <w:lang w:val="es-ES"/>
         </w:rPr>
         <w:t>route.component</w:t>
       </w:r>
       <w:proofErr w:type="spellEnd"/>
-      <w:r>
-        <w:rPr>
-          <w:b/>
-          <w:bCs/>
+      <w:proofErr w:type="gramEnd"/>
+      <w:r>
+        <w:rPr>
+          <w:rFonts w:ascii="Courier New" w:hAnsi="Courier New" w:cs="Courier New"/>
           <w:color w:val="auto"/>
+          <w:sz w:val="18"/>
+          <w:szCs w:val="18"/>
           <w:lang w:val="es-ES"/>
         </w:rPr>
         <w:t>}&lt;/</w:t>
@@ -20998,9 +21065,10 @@
       <w:proofErr w:type="spellStart"/>
       <w:r>
         <w:rPr>
-          <w:b/>
-          <w:bCs/>
+          <w:rFonts w:ascii="Courier New" w:hAnsi="Courier New" w:cs="Courier New"/>
           <w:color w:val="auto"/>
+          <w:sz w:val="18"/>
+          <w:szCs w:val="18"/>
           <w:lang w:val="es-ES"/>
         </w:rPr>
         <w:t>AdminRoute</w:t>
@@ -21008,9 +21076,10 @@
       <w:proofErr w:type="spellEnd"/>
       <w:r>
         <w:rPr>
-          <w:b/>
-          <w:bCs/>
+          <w:rFonts w:ascii="Courier New" w:hAnsi="Courier New" w:cs="Courier New"/>
           <w:color w:val="auto"/>
+          <w:sz w:val="18"/>
+          <w:szCs w:val="18"/>
           <w:lang w:val="es-ES"/>
         </w:rPr>
         <w:t>&gt;</w:t>
@@ -21064,17 +21133,19 @@
         <w:spacing w:before="100" w:beforeAutospacing="1" w:after="100" w:afterAutospacing="1"/>
         <w:ind w:left="0" w:firstLine="0"/>
         <w:rPr>
-          <w:b/>
-          <w:bCs/>
+          <w:rFonts w:ascii="Courier New" w:hAnsi="Courier New" w:cs="Courier New"/>
           <w:color w:val="auto"/>
+          <w:sz w:val="18"/>
+          <w:szCs w:val="18"/>
           <w:lang w:val="en-US"/>
         </w:rPr>
       </w:pPr>
       <w:r>
         <w:rPr>
-          <w:b/>
-          <w:bCs/>
+          <w:rFonts w:ascii="Courier New" w:hAnsi="Courier New" w:cs="Courier New"/>
           <w:color w:val="auto"/>
+          <w:sz w:val="18"/>
+          <w:szCs w:val="18"/>
           <w:lang w:val="en-US"/>
         </w:rPr>
         <w:t xml:space="preserve">&lt;ProtectedRoute </w:t>
@@ -21082,29 +21153,34 @@
       <w:proofErr w:type="spellStart"/>
       <w:r>
         <w:rPr>
-          <w:b/>
-          <w:bCs/>
+          <w:rFonts w:ascii="Courier New" w:hAnsi="Courier New" w:cs="Courier New"/>
           <w:color w:val="auto"/>
+          <w:sz w:val="18"/>
+          <w:szCs w:val="18"/>
           <w:lang w:val="en-US"/>
         </w:rPr>
         <w:t>isAuthenticated</w:t>
       </w:r>
       <w:proofErr w:type="spellEnd"/>
-      <w:r>
-        <w:rPr>
-          <w:b/>
-          <w:bCs/>
+      <w:proofErr w:type="gramStart"/>
+      <w:r>
+        <w:rPr>
+          <w:rFonts w:ascii="Courier New" w:hAnsi="Courier New" w:cs="Courier New"/>
           <w:color w:val="auto"/>
+          <w:sz w:val="18"/>
+          <w:szCs w:val="18"/>
           <w:lang w:val="en-US"/>
         </w:rPr>
         <w:t>={</w:t>
       </w:r>
       <w:proofErr w:type="spellStart"/>
-      <w:r>
-        <w:rPr>
-          <w:b/>
-          <w:bCs/>
+      <w:proofErr w:type="gramEnd"/>
+      <w:r>
+        <w:rPr>
+          <w:rFonts w:ascii="Courier New" w:hAnsi="Courier New" w:cs="Courier New"/>
           <w:color w:val="auto"/>
+          <w:sz w:val="18"/>
+          <w:szCs w:val="18"/>
           <w:lang w:val="en-US"/>
         </w:rPr>
         <w:t>authContext.isAuthenticated</w:t>
@@ -21112,9 +21188,10 @@
       <w:proofErr w:type="spellEnd"/>
       <w:r>
         <w:rPr>
-          <w:b/>
-          <w:bCs/>
+          <w:rFonts w:ascii="Courier New" w:hAnsi="Courier New" w:cs="Courier New"/>
           <w:color w:val="auto"/>
+          <w:sz w:val="18"/>
+          <w:szCs w:val="18"/>
           <w:lang w:val="en-US"/>
         </w:rPr>
         <w:t>}&gt;</w:t>
@@ -21125,37 +21202,43 @@
         <w:spacing w:before="100" w:beforeAutospacing="1" w:after="100" w:afterAutospacing="1"/>
         <w:ind w:left="0" w:firstLine="0"/>
         <w:rPr>
-          <w:b/>
-          <w:bCs/>
+          <w:rFonts w:ascii="Courier New" w:hAnsi="Courier New" w:cs="Courier New"/>
           <w:color w:val="auto"/>
+          <w:sz w:val="18"/>
+          <w:szCs w:val="18"/>
           <w:lang w:val="en-US"/>
         </w:rPr>
       </w:pPr>
       <w:r>
         <w:rPr>
-          <w:b/>
-          <w:bCs/>
+          <w:rFonts w:ascii="Courier New" w:hAnsi="Courier New" w:cs="Courier New"/>
           <w:color w:val="auto"/>
+          <w:sz w:val="18"/>
+          <w:szCs w:val="18"/>
           <w:lang w:val="en-US"/>
         </w:rPr>
         <w:t xml:space="preserve">  {</w:t>
       </w:r>
       <w:proofErr w:type="spellStart"/>
-      <w:r>
-        <w:rPr>
-          <w:b/>
-          <w:bCs/>
+      <w:proofErr w:type="gramStart"/>
+      <w:r>
+        <w:rPr>
+          <w:rFonts w:ascii="Courier New" w:hAnsi="Courier New" w:cs="Courier New"/>
           <w:color w:val="auto"/>
+          <w:sz w:val="18"/>
+          <w:szCs w:val="18"/>
           <w:lang w:val="en-US"/>
         </w:rPr>
         <w:t>route.component</w:t>
       </w:r>
       <w:proofErr w:type="spellEnd"/>
-      <w:r>
-        <w:rPr>
-          <w:b/>
-          <w:bCs/>
+      <w:proofErr w:type="gramEnd"/>
+      <w:r>
+        <w:rPr>
+          <w:rFonts w:ascii="Courier New" w:hAnsi="Courier New" w:cs="Courier New"/>
           <w:color w:val="auto"/>
+          <w:sz w:val="18"/>
+          <w:szCs w:val="18"/>
           <w:lang w:val="en-US"/>
         </w:rPr>
         <w:t>}</w:t>
@@ -21166,34 +21249,38 @@
         <w:spacing w:before="100" w:beforeAutospacing="1" w:after="100" w:afterAutospacing="1"/>
         <w:ind w:left="0" w:firstLine="0"/>
         <w:rPr>
-          <w:b/>
-          <w:bCs/>
+          <w:rFonts w:ascii="Courier New" w:hAnsi="Courier New" w:cs="Courier New"/>
           <w:color w:val="auto"/>
-        </w:rPr>
-      </w:pPr>
-      <w:r>
-        <w:rPr>
-          <w:b/>
-          <w:bCs/>
+          <w:sz w:val="18"/>
+          <w:szCs w:val="18"/>
+        </w:rPr>
+      </w:pPr>
+      <w:r>
+        <w:rPr>
+          <w:rFonts w:ascii="Courier New" w:hAnsi="Courier New" w:cs="Courier New"/>
           <w:color w:val="auto"/>
+          <w:sz w:val="18"/>
+          <w:szCs w:val="18"/>
         </w:rPr>
         <w:t>&lt;/</w:t>
       </w:r>
       <w:proofErr w:type="spellStart"/>
       <w:r>
         <w:rPr>
-          <w:b/>
-          <w:bCs/>
+          <w:rFonts w:ascii="Courier New" w:hAnsi="Courier New" w:cs="Courier New"/>
           <w:color w:val="auto"/>
+          <w:sz w:val="18"/>
+          <w:szCs w:val="18"/>
         </w:rPr>
         <w:t>ProtectedRoute</w:t>
       </w:r>
       <w:proofErr w:type="spellEnd"/>
       <w:r>
         <w:rPr>
-          <w:b/>
-          <w:bCs/>
+          <w:rFonts w:ascii="Courier New" w:hAnsi="Courier New" w:cs="Courier New"/>
           <w:color w:val="auto"/>
+          <w:sz w:val="18"/>
+          <w:szCs w:val="18"/>
         </w:rPr>
         <w:t>&gt;</w:t>
       </w:r>
@@ -22260,8 +22347,13 @@
               </w:numPr>
               <w:spacing w:after="0" w:line="360" w:lineRule="auto"/>
             </w:pPr>
-            <w:r>
-              <w:t>Se  registra y entra al sistema</w:t>
+            <w:proofErr w:type="gramStart"/>
+            <w:r>
+              <w:t>Se  registra</w:t>
+            </w:r>
+            <w:proofErr w:type="gramEnd"/>
+            <w:r>
+              <w:t xml:space="preserve"> y entra al sistema</w:t>
             </w:r>
           </w:p>
         </w:tc>
@@ -23525,40 +23617,599 @@
     <w:p>
       <w:pPr>
         <w:pStyle w:val="Ttulo2"/>
+      </w:pPr>
+      <w:bookmarkStart w:id="131" w:name="_Toc164240460"/>
+      <w:r>
+        <w:lastRenderedPageBreak/>
+        <w:t>Algoritmos Importantes</w:t>
+      </w:r>
+      <w:bookmarkEnd w:id="131"/>
+    </w:p>
+    <w:p>
+      <w:pPr>
+        <w:spacing w:after="0" w:line="360" w:lineRule="auto"/>
+        <w:rPr>
+          <w:lang w:val="es-ES_tradnl" w:eastAsia="es-ES"/>
+        </w:rPr>
+      </w:pPr>
+      <w:r>
+        <w:rPr>
+          <w:lang w:val="es-ES_tradnl" w:eastAsia="es-ES"/>
+        </w:rPr>
+        <w:t xml:space="preserve">A continuación, se </w:t>
+      </w:r>
+      <w:r>
+        <w:rPr>
+          <w:lang w:val="es-ES_tradnl" w:eastAsia="es-ES"/>
+        </w:rPr>
+        <w:t>analiza</w:t>
+      </w:r>
+      <w:r>
+        <w:rPr>
+          <w:lang w:val="es-ES_tradnl" w:eastAsia="es-ES"/>
+        </w:rPr>
+        <w:t>n los algoritmos más importantes del sistema que le dieron cumplimiento al problema de investigación y a los requerimientos del sistema.</w:t>
+      </w:r>
+    </w:p>
+    <w:p>
+      <w:pPr>
+        <w:pStyle w:val="Ttulo3"/>
+        <w:rPr>
+          <w:lang w:val="es-ES_tradnl" w:eastAsia="es-ES"/>
+        </w:rPr>
+      </w:pPr>
+      <w:r>
+        <w:rPr>
+          <w:lang w:val="es-ES_tradnl" w:eastAsia="es-ES"/>
+        </w:rPr>
+        <w:t>Cálculo del Transporte de Sedimentos</w:t>
+      </w:r>
+      <w:r>
+        <w:rPr>
+          <w:lang w:val="es-ES_tradnl" w:eastAsia="es-ES"/>
+        </w:rPr>
+        <w:t xml:space="preserve"> (Q)</w:t>
+      </w:r>
+    </w:p>
+    <w:p>
+      <w:pPr>
+        <w:spacing w:before="100" w:beforeAutospacing="1" w:after="100" w:afterAutospacing="1" w:line="360" w:lineRule="auto"/>
+        <w:ind w:left="0" w:firstLine="0"/>
+        <w:rPr>
+          <w:rFonts w:eastAsia="Times New Roman"/>
+          <w:color w:val="auto"/>
+          <w:lang w:val="es-ES" w:eastAsia="en-US"/>
+        </w:rPr>
+      </w:pPr>
+      <w:r>
+        <w:rPr>
+          <w:rFonts w:eastAsia="Times New Roman"/>
+          <w:color w:val="auto"/>
+          <w:lang w:val="es-ES" w:eastAsia="en-US"/>
+        </w:rPr>
+        <w:t>El código de la Figura 3.9 define una</w:t>
+      </w:r>
+      <w:r>
+        <w:rPr>
+          <w:rFonts w:eastAsia="Times New Roman"/>
+          <w:color w:val="auto"/>
+          <w:lang w:val="es-ES" w:eastAsia="en-US"/>
+        </w:rPr>
+        <w:t xml:space="preserve"> función </w:t>
+      </w:r>
+      <w:proofErr w:type="spellStart"/>
+      <w:r>
+        <w:rPr>
+          <w:rFonts w:eastAsia="Times New Roman"/>
+          <w:i/>
+          <w:iCs/>
+          <w:color w:val="auto"/>
+          <w:lang w:val="es-ES" w:eastAsia="en-US"/>
+        </w:rPr>
+        <w:t>calculationQ</w:t>
+      </w:r>
+      <w:proofErr w:type="spellEnd"/>
+      <w:r>
+        <w:rPr>
+          <w:rFonts w:eastAsia="Times New Roman"/>
+          <w:color w:val="auto"/>
+          <w:lang w:val="es-ES" w:eastAsia="en-US"/>
+        </w:rPr>
+        <w:t xml:space="preserve"> que </w:t>
+      </w:r>
+      <w:r>
+        <w:rPr>
+          <w:rFonts w:eastAsia="Times New Roman"/>
+          <w:color w:val="auto"/>
+          <w:lang w:val="es-ES" w:eastAsia="en-US"/>
+        </w:rPr>
+        <w:t xml:space="preserve">recibe valores físicos como la densidad del </w:t>
+      </w:r>
+      <w:r>
+        <w:rPr>
+          <w:rFonts w:eastAsia="Times New Roman"/>
+          <w:color w:val="auto"/>
+          <w:lang w:val="es-ES" w:eastAsia="en-US"/>
+        </w:rPr>
+        <w:t>mar, densidad de arena</w:t>
+      </w:r>
+      <w:r>
+        <w:rPr>
+          <w:rFonts w:eastAsia="Times New Roman"/>
+          <w:color w:val="auto"/>
+          <w:lang w:val="es-ES" w:eastAsia="en-US"/>
+        </w:rPr>
+        <w:t>, el índice de porosidad</w:t>
+      </w:r>
+      <w:r>
+        <w:rPr>
+          <w:rFonts w:eastAsia="Times New Roman"/>
+          <w:color w:val="auto"/>
+          <w:lang w:val="es-ES" w:eastAsia="en-US"/>
+        </w:rPr>
+        <w:t>, etc</w:t>
+      </w:r>
+      <w:r>
+        <w:rPr>
+          <w:rFonts w:eastAsia="Times New Roman"/>
+          <w:color w:val="auto"/>
+          <w:lang w:val="es-ES" w:eastAsia="en-US"/>
+        </w:rPr>
+        <w:t>. A partir de estos datos, realiza operaciones matemáticas que incluyen potencias, raíces cuadradas</w:t>
+      </w:r>
+      <w:r>
+        <w:rPr>
+          <w:rFonts w:eastAsia="Times New Roman"/>
+          <w:color w:val="auto"/>
+          <w:lang w:val="es-ES" w:eastAsia="en-US"/>
+        </w:rPr>
+        <w:t xml:space="preserve">, </w:t>
+      </w:r>
+      <w:r>
+        <w:rPr>
+          <w:rFonts w:eastAsia="Times New Roman"/>
+          <w:color w:val="auto"/>
+          <w:lang w:val="es-ES" w:eastAsia="en-US"/>
+        </w:rPr>
+        <w:t>funciones trigonométricas</w:t>
+      </w:r>
+      <w:r>
+        <w:rPr>
+          <w:rFonts w:eastAsia="Times New Roman"/>
+          <w:color w:val="auto"/>
+          <w:lang w:val="es-ES" w:eastAsia="en-US"/>
+        </w:rPr>
+        <w:t xml:space="preserve"> y la conversión de grados a radianes</w:t>
+      </w:r>
+      <w:r>
+        <w:rPr>
+          <w:rFonts w:eastAsia="Times New Roman"/>
+          <w:color w:val="auto"/>
+          <w:lang w:val="es-ES" w:eastAsia="en-US"/>
+        </w:rPr>
+        <w:t>. El algoritmo controla posibles errores como divisiones por cero o resultados inválidos, y devuelve un valor numérico redondeado, garantizando precisión y robustez en el proceso de cálculo.</w:t>
+      </w:r>
+    </w:p>
+    <w:p>
+      <w:pPr>
+        <w:rPr>
+          <w:lang w:val="es-ES_tradnl" w:eastAsia="es-ES"/>
+        </w:rPr>
+      </w:pPr>
+    </w:p>
+    <w:p>
+      <w:pPr>
         <w:rPr>
           <w:lang w:eastAsia="en-US"/>
         </w:rPr>
       </w:pPr>
       <w:r>
         <w:rPr>
+          <w:noProof/>
           <w:lang w:eastAsia="en-US"/>
         </w:rPr>
         <w:lastRenderedPageBreak/>
-        <w:t>Descripción</w:t>
-      </w:r>
-      <w:r>
-        <w:rPr>
+        <w:drawing>
+          <wp:inline distT="0" distB="0" distL="0" distR="0" wp14:anchorId="1DE16BEC" wp14:editId="18846017">
+            <wp:extent cx="5966460" cy="5044440"/>
+            <wp:effectExtent l="95250" t="95250" r="91440" b="99060"/>
+            <wp:docPr id="1608761765" name="Imagen 30"/>
+            <wp:cNvGraphicFramePr>
+              <a:graphicFrameLocks xmlns:a="http://schemas.openxmlformats.org/drawingml/2006/main" noChangeAspect="1"/>
+            </wp:cNvGraphicFramePr>
+            <a:graphic xmlns:a="http://schemas.openxmlformats.org/drawingml/2006/main">
+              <a:graphicData uri="http://schemas.openxmlformats.org/drawingml/2006/picture">
+                <pic:pic xmlns:pic="http://schemas.openxmlformats.org/drawingml/2006/picture">
+                  <pic:nvPicPr>
+                    <pic:cNvPr id="0" name="Picture 1"/>
+                    <pic:cNvPicPr>
+                      <a:picLocks noChangeAspect="1" noChangeArrowheads="1"/>
+                    </pic:cNvPicPr>
+                  </pic:nvPicPr>
+                  <pic:blipFill>
+                    <a:blip r:embed="rId84">
+                      <a:extLst>
+                        <a:ext uri="{28A0092B-C50C-407E-A947-70E740481C1C}">
+                          <a14:useLocalDpi xmlns:a14="http://schemas.microsoft.com/office/drawing/2010/main" val="0"/>
+                        </a:ext>
+                      </a:extLst>
+                    </a:blip>
+                    <a:srcRect/>
+                    <a:stretch>
+                      <a:fillRect/>
+                    </a:stretch>
+                  </pic:blipFill>
+                  <pic:spPr bwMode="auto">
+                    <a:xfrm>
+                      <a:off x="0" y="0"/>
+                      <a:ext cx="5966460" cy="5044440"/>
+                    </a:xfrm>
+                    <a:prstGeom prst="rect">
+                      <a:avLst/>
+                    </a:prstGeom>
+                    <a:ln w="88900" cap="sq" cmpd="thickThin">
+                      <a:solidFill>
+                        <a:srgbClr val="000000"/>
+                      </a:solidFill>
+                      <a:prstDash val="solid"/>
+                      <a:miter lim="800000"/>
+                    </a:ln>
+                    <a:effectLst>
+                      <a:innerShdw blurRad="76200">
+                        <a:srgbClr val="000000"/>
+                      </a:innerShdw>
+                    </a:effectLst>
+                  </pic:spPr>
+                </pic:pic>
+              </a:graphicData>
+            </a:graphic>
+          </wp:inline>
+        </w:drawing>
+      </w:r>
+    </w:p>
+    <w:p>
+      <w:pPr>
+        <w:rPr>
+          <w:sz w:val="18"/>
+          <w:szCs w:val="18"/>
           <w:lang w:eastAsia="en-US"/>
         </w:rPr>
-        <w:t xml:space="preserve"> de Métodos y Funcionalidades</w:t>
-      </w:r>
-    </w:p>
-    <w:p>
-      <w:pPr>
-        <w:rPr>
+      </w:pPr>
+      <w:r>
+        <w:rPr>
+          <w:b/>
+          <w:bCs/>
+          <w:sz w:val="18"/>
+          <w:szCs w:val="18"/>
           <w:lang w:eastAsia="en-US"/>
         </w:rPr>
-      </w:pPr>
+        <w:t>Figura 3.9</w:t>
+      </w:r>
+      <w:r>
+        <w:rPr>
+          <w:sz w:val="18"/>
+          <w:szCs w:val="18"/>
+          <w:lang w:eastAsia="en-US"/>
+        </w:rPr>
+        <w:t xml:space="preserve"> Función para calcular el transporte de sedimentos(Q)</w:t>
+      </w:r>
+    </w:p>
+    <w:p>
+      <w:pPr>
+        <w:pStyle w:val="Ttulo3"/>
+        <w:rPr>
+          <w:lang w:eastAsia="en-US"/>
+        </w:rPr>
+      </w:pPr>
+      <w:r>
+        <w:rPr>
+          <w:lang w:eastAsia="en-US"/>
+        </w:rPr>
+        <w:t>Cálculo del Coeficiente K</w:t>
+      </w:r>
+    </w:p>
+    <w:p>
+      <w:pPr>
+        <w:rPr>
+          <w:lang w:eastAsia="en-US"/>
+        </w:rPr>
+      </w:pPr>
+      <w:r>
+        <w:rPr>
+          <w:rFonts w:eastAsia="Times New Roman"/>
+          <w:color w:val="auto"/>
+          <w:lang w:val="es-ES" w:eastAsia="en-US"/>
+        </w:rPr>
+        <w:t xml:space="preserve">Luego se le pasa a la función </w:t>
+      </w:r>
+      <w:proofErr w:type="spellStart"/>
+      <w:r>
+        <w:rPr>
+          <w:rFonts w:eastAsia="Times New Roman"/>
+          <w:i/>
+          <w:iCs/>
+          <w:color w:val="auto"/>
+          <w:lang w:val="es-ES" w:eastAsia="en-US"/>
+        </w:rPr>
+        <w:t>calcualtionK</w:t>
+      </w:r>
+      <w:proofErr w:type="spellEnd"/>
+      <w:r>
+        <w:rPr>
+          <w:rFonts w:eastAsia="Times New Roman"/>
+          <w:color w:val="auto"/>
+          <w:lang w:val="es-ES" w:eastAsia="en-US"/>
+        </w:rPr>
+        <w:t xml:space="preserve"> el valor de medición práctica(P) y el valor del volumen de transporte y se realiza la división de P entre Q y devuelve el valor ver Figura 3.10</w:t>
+      </w:r>
+    </w:p>
+    <w:p>
+      <w:pPr>
+        <w:rPr>
+          <w:lang w:eastAsia="en-US"/>
+        </w:rPr>
+      </w:pPr>
+      <w:r>
+        <w:rPr>
+          <w:noProof/>
+          <w:lang w:eastAsia="en-US"/>
+        </w:rPr>
+        <w:lastRenderedPageBreak/>
+        <w:drawing>
+          <wp:inline distT="0" distB="0" distL="0" distR="0" wp14:anchorId="1645FD6B" wp14:editId="0E055A4E">
+            <wp:extent cx="3569970" cy="1851660"/>
+            <wp:effectExtent l="95250" t="95250" r="87630" b="91440"/>
+            <wp:docPr id="1934747227" name="Imagen 31"/>
+            <wp:cNvGraphicFramePr>
+              <a:graphicFrameLocks xmlns:a="http://schemas.openxmlformats.org/drawingml/2006/main" noChangeAspect="1"/>
+            </wp:cNvGraphicFramePr>
+            <a:graphic xmlns:a="http://schemas.openxmlformats.org/drawingml/2006/main">
+              <a:graphicData uri="http://schemas.openxmlformats.org/drawingml/2006/picture">
+                <pic:pic xmlns:pic="http://schemas.openxmlformats.org/drawingml/2006/picture">
+                  <pic:nvPicPr>
+                    <pic:cNvPr id="0" name="Picture 2"/>
+                    <pic:cNvPicPr>
+                      <a:picLocks noChangeAspect="1" noChangeArrowheads="1"/>
+                    </pic:cNvPicPr>
+                  </pic:nvPicPr>
+                  <pic:blipFill>
+                    <a:blip r:embed="rId85">
+                      <a:extLst>
+                        <a:ext uri="{28A0092B-C50C-407E-A947-70E740481C1C}">
+                          <a14:useLocalDpi xmlns:a14="http://schemas.microsoft.com/office/drawing/2010/main" val="0"/>
+                        </a:ext>
+                      </a:extLst>
+                    </a:blip>
+                    <a:srcRect/>
+                    <a:stretch>
+                      <a:fillRect/>
+                    </a:stretch>
+                  </pic:blipFill>
+                  <pic:spPr bwMode="auto">
+                    <a:xfrm>
+                      <a:off x="0" y="0"/>
+                      <a:ext cx="3569970" cy="1851660"/>
+                    </a:xfrm>
+                    <a:prstGeom prst="rect">
+                      <a:avLst/>
+                    </a:prstGeom>
+                    <a:ln w="88900" cap="sq" cmpd="thickThin">
+                      <a:solidFill>
+                        <a:srgbClr val="000000"/>
+                      </a:solidFill>
+                      <a:prstDash val="solid"/>
+                      <a:miter lim="800000"/>
+                    </a:ln>
+                    <a:effectLst>
+                      <a:innerShdw blurRad="76200">
+                        <a:srgbClr val="000000"/>
+                      </a:innerShdw>
+                    </a:effectLst>
+                  </pic:spPr>
+                </pic:pic>
+              </a:graphicData>
+            </a:graphic>
+          </wp:inline>
+        </w:drawing>
+      </w:r>
+    </w:p>
+    <w:p>
+      <w:pPr>
+        <w:ind w:left="708" w:hanging="708"/>
+        <w:rPr>
+          <w:sz w:val="18"/>
+          <w:szCs w:val="18"/>
+          <w:lang w:eastAsia="en-US"/>
+        </w:rPr>
+      </w:pPr>
+      <w:r>
+        <w:rPr>
+          <w:b/>
+          <w:bCs/>
+          <w:sz w:val="18"/>
+          <w:szCs w:val="18"/>
+          <w:lang w:eastAsia="en-US"/>
+        </w:rPr>
+        <w:t>Figura 3.10</w:t>
+      </w:r>
+      <w:r>
+        <w:rPr>
+          <w:sz w:val="18"/>
+          <w:szCs w:val="18"/>
+          <w:lang w:eastAsia="en-US"/>
+        </w:rPr>
+        <w:t xml:space="preserve"> Función para calcular K</w:t>
+      </w:r>
+    </w:p>
+    <w:p>
+      <w:pPr>
+        <w:pStyle w:val="Ttulo3"/>
+        <w:rPr>
+          <w:lang w:eastAsia="en-US"/>
+        </w:rPr>
+      </w:pPr>
+      <w:r>
+        <w:rPr>
+          <w:lang w:eastAsia="en-US"/>
+        </w:rPr>
+        <w:t>Llamada de la Funciones en el servicio</w:t>
+      </w:r>
+    </w:p>
+    <w:p>
+      <w:pPr>
+        <w:rPr>
+          <w:lang w:eastAsia="en-US"/>
+        </w:rPr>
+      </w:pPr>
+      <w:r>
+        <w:rPr>
+          <w:lang w:eastAsia="en-US"/>
+        </w:rPr>
+        <w:t xml:space="preserve">Luego estas dos funciones son llamadas en el </w:t>
+      </w:r>
+      <w:proofErr w:type="spellStart"/>
+      <w:proofErr w:type="gramStart"/>
+      <w:r>
+        <w:rPr>
+          <w:lang w:eastAsia="en-US"/>
+        </w:rPr>
+        <w:t>calculo.service</w:t>
+      </w:r>
+      <w:proofErr w:type="gramEnd"/>
+      <w:r>
+        <w:rPr>
+          <w:lang w:eastAsia="en-US"/>
+        </w:rPr>
+        <w:t>.ts</w:t>
+      </w:r>
+      <w:proofErr w:type="spellEnd"/>
+      <w:r>
+        <w:rPr>
+          <w:lang w:eastAsia="en-US"/>
+        </w:rPr>
+        <w:t xml:space="preserve"> en el código de la figura 3.11 se define la función </w:t>
+      </w:r>
+      <w:proofErr w:type="spellStart"/>
+      <w:r>
+        <w:rPr>
+          <w:lang w:eastAsia="en-US"/>
+        </w:rPr>
+        <w:t>calcularQyK</w:t>
+      </w:r>
+      <w:proofErr w:type="spellEnd"/>
+      <w:r>
+        <w:rPr>
+          <w:lang w:eastAsia="en-US"/>
+        </w:rPr>
+        <w:t xml:space="preserve"> donde se le envían los parámetros, esta función será usada en las funciones de crear y actualizar los datos, donde va ser guardada luego los daros en la base de datos. </w:t>
+      </w:r>
+      <w:bookmarkStart w:id="132" w:name="_Toc193705063"/>
+    </w:p>
+    <w:p>
+      <w:pPr>
+        <w:rPr>
+          <w:lang w:eastAsia="en-US"/>
+        </w:rPr>
+      </w:pPr>
+      <w:r>
+        <w:rPr>
+          <w:noProof/>
+          <w:lang w:eastAsia="en-US"/>
+        </w:rPr>
+        <w:lastRenderedPageBreak/>
+        <w:drawing>
+          <wp:inline distT="0" distB="0" distL="0" distR="0" wp14:anchorId="41E5686F" wp14:editId="508B2F46">
+            <wp:extent cx="5545455" cy="4173855"/>
+            <wp:effectExtent l="95250" t="95250" r="93345" b="93345"/>
+            <wp:docPr id="951171354" name="Imagen 32"/>
+            <wp:cNvGraphicFramePr>
+              <a:graphicFrameLocks xmlns:a="http://schemas.openxmlformats.org/drawingml/2006/main" noChangeAspect="1"/>
+            </wp:cNvGraphicFramePr>
+            <a:graphic xmlns:a="http://schemas.openxmlformats.org/drawingml/2006/main">
+              <a:graphicData uri="http://schemas.openxmlformats.org/drawingml/2006/picture">
+                <pic:pic xmlns:pic="http://schemas.openxmlformats.org/drawingml/2006/picture">
+                  <pic:nvPicPr>
+                    <pic:cNvPr id="0" name="Picture 3"/>
+                    <pic:cNvPicPr>
+                      <a:picLocks noChangeAspect="1" noChangeArrowheads="1"/>
+                    </pic:cNvPicPr>
+                  </pic:nvPicPr>
+                  <pic:blipFill>
+                    <a:blip r:embed="rId86">
+                      <a:extLst>
+                        <a:ext uri="{28A0092B-C50C-407E-A947-70E740481C1C}">
+                          <a14:useLocalDpi xmlns:a14="http://schemas.microsoft.com/office/drawing/2010/main" val="0"/>
+                        </a:ext>
+                      </a:extLst>
+                    </a:blip>
+                    <a:srcRect/>
+                    <a:stretch>
+                      <a:fillRect/>
+                    </a:stretch>
+                  </pic:blipFill>
+                  <pic:spPr bwMode="auto">
+                    <a:xfrm>
+                      <a:off x="0" y="0"/>
+                      <a:ext cx="5545455" cy="4173855"/>
+                    </a:xfrm>
+                    <a:prstGeom prst="rect">
+                      <a:avLst/>
+                    </a:prstGeom>
+                    <a:ln w="88900" cap="sq" cmpd="thickThin">
+                      <a:solidFill>
+                        <a:srgbClr val="000000"/>
+                      </a:solidFill>
+                      <a:prstDash val="solid"/>
+                      <a:miter lim="800000"/>
+                    </a:ln>
+                    <a:effectLst>
+                      <a:innerShdw blurRad="76200">
+                        <a:srgbClr val="000000"/>
+                      </a:innerShdw>
+                    </a:effectLst>
+                  </pic:spPr>
+                </pic:pic>
+              </a:graphicData>
+            </a:graphic>
+          </wp:inline>
+        </w:drawing>
+      </w:r>
+    </w:p>
+    <w:p>
+      <w:pPr>
+        <w:rPr>
+          <w:sz w:val="18"/>
+          <w:szCs w:val="18"/>
+          <w:lang w:eastAsia="en-US"/>
+        </w:rPr>
+      </w:pPr>
+      <w:r>
+        <w:rPr>
+          <w:b/>
+          <w:bCs/>
+          <w:sz w:val="18"/>
+          <w:szCs w:val="18"/>
+          <w:lang w:eastAsia="en-US"/>
+        </w:rPr>
+        <w:t>Figura 3.11</w:t>
+      </w:r>
+      <w:r>
+        <w:rPr>
+          <w:sz w:val="18"/>
+          <w:szCs w:val="18"/>
+          <w:lang w:eastAsia="en-US"/>
+        </w:rPr>
+        <w:t xml:space="preserve"> Llamada de las Funciones en el servicio</w:t>
+      </w:r>
     </w:p>
     <w:p>
       <w:pPr>
         <w:pStyle w:val="Ttulo2"/>
       </w:pPr>
-      <w:bookmarkStart w:id="131" w:name="_Toc193705063"/>
       <w:r>
         <w:t>Análisis del Costo Económico</w:t>
       </w:r>
-      <w:bookmarkEnd w:id="131"/>
+      <w:bookmarkEnd w:id="132"/>
     </w:p>
     <w:p>
       <w:pPr>
@@ -23652,6 +24303,7 @@
         <w:rPr>
           <w:lang w:val="es-US"/>
         </w:rPr>
+        <w:lastRenderedPageBreak/>
         <w:t xml:space="preserve">Inicialmente, se calcularon los UUCP en función del peso relativo de los distintos actores del sistema. Luego, estos puntos se ajustaron mediante el TCF y el EF, lo que dio como resultado los puntos de casos de uso ajustados </w:t>
       </w:r>
       <w:r>
@@ -23771,10 +24423,10 @@
           <w:vanish/>
         </w:rPr>
       </w:pPr>
-      <w:bookmarkStart w:id="132" w:name="_Toc193699585"/>
-      <w:bookmarkStart w:id="133" w:name="_Toc193705064"/>
-      <w:bookmarkEnd w:id="132"/>
+      <w:bookmarkStart w:id="133" w:name="_Toc193699585"/>
+      <w:bookmarkStart w:id="134" w:name="_Toc193705064"/>
       <w:bookmarkEnd w:id="133"/>
+      <w:bookmarkEnd w:id="134"/>
     </w:p>
     <w:p>
       <w:pPr>
@@ -23794,10 +24446,10 @@
           <w:vanish/>
         </w:rPr>
       </w:pPr>
-      <w:bookmarkStart w:id="134" w:name="_Toc193699586"/>
-      <w:bookmarkStart w:id="135" w:name="_Toc193705065"/>
-      <w:bookmarkEnd w:id="134"/>
+      <w:bookmarkStart w:id="135" w:name="_Toc193699586"/>
+      <w:bookmarkStart w:id="136" w:name="_Toc193705065"/>
       <w:bookmarkEnd w:id="135"/>
+      <w:bookmarkEnd w:id="136"/>
     </w:p>
     <w:p>
       <w:pPr>
@@ -23817,10 +24469,10 @@
           <w:vanish/>
         </w:rPr>
       </w:pPr>
-      <w:bookmarkStart w:id="136" w:name="_Toc193699587"/>
-      <w:bookmarkStart w:id="137" w:name="_Toc193705066"/>
-      <w:bookmarkEnd w:id="136"/>
+      <w:bookmarkStart w:id="137" w:name="_Toc193699587"/>
+      <w:bookmarkStart w:id="138" w:name="_Toc193705066"/>
       <w:bookmarkEnd w:id="137"/>
+      <w:bookmarkEnd w:id="138"/>
     </w:p>
     <w:p>
       <w:pPr>
@@ -23983,7 +24635,6 @@
           <w:color w:val="auto"/>
           <w:lang w:val="es-ES" w:eastAsia="en-US"/>
         </w:rPr>
-        <w:lastRenderedPageBreak/>
         <w:t xml:space="preserve">La configuración inicial del proyecto se realizó mediante el comando </w:t>
       </w:r>
       <w:proofErr w:type="spellStart"/>
@@ -24147,61 +24798,98 @@
           <w:color w:val="auto"/>
           <w:lang w:val="es-ES" w:eastAsia="en-US"/>
         </w:rPr>
-        <w:t xml:space="preserve">, mediante los decoradores @Get() y @Post() proporcionados por </w:t>
-      </w:r>
-      <w:proofErr w:type="spellStart"/>
+        <w:t>, mediante los decoradores @</w:t>
+      </w:r>
+      <w:proofErr w:type="gramStart"/>
       <w:r>
         <w:rPr>
           <w:rFonts w:eastAsia="Times New Roman"/>
           <w:color w:val="auto"/>
           <w:lang w:val="es-ES" w:eastAsia="en-US"/>
         </w:rPr>
-        <w:t>NestJS</w:t>
-      </w:r>
-      <w:proofErr w:type="spellEnd"/>
+        <w:t>Get(</w:t>
+      </w:r>
+      <w:proofErr w:type="gramEnd"/>
       <w:r>
         <w:rPr>
           <w:rFonts w:eastAsia="Times New Roman"/>
           <w:color w:val="auto"/>
           <w:lang w:val="es-ES" w:eastAsia="en-US"/>
         </w:rPr>
-        <w:t>, para gestionar las solicitudes entrantes desde el cliente (</w:t>
-      </w:r>
-      <w:proofErr w:type="spellStart"/>
+        <w:t>) y @</w:t>
+      </w:r>
+      <w:proofErr w:type="gramStart"/>
       <w:r>
         <w:rPr>
           <w:rFonts w:eastAsia="Times New Roman"/>
           <w:color w:val="auto"/>
           <w:lang w:val="es-ES" w:eastAsia="en-US"/>
         </w:rPr>
-        <w:t>React</w:t>
-      </w:r>
-      <w:proofErr w:type="spellEnd"/>
+        <w:t>Post(</w:t>
+      </w:r>
+      <w:proofErr w:type="gramEnd"/>
       <w:r>
         <w:rPr>
           <w:rFonts w:eastAsia="Times New Roman"/>
           <w:color w:val="auto"/>
           <w:lang w:val="es-ES" w:eastAsia="en-US"/>
         </w:rPr>
-        <w:t>).</w:t>
-      </w:r>
-    </w:p>
-    <w:p>
-      <w:pPr>
-        <w:spacing w:before="100" w:beforeAutospacing="1" w:after="100" w:afterAutospacing="1" w:line="360" w:lineRule="auto"/>
-        <w:ind w:left="0" w:firstLine="0"/>
+        <w:t xml:space="preserve">) proporcionados por </w:t>
+      </w:r>
+      <w:proofErr w:type="spellStart"/>
+      <w:r>
         <w:rPr>
           <w:rFonts w:eastAsia="Times New Roman"/>
           <w:color w:val="auto"/>
           <w:lang w:val="es-ES" w:eastAsia="en-US"/>
         </w:rPr>
-      </w:pPr>
+        <w:t>NestJS</w:t>
+      </w:r>
+      <w:proofErr w:type="spellEnd"/>
       <w:r>
         <w:rPr>
           <w:rFonts w:eastAsia="Times New Roman"/>
           <w:color w:val="auto"/>
           <w:lang w:val="es-ES" w:eastAsia="en-US"/>
         </w:rPr>
+        <w:t>, para gestionar las solicitudes entrantes desde el cliente (</w:t>
+      </w:r>
+      <w:proofErr w:type="spellStart"/>
+      <w:r>
+        <w:rPr>
+          <w:rFonts w:eastAsia="Times New Roman"/>
+          <w:color w:val="auto"/>
+          <w:lang w:val="es-ES" w:eastAsia="en-US"/>
+        </w:rPr>
+        <w:t>React</w:t>
+      </w:r>
+      <w:proofErr w:type="spellEnd"/>
+      <w:r>
+        <w:rPr>
+          <w:rFonts w:eastAsia="Times New Roman"/>
+          <w:color w:val="auto"/>
+          <w:lang w:val="es-ES" w:eastAsia="en-US"/>
+        </w:rPr>
+        <w:t>).</w:t>
+      </w:r>
+    </w:p>
+    <w:p>
+      <w:pPr>
+        <w:spacing w:before="100" w:beforeAutospacing="1" w:after="100" w:afterAutospacing="1" w:line="360" w:lineRule="auto"/>
+        <w:ind w:left="0" w:firstLine="0"/>
+        <w:rPr>
+          <w:rFonts w:eastAsia="Times New Roman"/>
+          <w:color w:val="auto"/>
+          <w:lang w:val="es-ES" w:eastAsia="en-US"/>
+        </w:rPr>
+      </w:pPr>
+      <w:r>
+        <w:rPr>
+          <w:rFonts w:eastAsia="Times New Roman"/>
+          <w:color w:val="auto"/>
+          <w:lang w:val="es-ES" w:eastAsia="en-US"/>
+        </w:rPr>
+        <w:lastRenderedPageBreak/>
         <w:t xml:space="preserve">Un ejemplo particular de servicio web implementado es el que permite </w:t>
       </w:r>
       <w:r>
@@ -24223,6 +24911,7 @@
         <w:t xml:space="preserve">. Este servicio está representado por el método </w:t>
       </w:r>
       <w:proofErr w:type="spellStart"/>
+      <w:proofErr w:type="gramStart"/>
       <w:r>
         <w:rPr>
           <w:rFonts w:eastAsia="Times New Roman"/>
@@ -24238,66 +24927,68 @@
           <w:color w:val="auto"/>
           <w:lang w:val="es-ES" w:eastAsia="en-US"/>
         </w:rPr>
-        <w:t>() en la clase se</w:t>
-      </w:r>
+        <w:t>(</w:t>
+      </w:r>
+      <w:proofErr w:type="gramEnd"/>
       <w:r>
         <w:rPr>
           <w:rFonts w:eastAsia="Times New Roman"/>
           <w:color w:val="auto"/>
           <w:lang w:val="es-ES" w:eastAsia="en-US"/>
         </w:rPr>
-        <w:t xml:space="preserve"> </w:t>
-      </w:r>
-      <w:proofErr w:type="spellStart"/>
+        <w:t>) en la clase se</w:t>
+      </w:r>
       <w:r>
         <w:rPr>
           <w:rFonts w:eastAsia="Times New Roman"/>
           <w:color w:val="auto"/>
           <w:lang w:val="es-ES" w:eastAsia="en-US"/>
         </w:rPr>
-        <w:t>calculos</w:t>
-      </w:r>
+        <w:t xml:space="preserve"> </w:t>
+      </w:r>
+      <w:proofErr w:type="spellStart"/>
+      <w:proofErr w:type="gramStart"/>
       <w:r>
         <w:rPr>
           <w:rFonts w:eastAsia="Times New Roman"/>
           <w:color w:val="auto"/>
           <w:lang w:val="es-ES" w:eastAsia="en-US"/>
         </w:rPr>
-        <w:t>.controller.ts</w:t>
-      </w:r>
-      <w:proofErr w:type="spellEnd"/>
+        <w:t>calculos</w:t>
+      </w:r>
       <w:r>
         <w:rPr>
           <w:rFonts w:eastAsia="Times New Roman"/>
           <w:color w:val="auto"/>
           <w:lang w:val="es-ES" w:eastAsia="en-US"/>
         </w:rPr>
-        <w:t>, el cual recibe los parámetros necesarios (</w:t>
-      </w:r>
+        <w:t>.controller</w:t>
+      </w:r>
+      <w:proofErr w:type="gramEnd"/>
       <w:r>
         <w:rPr>
           <w:rFonts w:eastAsia="Times New Roman"/>
           <w:color w:val="auto"/>
           <w:lang w:val="es-ES" w:eastAsia="en-US"/>
         </w:rPr>
-        <w:t>densidad del sedimento, densidad del mar, coeficiente etc.</w:t>
-      </w:r>
+        <w:t>.ts</w:t>
+      </w:r>
+      <w:proofErr w:type="spellEnd"/>
       <w:r>
         <w:rPr>
           <w:rFonts w:eastAsia="Times New Roman"/>
           <w:color w:val="auto"/>
           <w:lang w:val="es-ES" w:eastAsia="en-US"/>
         </w:rPr>
-        <w:t>) y llama a un servicio (</w:t>
-      </w:r>
-      <w:proofErr w:type="spellStart"/>
+        <w:t>, el cual recibe los parámetros necesarios (</w:t>
+      </w:r>
       <w:r>
         <w:rPr>
           <w:rFonts w:eastAsia="Times New Roman"/>
           <w:color w:val="auto"/>
           <w:lang w:val="es-ES" w:eastAsia="en-US"/>
         </w:rPr>
-        <w:t>calculos</w:t>
+        <w:t>densidad del sedimento, densidad del mar, coeficiente etc.</w:t>
       </w:r>
       <w:r>
         <w:rPr>
@@ -24305,7 +24996,34 @@
           <w:color w:val="auto"/>
           <w:lang w:val="es-ES" w:eastAsia="en-US"/>
         </w:rPr>
-        <w:t>.service.ts</w:t>
+        <w:t>) y llama a un servicio (</w:t>
+      </w:r>
+      <w:proofErr w:type="spellStart"/>
+      <w:proofErr w:type="gramStart"/>
+      <w:r>
+        <w:rPr>
+          <w:rFonts w:eastAsia="Times New Roman"/>
+          <w:color w:val="auto"/>
+          <w:lang w:val="es-ES" w:eastAsia="en-US"/>
+        </w:rPr>
+        <w:t>calculos</w:t>
+      </w:r>
+      <w:r>
+        <w:rPr>
+          <w:rFonts w:eastAsia="Times New Roman"/>
+          <w:color w:val="auto"/>
+          <w:lang w:val="es-ES" w:eastAsia="en-US"/>
+        </w:rPr>
+        <w:t>.service</w:t>
+      </w:r>
+      <w:proofErr w:type="gramEnd"/>
+      <w:r>
+        <w:rPr>
+          <w:rFonts w:eastAsia="Times New Roman"/>
+          <w:color w:val="auto"/>
+          <w:lang w:val="es-ES" w:eastAsia="en-US"/>
+        </w:rPr>
+        <w:t>.ts</w:t>
       </w:r>
       <w:proofErr w:type="spellEnd"/>
       <w:r>
@@ -24639,6 +25357,7 @@
         <w:t xml:space="preserve">. En caso de ser válidas, se genera un token JWT mediante el método </w:t>
       </w:r>
       <w:proofErr w:type="spellStart"/>
+      <w:proofErr w:type="gramStart"/>
       <w:r>
         <w:rPr>
           <w:rFonts w:eastAsia="Times New Roman"/>
@@ -24654,34 +25373,34 @@
           <w:color w:val="auto"/>
           <w:lang w:val="es-ES" w:eastAsia="en-US"/>
         </w:rPr>
-        <w:t xml:space="preserve">() del servicio </w:t>
-      </w:r>
-      <w:proofErr w:type="spellStart"/>
+        <w:t>(</w:t>
+      </w:r>
+      <w:proofErr w:type="gramEnd"/>
       <w:r>
         <w:rPr>
           <w:rFonts w:eastAsia="Times New Roman"/>
           <w:color w:val="auto"/>
           <w:lang w:val="es-ES" w:eastAsia="en-US"/>
         </w:rPr>
-        <w:t>JwtService</w:t>
-      </w:r>
-      <w:proofErr w:type="spellEnd"/>
+        <w:t xml:space="preserve">) del servicio </w:t>
+      </w:r>
+      <w:proofErr w:type="spellStart"/>
       <w:r>
         <w:rPr>
           <w:rFonts w:eastAsia="Times New Roman"/>
           <w:color w:val="auto"/>
           <w:lang w:val="es-ES" w:eastAsia="en-US"/>
         </w:rPr>
-        <w:t xml:space="preserve">, </w:t>
-      </w:r>
+        <w:t>JwtService</w:t>
+      </w:r>
+      <w:proofErr w:type="spellEnd"/>
       <w:r>
         <w:rPr>
           <w:rFonts w:eastAsia="Times New Roman"/>
           <w:color w:val="auto"/>
           <w:lang w:val="es-ES" w:eastAsia="en-US"/>
         </w:rPr>
-        <w:lastRenderedPageBreak/>
-        <w:t xml:space="preserve">que incluye como </w:t>
+        <w:t xml:space="preserve">, que incluye como </w:t>
       </w:r>
       <w:proofErr w:type="spellStart"/>
       <w:r>
@@ -24769,11 +25488,11 @@
       <w:pPr>
         <w:pStyle w:val="Ttulo2"/>
       </w:pPr>
-      <w:commentRangeStart w:id="138"/>
+      <w:commentRangeStart w:id="139"/>
       <w:r>
         <w:t>Conclusiones del Capítulo</w:t>
       </w:r>
-      <w:commentRangeEnd w:id="138"/>
+      <w:commentRangeEnd w:id="139"/>
       <w:r>
         <w:rPr>
           <w:rStyle w:val="Refdecomentario"/>
@@ -24783,15 +25502,15 @@
           <w:shd w:val="clear" w:color="auto" w:fill="FFFFFF"/>
           <w:lang w:val="es-ES" w:eastAsia="en-US"/>
         </w:rPr>
-        <w:commentReference w:id="138"/>
+        <w:commentReference w:id="139"/>
       </w:r>
     </w:p>
     <w:p>
       <w:pPr>
         <w:ind w:left="0" w:firstLine="0"/>
         <w:sectPr>
-          <w:headerReference w:type="default" r:id="rId84"/>
-          <w:headerReference w:type="first" r:id="rId85"/>
+          <w:headerReference w:type="default" r:id="rId87"/>
+          <w:headerReference w:type="first" r:id="rId88"/>
           <w:pgSz w:w="12240" w:h="15840"/>
           <w:pgMar w:top="725" w:right="1126" w:bottom="2517" w:left="1702" w:header="725" w:footer="981" w:gutter="0"/>
           <w:cols w:space="720"/>
@@ -24840,7 +25559,7 @@
           <w:sz w:val="28"/>
         </w:rPr>
         <w:sectPr>
-          <w:headerReference w:type="first" r:id="rId86"/>
+          <w:headerReference w:type="first" r:id="rId89"/>
           <w:pgSz w:w="12240" w:h="15840"/>
           <w:pgMar w:top="725" w:right="1126" w:bottom="2517" w:left="1702" w:header="725" w:footer="981" w:gutter="0"/>
           <w:cols w:space="720"/>
@@ -24901,12 +25620,12 @@
         <w:pStyle w:val="Ttulo1"/>
         <w:ind w:left="0"/>
       </w:pPr>
-      <w:bookmarkStart w:id="139" w:name="_Toc196374753"/>
+      <w:bookmarkStart w:id="140" w:name="_Toc196374753"/>
       <w:r>
         <w:lastRenderedPageBreak/>
         <w:t>REFERENCIAS BIBLIOGRÁFICAS</w:t>
       </w:r>
-      <w:bookmarkEnd w:id="139"/>
+      <w:bookmarkEnd w:id="140"/>
       <w:r>
         <w:t xml:space="preserve"> </w:t>
       </w:r>
@@ -25593,9 +26312,9 @@
     <w:p>
       <w:pPr>
         <w:sectPr>
-          <w:headerReference w:type="even" r:id="rId87"/>
-          <w:headerReference w:type="default" r:id="rId88"/>
-          <w:headerReference w:type="first" r:id="rId89"/>
+          <w:headerReference w:type="even" r:id="rId90"/>
+          <w:headerReference w:type="default" r:id="rId91"/>
+          <w:headerReference w:type="first" r:id="rId92"/>
           <w:pgSz w:w="12240" w:h="15840"/>
           <w:pgMar w:top="725" w:right="1126" w:bottom="2517" w:left="1702" w:header="725" w:footer="981" w:gutter="0"/>
           <w:cols w:space="720"/>
@@ -25650,8 +26369,8 @@
           <w:bCs/>
         </w:rPr>
       </w:pPr>
-      <w:bookmarkStart w:id="140" w:name="_Toc193705067"/>
-      <w:commentRangeStart w:id="141"/>
+      <w:bookmarkStart w:id="141" w:name="_Toc193705067"/>
+      <w:commentRangeStart w:id="142"/>
       <w:r>
         <w:rPr>
           <w:b/>
@@ -25659,13 +26378,13 @@
         </w:rPr>
         <w:t>Cálculo de Puntos de Historias de Usuario sin ajustar</w:t>
       </w:r>
-      <w:bookmarkEnd w:id="140"/>
+      <w:bookmarkEnd w:id="141"/>
     </w:p>
     <w:p>
       <w:r>
         <w:t>El primer paso para realizar una estimación implica determinar los Puntos de Historia de Usuario sin ajustar. Este valor se obtiene utilizando la siguiente fórmula:</w:t>
       </w:r>
-      <w:commentRangeEnd w:id="141"/>
+      <w:commentRangeEnd w:id="142"/>
       <w:r>
         <w:rPr>
           <w:rStyle w:val="Refdecomentario"/>
@@ -25674,7 +26393,7 @@
           <w:shd w:val="clear" w:color="auto" w:fill="FFFFFF"/>
           <w:lang w:val="es-ES" w:eastAsia="en-US"/>
         </w:rPr>
-        <w:commentReference w:id="141"/>
+        <w:commentReference w:id="142"/>
       </w:r>
     </w:p>
     <w:p>
@@ -25840,11 +26559,11 @@
           <w:numId w:val="0"/>
         </w:numPr>
       </w:pPr>
-      <w:bookmarkStart w:id="142" w:name="_Toc193705068"/>
+      <w:bookmarkStart w:id="143" w:name="_Toc193705068"/>
       <w:r>
         <w:t>Factor de Peso de los Actores sin ajustar (UAW)</w:t>
       </w:r>
-      <w:bookmarkEnd w:id="142"/>
+      <w:bookmarkEnd w:id="143"/>
     </w:p>
     <w:p>
       <w:pPr>
@@ -25880,7 +26599,7 @@
       <w:r>
         <w:br w:type="page"/>
       </w:r>
-      <w:bookmarkStart w:id="143" w:name="_Toc193705069"/>
+      <w:bookmarkStart w:id="144" w:name="_Toc193705069"/>
       <w:r>
         <w:rPr>
           <w:rStyle w:val="Ttulo2Car"/>
@@ -25888,7 +26607,7 @@
         <w:lastRenderedPageBreak/>
         <w:t>Tabla 3.3</w:t>
       </w:r>
-      <w:bookmarkEnd w:id="143"/>
+      <w:bookmarkEnd w:id="144"/>
       <w:r>
         <w:rPr>
           <w:b/>
@@ -26701,11 +27420,11 @@
           <w:lang w:val="es-ES"/>
         </w:rPr>
       </w:pPr>
-      <w:bookmarkStart w:id="144" w:name="_Toc193705070"/>
+      <w:bookmarkStart w:id="145" w:name="_Toc193705070"/>
       <w:r>
         <w:t>Factor de Peso de las Historias de Usuario sin ajustar (UUCW)</w:t>
       </w:r>
-      <w:bookmarkEnd w:id="144"/>
+      <w:bookmarkEnd w:id="145"/>
     </w:p>
     <w:p>
       <w:pPr>
@@ -27584,11 +28303,11 @@
         </w:numPr>
         <w:ind w:left="504"/>
       </w:pPr>
-      <w:bookmarkStart w:id="145" w:name="_Toc193705071"/>
+      <w:bookmarkStart w:id="146" w:name="_Toc193705071"/>
       <w:r>
         <w:t>Cálculo de los Puntos de Historias de Usuario ajustados</w:t>
       </w:r>
-      <w:bookmarkEnd w:id="145"/>
+      <w:bookmarkEnd w:id="146"/>
     </w:p>
     <w:p>
       <w:pPr>
@@ -27790,11 +28509,11 @@
         </w:numPr>
         <w:ind w:left="504"/>
       </w:pPr>
-      <w:bookmarkStart w:id="146" w:name="_Toc193705072"/>
+      <w:bookmarkStart w:id="147" w:name="_Toc193705072"/>
       <w:r>
         <w:t>Factor de Complejidad Técnica (TCF)</w:t>
       </w:r>
-      <w:bookmarkEnd w:id="146"/>
+      <w:bookmarkEnd w:id="147"/>
     </w:p>
     <w:p>
       <w:pPr>
@@ -30088,11 +30807,11 @@
           <w:lang w:val="es-ES"/>
         </w:rPr>
       </w:pPr>
-      <w:bookmarkStart w:id="147" w:name="_Toc193705073"/>
+      <w:bookmarkStart w:id="148" w:name="_Toc193705073"/>
       <w:r>
         <w:t>Factor Ambiente (EF)</w:t>
       </w:r>
-      <w:bookmarkEnd w:id="147"/>
+      <w:bookmarkEnd w:id="148"/>
     </w:p>
     <w:p>
       <w:pPr>
@@ -32779,8 +33498,8 @@
           <w:lang w:val="es-ES"/>
         </w:rPr>
         <w:sectPr>
-          <w:headerReference w:type="default" r:id="rId90"/>
-          <w:headerReference w:type="first" r:id="rId91"/>
+          <w:headerReference w:type="default" r:id="rId93"/>
+          <w:headerReference w:type="first" r:id="rId94"/>
           <w:pgSz w:w="12240" w:h="15840"/>
           <w:pgMar w:top="725" w:right="1126" w:bottom="2517" w:left="1702" w:header="725" w:footer="981" w:gutter="0"/>
           <w:cols w:space="720"/>
@@ -32826,8 +33545,8 @@
       <w:r>
         <w:fldChar w:fldCharType="end"/>
       </w:r>
-      <w:bookmarkStart w:id="148" w:name="_ANEXOS"/>
-      <w:bookmarkEnd w:id="148"/>
+      <w:bookmarkStart w:id="149" w:name="_ANEXOS"/>
+      <w:bookmarkEnd w:id="149"/>
       <w:r>
         <w:rPr>
           <w:b/>
@@ -32898,8 +33617,8 @@
         </w:tabs>
         <w:ind w:left="0" w:firstLine="0"/>
         <w:sectPr>
-          <w:headerReference w:type="default" r:id="rId92"/>
-          <w:headerReference w:type="first" r:id="rId93"/>
+          <w:headerReference w:type="default" r:id="rId95"/>
+          <w:headerReference w:type="first" r:id="rId96"/>
           <w:pgSz w:w="12240" w:h="15840"/>
           <w:pgMar w:top="725" w:right="1126" w:bottom="2517" w:left="1702" w:header="725" w:footer="981" w:gutter="0"/>
           <w:cols w:space="720"/>
@@ -32915,12 +33634,12 @@
       </w:pPr>
     </w:p>
     <w:sectPr>
-      <w:headerReference w:type="even" r:id="rId94"/>
-      <w:headerReference w:type="default" r:id="rId95"/>
-      <w:footerReference w:type="even" r:id="rId96"/>
-      <w:footerReference w:type="default" r:id="rId97"/>
-      <w:headerReference w:type="first" r:id="rId98"/>
-      <w:footerReference w:type="first" r:id="rId99"/>
+      <w:headerReference w:type="even" r:id="rId97"/>
+      <w:headerReference w:type="default" r:id="rId98"/>
+      <w:footerReference w:type="even" r:id="rId99"/>
+      <w:footerReference w:type="default" r:id="rId100"/>
+      <w:headerReference w:type="first" r:id="rId101"/>
+      <w:footerReference w:type="first" r:id="rId102"/>
       <w:pgSz w:w="12240" w:h="15840"/>
       <w:pgMar w:top="1440" w:right="1129" w:bottom="1440" w:left="1702" w:header="970" w:footer="720" w:gutter="0"/>
       <w:cols w:space="720"/>
@@ -33240,7 +33959,15 @@
         <w:pStyle w:val="Textocomentario"/>
       </w:pPr>
       <w:r>
-        <w:t>En resumen debe tener claro el lector que es lo que se va a diseñar y porque de conjunto con los criterios de esa selección.</w:t>
+        <w:t xml:space="preserve">En </w:t>
+      </w:r>
+      <w:proofErr w:type="gramStart"/>
+      <w:r>
+        <w:t>resumen</w:t>
+      </w:r>
+      <w:proofErr w:type="gramEnd"/>
+      <w:r>
+        <w:t xml:space="preserve"> debe tener claro el lector que es lo que se va a diseñar y porque de conjunto con los criterios de esa selección.</w:t>
       </w:r>
     </w:p>
   </w:comment>
@@ -33256,7 +33983,15 @@
         <w:annotationRef/>
       </w:r>
       <w:r>
-        <w:t xml:space="preserve">Se cambio Usuario por Trabajador.. Usuarios son todos </w:t>
+        <w:t xml:space="preserve">Se cambio Usuario por </w:t>
+      </w:r>
+      <w:proofErr w:type="gramStart"/>
+      <w:r>
+        <w:t>Trabajador..</w:t>
+      </w:r>
+      <w:proofErr w:type="gramEnd"/>
+      <w:r>
+        <w:t xml:space="preserve"> Usuarios son todos </w:t>
       </w:r>
     </w:p>
   </w:comment>
@@ -33275,12 +34010,22 @@
         <w:t xml:space="preserve">Revisar las Historias de Usuario de Gestionar </w:t>
       </w:r>
       <w:proofErr w:type="spellStart"/>
+      <w:proofErr w:type="gramStart"/>
       <w:r>
         <w:t>Trazas,Busqueda</w:t>
       </w:r>
       <w:proofErr w:type="spellEnd"/>
-      <w:r>
-        <w:t xml:space="preserve"> Avanzada y reportes. La duda es que si la búsqueda avanzada  y reportes eran la misma funcionalidad. </w:t>
+      <w:proofErr w:type="gramEnd"/>
+      <w:r>
+        <w:t xml:space="preserve"> Avanzada y reportes. La duda es que si la búsqueda </w:t>
+      </w:r>
+      <w:proofErr w:type="gramStart"/>
+      <w:r>
+        <w:t>avanzada  y</w:t>
+      </w:r>
+      <w:proofErr w:type="gramEnd"/>
+      <w:r>
+        <w:t xml:space="preserve"> reportes eran la misma funcionalidad. </w:t>
       </w:r>
     </w:p>
   </w:comment>
@@ -33458,7 +34203,15 @@
         <w:annotationRef/>
       </w:r>
       <w:r>
-        <w:t xml:space="preserve">Debes comentar como se garantiza la normalización de tu diagrama y porque la sencillez, en resumen un texto mayor en el resto del documento. Teniendo en cuenta que usas MongoDB puedes explicar </w:t>
+        <w:t xml:space="preserve">Debes comentar como se garantiza la normalización de tu diagrama y porque la sencillez, en </w:t>
+      </w:r>
+      <w:proofErr w:type="gramStart"/>
+      <w:r>
+        <w:t>resumen</w:t>
+      </w:r>
+      <w:proofErr w:type="gramEnd"/>
+      <w:r>
+        <w:t xml:space="preserve"> un texto mayor en el resto del documento. Teniendo en cuenta que usas MongoDB puedes explicar </w:t>
       </w:r>
       <w:proofErr w:type="spellStart"/>
       <w:r>
@@ -33550,7 +34303,7 @@
       </w:r>
     </w:p>
   </w:comment>
-  <w:comment w:id="138" w:author="Dionis Lopez" w:date="2025-06-02T12:46:00Z" w:initials="DL">
+  <w:comment w:id="139" w:author="Dionis Lopez" w:date="2025-06-02T12:46:00Z" w:initials="DL">
     <w:p>
       <w:pPr>
         <w:pStyle w:val="Textocomentario"/>
@@ -33571,7 +34324,7 @@
       <w:proofErr w:type="spellEnd"/>
     </w:p>
   </w:comment>
-  <w:comment w:id="141" w:author="Dionis Lopez" w:date="2025-06-02T12:44:00Z" w:initials="DL">
+  <w:comment w:id="142" w:author="Dionis Lopez" w:date="2025-06-02T12:44:00Z" w:initials="DL">
     <w:p>
       <w:pPr>
         <w:pStyle w:val="Textocomentario"/>

</xml_diff>